<commit_message>
- SPI related errors resolved. - SPI test done and transmission working successfully.
</commit_message>
<xml_diff>
--- a/Ethernet_Port/Plan.docx
+++ b/Ethernet_Port/Plan.docx
@@ -17,6 +17,24 @@
       <w:r>
         <w:t>Project creation.</w:t>
       </w:r>
+      <w:sdt>
+        <w:sdtPr>
+          <w:id w:val="1122343603"/>
+          <w14:checkbox>
+            <w14:checked w14:val="1"/>
+            <w14:checkedState w14:val="2612" w14:font="MS Gothic"/>
+            <w14:uncheckedState w14:val="2610" w14:font="MS Gothic"/>
+          </w14:checkbox>
+        </w:sdtPr>
+        <w:sdtContent>
+          <w:r>
+            <w:rPr>
+              <w:rFonts w:ascii="MS Gothic" w:eastAsia="MS Gothic" w:hAnsi="MS Gothic" w:hint="eastAsia"/>
+            </w:rPr>
+            <w:t>☒</w:t>
+          </w:r>
+        </w:sdtContent>
+      </w:sdt>
     </w:p>
     <w:p>
       <w:pPr>
@@ -28,14 +46,182 @@
       <w:r>
         <w:t>.</w:t>
       </w:r>
+      <w:sdt>
+        <w:sdtPr>
+          <w:id w:val="945737021"/>
+          <w14:checkbox>
+            <w14:checked w14:val="1"/>
+            <w14:checkedState w14:val="2612" w14:font="MS Gothic"/>
+            <w14:uncheckedState w14:val="2610" w14:font="MS Gothic"/>
+          </w14:checkbox>
+        </w:sdtPr>
+        <w:sdtContent>
+          <w:r>
+            <w:rPr>
+              <w:rFonts w:ascii="MS Gothic" w:eastAsia="MS Gothic" w:hAnsi="MS Gothic" w:hint="eastAsia"/>
+            </w:rPr>
+            <w:t>☒</w:t>
+          </w:r>
+        </w:sdtContent>
+      </w:sdt>
     </w:p>
     <w:p>
       <w:pPr>
         <w:pStyle w:val="NoSpacing"/>
+        <w:numPr>
+          <w:ilvl w:val="2"/>
+          <w:numId w:val="3"/>
+        </w:numPr>
+      </w:pPr>
+      <w:r>
+        <w:t>SPI2 selected as device.</w:t>
+      </w:r>
+    </w:p>
+    <w:p>
+      <w:pPr>
+        <w:pStyle w:val="NoSpacing"/>
+        <w:numPr>
+          <w:ilvl w:val="2"/>
+          <w:numId w:val="3"/>
+        </w:numPr>
+      </w:pPr>
+      <w:r>
+        <w:rPr>
+          <w:b/>
+          <w:bCs/>
+        </w:rPr>
+        <w:t>PB12</w:t>
+      </w:r>
+      <w:r>
+        <w:rPr>
+          <w:b/>
+          <w:bCs/>
+        </w:rPr>
+        <w:t>-&gt;</w:t>
+      </w:r>
+      <w:r>
+        <w:rPr>
+          <w:b/>
+          <w:bCs/>
+        </w:rPr>
+        <w:t>SPI2_NSS</w:t>
+      </w:r>
+    </w:p>
+    <w:p>
+      <w:pPr>
+        <w:pStyle w:val="NoSpacing"/>
+        <w:numPr>
+          <w:ilvl w:val="2"/>
+          <w:numId w:val="3"/>
+        </w:numPr>
+      </w:pPr>
+      <w:r>
+        <w:rPr>
+          <w:b/>
+          <w:bCs/>
+        </w:rPr>
+        <w:t>PB13</w:t>
+      </w:r>
+      <w:r>
+        <w:rPr>
+          <w:b/>
+          <w:bCs/>
+        </w:rPr>
+        <w:t>-&gt;</w:t>
+      </w:r>
+      <w:r>
+        <w:rPr>
+          <w:b/>
+          <w:bCs/>
+        </w:rPr>
+        <w:t>SPI2_SCK</w:t>
+      </w:r>
+    </w:p>
+    <w:p>
+      <w:pPr>
+        <w:pStyle w:val="NoSpacing"/>
+        <w:numPr>
+          <w:ilvl w:val="2"/>
+          <w:numId w:val="3"/>
+        </w:numPr>
+      </w:pPr>
+      <w:r>
+        <w:rPr>
+          <w:b/>
+          <w:bCs/>
+        </w:rPr>
+        <w:t>PB14</w:t>
+      </w:r>
+      <w:r>
+        <w:rPr>
+          <w:b/>
+          <w:bCs/>
+        </w:rPr>
+        <w:t>-&gt;</w:t>
+      </w:r>
+      <w:r>
+        <w:rPr>
+          <w:b/>
+          <w:bCs/>
+        </w:rPr>
+        <w:t>SPI2_MISO,</w:t>
+      </w:r>
+    </w:p>
+    <w:p>
+      <w:pPr>
+        <w:pStyle w:val="NoSpacing"/>
+        <w:numPr>
+          <w:ilvl w:val="2"/>
+          <w:numId w:val="3"/>
+        </w:numPr>
+      </w:pPr>
+      <w:r>
+        <w:rPr>
+          <w:b/>
+          <w:bCs/>
+        </w:rPr>
+        <w:t>PB15</w:t>
+      </w:r>
+      <w:r>
+        <w:rPr>
+          <w:b/>
+          <w:bCs/>
+        </w:rPr>
+        <w:t>-&gt;</w:t>
+      </w:r>
+      <w:r>
+        <w:rPr>
+          <w:b/>
+          <w:bCs/>
+        </w:rPr>
+        <w:t>SPI2_MOSI</w:t>
+      </w:r>
+    </w:p>
+    <w:p>
+      <w:pPr>
+        <w:pStyle w:val="NoSpacing"/>
       </w:pPr>
       <w:r>
         <w:t>Implement SPI Write/Read APIs.</w:t>
       </w:r>
+      <w:sdt>
+        <w:sdtPr>
+          <w:id w:val="2073235577"/>
+          <w14:checkbox>
+            <w14:checked w14:val="0"/>
+            <w14:checkedState w14:val="2612" w14:font="MS Gothic"/>
+            <w14:uncheckedState w14:val="2610" w14:font="MS Gothic"/>
+          </w14:checkbox>
+        </w:sdtPr>
+        <w:sdtContent>
+          <w:r>
+            <w:rPr>
+              <w:rFonts w:ascii="MS Gothic" w:eastAsia="MS Gothic" w:hAnsi="MS Gothic" w:hint="eastAsia"/>
+            </w:rPr>
+            <w:t>☐</w:t>
+          </w:r>
+        </w:sdtContent>
+      </w:sdt>
     </w:p>
     <w:p>
       <w:r>
@@ -95,7 +281,15 @@
         <w:pStyle w:val="NoSpacing"/>
       </w:pPr>
       <w:r>
-        <w:t>If Loopback not possible then Add dummy Tx/Rx frames and test the output.</w:t>
+        <w:t xml:space="preserve">If Loopback not possible then </w:t>
+      </w:r>
+      <w:proofErr w:type="gramStart"/>
+      <w:r>
+        <w:t>Add</w:t>
+      </w:r>
+      <w:proofErr w:type="gramEnd"/>
+      <w:r>
+        <w:t xml:space="preserve"> dummy Tx/Rx frames and test the output.</w:t>
       </w:r>
     </w:p>
     <w:p>
@@ -105,34 +299,48 @@
       <w:r>
         <w:t>Add dummy “</w:t>
       </w:r>
+      <w:proofErr w:type="spellStart"/>
       <w:r>
         <w:t>ethernetif.c</w:t>
       </w:r>
+      <w:proofErr w:type="spellEnd"/>
       <w:r>
         <w:t>” and “</w:t>
       </w:r>
+      <w:proofErr w:type="spellStart"/>
       <w:r>
         <w:t>ethernetif.</w:t>
       </w:r>
       <w:r>
-        <w:t>h” file support and trace the calls to Tx/Rx functions.</w:t>
+        <w:t>h</w:t>
+      </w:r>
+      <w:proofErr w:type="spellEnd"/>
+      <w:r>
+        <w:t>” file support and trace the calls to Tx/Rx functions.</w:t>
       </w:r>
     </w:p>
     <w:p>
       <w:r>
         <w:t>Implement “</w:t>
       </w:r>
+      <w:proofErr w:type="spellStart"/>
       <w:r>
         <w:t>ethernetif.c</w:t>
       </w:r>
+      <w:proofErr w:type="spellEnd"/>
       <w:r>
         <w:t>” and “</w:t>
       </w:r>
+      <w:proofErr w:type="spellStart"/>
       <w:r>
         <w:t>ethernetif.</w:t>
       </w:r>
       <w:r>
-        <w:t>h” files for the LWIP for compatibility with ENC28J60 controller.</w:t>
+        <w:t>h</w:t>
+      </w:r>
+      <w:proofErr w:type="spellEnd"/>
+      <w:r>
+        <w:t>” files for the LWIP for compatibility with ENC28J60 controller.</w:t>
       </w:r>
     </w:p>
     <w:p>
@@ -307,7 +515,7 @@
         <w:ind w:left="1080" w:hanging="360"/>
       </w:pPr>
     </w:lvl>
-    <w:lvl w:ilvl="2" w:tplc="4009001B" w:tentative="1">
+    <w:lvl w:ilvl="2" w:tplc="4009001B">
       <w:start w:val="1"/>
       <w:numFmt w:val="lowerRoman"/>
       <w:lvlText w:val="%3."/>
@@ -890,7 +1098,6 @@
   <w:style w:type="character" w:default="1" w:styleId="DefaultParagraphFont">
     <w:name w:val="Default Paragraph Font"/>
     <w:uiPriority w:val="1"/>
-    <w:semiHidden/>
     <w:unhideWhenUsed/>
   </w:style>
   <w:style w:type="table" w:default="1" w:styleId="TableNormal">
@@ -941,6 +1148,16 @@
       <w:color w:val="auto"/>
       <w:sz w:val="28"/>
       <w:szCs w:val="28"/>
+    </w:rPr>
+  </w:style>
+  <w:style w:type="character" w:styleId="PlaceholderText">
+    <w:name w:val="Placeholder Text"/>
+    <w:basedOn w:val="DefaultParagraphFont"/>
+    <w:uiPriority w:val="99"/>
+    <w:semiHidden/>
+    <w:rsid w:val="006542A7"/>
+    <w:rPr>
+      <w:color w:val="666666"/>
     </w:rPr>
   </w:style>
 </w:styles>

</xml_diff>

<commit_message>
- Bug fix for SPI driver for sample library code update. - Generated the code for enc26j60 using AI. Testing and compiling pending.
</commit_message>
<xml_diff>
--- a/Ethernet_Port/Plan.docx
+++ b/Ethernet_Port/Plan.docx
@@ -208,7 +208,7 @@
         <w:sdtPr>
           <w:id w:val="2073235577"/>
           <w14:checkbox>
-            <w14:checked w14:val="0"/>
+            <w14:checked w14:val="1"/>
             <w14:checkedState w14:val="2612" w14:font="MS Gothic"/>
             <w14:uncheckedState w14:val="2610" w14:font="MS Gothic"/>
           </w14:checkbox>
@@ -218,7 +218,7 @@
             <w:rPr>
               <w:rFonts w:ascii="MS Gothic" w:eastAsia="MS Gothic" w:hAnsi="MS Gothic" w:hint="eastAsia"/>
             </w:rPr>
-            <w:t>☐</w:t>
+            <w:t>☒</w:t>
           </w:r>
         </w:sdtContent>
       </w:sdt>

</xml_diff>

<commit_message>
- Successfully compiled the LWIP stack for STM32F051. Only compilation done. Testing pending.
</commit_message>
<xml_diff>
--- a/Ethernet_Port/Plan.docx
+++ b/Ethernet_Port/Plan.docx
@@ -235,6 +235,24 @@
       <w:r>
         <w:t>ENC28J60 Initialization and Write/Read API development.</w:t>
       </w:r>
+      <w:sdt>
+        <w:sdtPr>
+          <w:id w:val="-2020842300"/>
+          <w14:checkbox>
+            <w14:checked w14:val="1"/>
+            <w14:checkedState w14:val="2612" w14:font="MS Gothic"/>
+            <w14:uncheckedState w14:val="2610" w14:font="MS Gothic"/>
+          </w14:checkbox>
+        </w:sdtPr>
+        <w:sdtContent>
+          <w:r>
+            <w:rPr>
+              <w:rFonts w:ascii="MS Gothic" w:eastAsia="MS Gothic" w:hAnsi="MS Gothic" w:hint="eastAsia"/>
+            </w:rPr>
+            <w:t>☒</w:t>
+          </w:r>
+        </w:sdtContent>
+      </w:sdt>
     </w:p>
     <w:p>
       <w:pPr>
@@ -259,12 +277,73 @@
       <w:r>
         <w:t>Build the LWIP library with bare minimum configurations.</w:t>
       </w:r>
+      <w:r>
+        <w:t xml:space="preserve"> </w:t>
+      </w:r>
+      <w:sdt>
+        <w:sdtPr>
+          <w:id w:val="-259448641"/>
+          <w14:checkbox>
+            <w14:checked w14:val="1"/>
+            <w14:checkedState w14:val="2612" w14:font="MS Gothic"/>
+            <w14:uncheckedState w14:val="2610" w14:font="MS Gothic"/>
+          </w14:checkbox>
+        </w:sdtPr>
+        <w:sdtContent>
+          <w:r>
+            <w:rPr>
+              <w:rFonts w:ascii="MS Gothic" w:eastAsia="MS Gothic" w:hAnsi="MS Gothic" w:hint="eastAsia"/>
+            </w:rPr>
+            <w:t>☒</w:t>
+          </w:r>
+        </w:sdtContent>
+      </w:sdt>
     </w:p>
     <w:p>
       <w:pPr>
         <w:pStyle w:val="NoSpacing"/>
       </w:pPr>
       <w:r>
+        <w:t>Initialize the timer for tick.</w:t>
+      </w:r>
+    </w:p>
+    <w:p>
+      <w:pPr>
+        <w:pStyle w:val="NoSpacing"/>
+      </w:pPr>
+      <w:r>
+        <w:t>Link the LWIP with ENC28J60 device using port files “</w:t>
+      </w:r>
+      <w:r>
+        <w:t>ethernetif.c</w:t>
+      </w:r>
+      <w:r>
+        <w:t>”.</w:t>
+      </w:r>
+      <w:sdt>
+        <w:sdtPr>
+          <w:id w:val="251631946"/>
+          <w14:checkbox>
+            <w14:checked w14:val="0"/>
+            <w14:checkedState w14:val="2612" w14:font="MS Gothic"/>
+            <w14:uncheckedState w14:val="2610" w14:font="MS Gothic"/>
+          </w14:checkbox>
+        </w:sdtPr>
+        <w:sdtContent>
+          <w:r>
+            <w:rPr>
+              <w:rFonts w:ascii="MS Gothic" w:eastAsia="MS Gothic" w:hAnsi="MS Gothic" w:hint="eastAsia"/>
+            </w:rPr>
+            <w:t>☐</w:t>
+          </w:r>
+        </w:sdtContent>
+      </w:sdt>
+    </w:p>
+    <w:p>
+      <w:pPr>
+        <w:pStyle w:val="NoSpacing"/>
+      </w:pPr>
+      <w:r>
         <w:t>Add the TCP/UDP support only.</w:t>
       </w:r>
     </w:p>
@@ -281,15 +360,7 @@
         <w:pStyle w:val="NoSpacing"/>
       </w:pPr>
       <w:r>
-        <w:t xml:space="preserve">If Loopback not possible then </w:t>
-      </w:r>
-      <w:proofErr w:type="gramStart"/>
-      <w:r>
-        <w:t>Add</w:t>
-      </w:r>
-      <w:proofErr w:type="gramEnd"/>
-      <w:r>
-        <w:t xml:space="preserve"> dummy Tx/Rx frames and test the output.</w:t>
+        <w:t>If Loopback not possible then Add dummy Tx/Rx frames and test the output.</w:t>
       </w:r>
     </w:p>
     <w:p>
@@ -299,48 +370,34 @@
       <w:r>
         <w:t>Add dummy “</w:t>
       </w:r>
-      <w:proofErr w:type="spellStart"/>
       <w:r>
         <w:t>ethernetif.c</w:t>
       </w:r>
-      <w:proofErr w:type="spellEnd"/>
       <w:r>
         <w:t>” and “</w:t>
       </w:r>
-      <w:proofErr w:type="spellStart"/>
       <w:r>
         <w:t>ethernetif.</w:t>
       </w:r>
       <w:r>
-        <w:t>h</w:t>
-      </w:r>
-      <w:proofErr w:type="spellEnd"/>
-      <w:r>
-        <w:t>” file support and trace the calls to Tx/Rx functions.</w:t>
+        <w:t>h” file support and trace the calls to Tx/Rx functions.</w:t>
       </w:r>
     </w:p>
     <w:p>
       <w:r>
         <w:t>Implement “</w:t>
       </w:r>
-      <w:proofErr w:type="spellStart"/>
       <w:r>
         <w:t>ethernetif.c</w:t>
       </w:r>
-      <w:proofErr w:type="spellEnd"/>
       <w:r>
         <w:t>” and “</w:t>
       </w:r>
-      <w:proofErr w:type="spellStart"/>
       <w:r>
         <w:t>ethernetif.</w:t>
       </w:r>
       <w:r>
-        <w:t>h</w:t>
-      </w:r>
-      <w:proofErr w:type="spellEnd"/>
-      <w:r>
-        <w:t>” files for the LWIP for compatibility with ENC28J60 controller.</w:t>
+        <w:t>h” files for the LWIP for compatibility with ENC28J60 controller.</w:t>
       </w:r>
     </w:p>
     <w:p>
@@ -386,6 +443,2118 @@
       <w:r>
         <w:t>.</w:t>
       </w:r>
+    </w:p>
+    <w:p>
+      <w:pPr>
+        <w:numPr>
+          <w:ilvl w:val="0"/>
+          <w:numId w:val="0"/>
+        </w:numPr>
+        <w:ind w:left="360" w:hanging="360"/>
+      </w:pPr>
+    </w:p>
+    <w:p>
+      <w:pPr>
+        <w:numPr>
+          <w:ilvl w:val="0"/>
+          <w:numId w:val="0"/>
+        </w:numPr>
+        <w:ind w:left="360" w:hanging="360"/>
+      </w:pPr>
+    </w:p>
+    <w:p>
+      <w:pPr>
+        <w:numPr>
+          <w:ilvl w:val="0"/>
+          <w:numId w:val="0"/>
+        </w:numPr>
+        <w:ind w:left="360" w:hanging="360"/>
+      </w:pPr>
+    </w:p>
+    <w:p>
+      <w:pPr>
+        <w:numPr>
+          <w:ilvl w:val="0"/>
+          <w:numId w:val="0"/>
+        </w:numPr>
+        <w:ind w:left="360" w:hanging="360"/>
+      </w:pPr>
+    </w:p>
+    <w:p>
+      <w:pPr>
+        <w:numPr>
+          <w:ilvl w:val="0"/>
+          <w:numId w:val="0"/>
+        </w:numPr>
+        <w:ind w:left="360" w:hanging="360"/>
+      </w:pPr>
+    </w:p>
+    <w:p>
+      <w:pPr>
+        <w:pStyle w:val="Heading1"/>
+        <w:rPr>
+          <w:rStyle w:val="SubtleEmphasis"/>
+          <w:i w:val="0"/>
+          <w:iCs w:val="0"/>
+          <w:color w:val="auto"/>
+        </w:rPr>
+      </w:pPr>
+      <w:r>
+        <w:rPr>
+          <w:rStyle w:val="SubtleEmphasis"/>
+          <w:i w:val="0"/>
+          <w:iCs w:val="0"/>
+          <w:color w:val="auto"/>
+        </w:rPr>
+        <w:t>Dfdfgdsg</w:t>
+      </w:r>
+    </w:p>
+    <w:p>
+      <w:pPr>
+        <w:pStyle w:val="Heading1"/>
+      </w:pPr>
+      <w:r>
+        <w:t xml:space="preserve">To integrate the </w:t>
+      </w:r>
+      <w:hyperlink r:id="rId5" w:tgtFrame="_blank" w:history="1">
+        <w:r>
+          <w:rPr>
+            <w:rStyle w:val="Hyperlink"/>
+          </w:rPr>
+          <w:t>Microchip ENC28J60 Ethernet controller</w:t>
+        </w:r>
+      </w:hyperlink>
+      <w:r>
+        <w:t xml:space="preserve"> with the </w:t>
+      </w:r>
+      <w:hyperlink r:id="rId6" w:tgtFrame="_blank" w:history="1">
+        <w:r>
+          <w:rPr>
+            <w:rStyle w:val="Hyperlink"/>
+          </w:rPr>
+          <w:t>lwIP (Lightweight IP)</w:t>
+        </w:r>
+      </w:hyperlink>
+      <w:r>
+        <w:t xml:space="preserve"> stack on a microcontroller, you must interface your hardware SPI layer with lwIP's network interface layer (netif). [</w:t>
+      </w:r>
+      <w:hyperlink r:id="rId7" w:history="1">
+        <w:r>
+          <w:rPr>
+            <w:rStyle w:val="Hyperlink"/>
+          </w:rPr>
+          <w:t>1</w:t>
+        </w:r>
+      </w:hyperlink>
+      <w:r>
+        <w:t xml:space="preserve">, </w:t>
+      </w:r>
+      <w:hyperlink r:id="rId8" w:history="1">
+        <w:r>
+          <w:rPr>
+            <w:rStyle w:val="Hyperlink"/>
+          </w:rPr>
+          <w:t>2</w:t>
+        </w:r>
+      </w:hyperlink>
+      <w:r>
+        <w:t>]</w:t>
+      </w:r>
+    </w:p>
+    <w:p>
+      <w:pPr>
+        <w:pStyle w:val="Heading1"/>
+      </w:pPr>
+      <w:r>
+        <w:t>Below is a complete, minimal framework for running lwIP in a bare-metal (NO_SYS = 1) configuration. [</w:t>
+      </w:r>
+      <w:hyperlink r:id="rId9" w:history="1">
+        <w:r>
+          <w:rPr>
+            <w:rStyle w:val="Hyperlink"/>
+          </w:rPr>
+          <w:t>1</w:t>
+        </w:r>
+      </w:hyperlink>
+      <w:r>
+        <w:t xml:space="preserve">, </w:t>
+      </w:r>
+      <w:hyperlink r:id="rId10" w:history="1">
+        <w:r>
+          <w:rPr>
+            <w:rStyle w:val="Hyperlink"/>
+          </w:rPr>
+          <w:t>2</w:t>
+        </w:r>
+      </w:hyperlink>
+      <w:r>
+        <w:t>]</w:t>
+      </w:r>
+    </w:p>
+    <w:p>
+      <w:pPr>
+        <w:pStyle w:val="Heading1"/>
+      </w:pPr>
+      <w:r>
+        <w:t>Step 1: Configuration (lwipopts.h)</w:t>
+      </w:r>
+    </w:p>
+    <w:p>
+      <w:pPr>
+        <w:pStyle w:val="Heading1"/>
+      </w:pPr>
+      <w:r>
+        <w:t>This configuration file tells lwIP to run without an operating system layer (polling mode). [</w:t>
+      </w:r>
+      <w:hyperlink r:id="rId11" w:history="1">
+        <w:r>
+          <w:rPr>
+            <w:rStyle w:val="Hyperlink"/>
+          </w:rPr>
+          <w:t>1</w:t>
+        </w:r>
+      </w:hyperlink>
+      <w:r>
+        <w:t xml:space="preserve">, </w:t>
+      </w:r>
+      <w:hyperlink r:id="rId12" w:history="1">
+        <w:r>
+          <w:rPr>
+            <w:rStyle w:val="Hyperlink"/>
+          </w:rPr>
+          <w:t>2</w:t>
+        </w:r>
+      </w:hyperlink>
+      <w:r>
+        <w:t>]</w:t>
+      </w:r>
+    </w:p>
+    <w:p>
+      <w:pPr>
+        <w:pStyle w:val="Heading2"/>
+        <w:rPr>
+          <w:color w:val="538135" w:themeColor="accent6" w:themeShade="BF"/>
+        </w:rPr>
+      </w:pPr>
+      <w:r>
+        <w:rPr>
+          <w:color w:val="538135" w:themeColor="accent6" w:themeShade="BF"/>
+        </w:rPr>
+        <w:t>c</w:t>
+      </w:r>
+    </w:p>
+    <w:p>
+      <w:pPr>
+        <w:pStyle w:val="Heading2"/>
+        <w:rPr>
+          <w:color w:val="538135" w:themeColor="accent6" w:themeShade="BF"/>
+        </w:rPr>
+      </w:pPr>
+      <w:r>
+        <w:rPr>
+          <w:color w:val="538135" w:themeColor="accent6" w:themeShade="BF"/>
+        </w:rPr>
+        <w:t>#ifndef __LWIPOPTS_H__</w:t>
+      </w:r>
+    </w:p>
+    <w:p>
+      <w:pPr>
+        <w:pStyle w:val="Heading2"/>
+        <w:rPr>
+          <w:color w:val="538135" w:themeColor="accent6" w:themeShade="BF"/>
+        </w:rPr>
+      </w:pPr>
+      <w:r>
+        <w:rPr>
+          <w:color w:val="538135" w:themeColor="accent6" w:themeShade="BF"/>
+        </w:rPr>
+        <w:t>#define __LWIPOPTS_H__</w:t>
+      </w:r>
+    </w:p>
+    <w:p>
+      <w:pPr>
+        <w:pStyle w:val="Heading2"/>
+        <w:rPr>
+          <w:color w:val="538135" w:themeColor="accent6" w:themeShade="BF"/>
+        </w:rPr>
+      </w:pPr>
+    </w:p>
+    <w:p>
+      <w:pPr>
+        <w:pStyle w:val="Heading2"/>
+        <w:rPr>
+          <w:color w:val="538135" w:themeColor="accent6" w:themeShade="BF"/>
+        </w:rPr>
+      </w:pPr>
+      <w:r>
+        <w:rPr>
+          <w:color w:val="538135" w:themeColor="accent6" w:themeShade="BF"/>
+        </w:rPr>
+        <w:t>#define NO_SYS                  1  // 1 = Bare-metal (No OS / No FreeRTOS)</w:t>
+      </w:r>
+    </w:p>
+    <w:p>
+      <w:pPr>
+        <w:pStyle w:val="Heading2"/>
+        <w:rPr>
+          <w:color w:val="538135" w:themeColor="accent6" w:themeShade="BF"/>
+        </w:rPr>
+      </w:pPr>
+      <w:r>
+        <w:rPr>
+          <w:color w:val="538135" w:themeColor="accent6" w:themeShade="BF"/>
+        </w:rPr>
+        <w:t>#define SYS_LIGHTWEIGHT_PROT    0</w:t>
+      </w:r>
+    </w:p>
+    <w:p>
+      <w:pPr>
+        <w:pStyle w:val="Heading2"/>
+        <w:rPr>
+          <w:color w:val="538135" w:themeColor="accent6" w:themeShade="BF"/>
+        </w:rPr>
+      </w:pPr>
+      <w:r>
+        <w:rPr>
+          <w:color w:val="538135" w:themeColor="accent6" w:themeShade="BF"/>
+        </w:rPr>
+        <w:t>#define MEM_ALIGNMENT           4</w:t>
+      </w:r>
+    </w:p>
+    <w:p>
+      <w:pPr>
+        <w:pStyle w:val="Heading2"/>
+        <w:rPr>
+          <w:color w:val="538135" w:themeColor="accent6" w:themeShade="BF"/>
+        </w:rPr>
+      </w:pPr>
+    </w:p>
+    <w:p>
+      <w:pPr>
+        <w:pStyle w:val="Heading2"/>
+        <w:rPr>
+          <w:color w:val="538135" w:themeColor="accent6" w:themeShade="BF"/>
+        </w:rPr>
+      </w:pPr>
+      <w:r>
+        <w:rPr>
+          <w:color w:val="538135" w:themeColor="accent6" w:themeShade="BF"/>
+        </w:rPr>
+        <w:t>/* Memory optimizations for smaller microcontrollers */</w:t>
+      </w:r>
+    </w:p>
+    <w:p>
+      <w:pPr>
+        <w:pStyle w:val="Heading2"/>
+        <w:rPr>
+          <w:color w:val="538135" w:themeColor="accent6" w:themeShade="BF"/>
+        </w:rPr>
+      </w:pPr>
+      <w:r>
+        <w:rPr>
+          <w:color w:val="538135" w:themeColor="accent6" w:themeShade="BF"/>
+        </w:rPr>
+        <w:t>#define MEM_SIZE                2048</w:t>
+      </w:r>
+    </w:p>
+    <w:p>
+      <w:pPr>
+        <w:pStyle w:val="Heading2"/>
+        <w:rPr>
+          <w:color w:val="538135" w:themeColor="accent6" w:themeShade="BF"/>
+        </w:rPr>
+      </w:pPr>
+      <w:r>
+        <w:rPr>
+          <w:color w:val="538135" w:themeColor="accent6" w:themeShade="BF"/>
+        </w:rPr>
+        <w:t>#define MEMP_NUM_PBUF           8</w:t>
+      </w:r>
+    </w:p>
+    <w:p>
+      <w:pPr>
+        <w:pStyle w:val="Heading2"/>
+        <w:rPr>
+          <w:color w:val="538135" w:themeColor="accent6" w:themeShade="BF"/>
+        </w:rPr>
+      </w:pPr>
+      <w:r>
+        <w:rPr>
+          <w:color w:val="538135" w:themeColor="accent6" w:themeShade="BF"/>
+        </w:rPr>
+        <w:t>#define MEMP_NUM_TCP_PCB        4</w:t>
+      </w:r>
+    </w:p>
+    <w:p>
+      <w:pPr>
+        <w:pStyle w:val="Heading2"/>
+        <w:rPr>
+          <w:color w:val="538135" w:themeColor="accent6" w:themeShade="BF"/>
+        </w:rPr>
+      </w:pPr>
+      <w:r>
+        <w:rPr>
+          <w:color w:val="538135" w:themeColor="accent6" w:themeShade="BF"/>
+        </w:rPr>
+        <w:t>#define MEMP_NUM_UDP_PCB        4</w:t>
+      </w:r>
+    </w:p>
+    <w:p>
+      <w:pPr>
+        <w:pStyle w:val="Heading2"/>
+        <w:rPr>
+          <w:color w:val="538135" w:themeColor="accent6" w:themeShade="BF"/>
+        </w:rPr>
+      </w:pPr>
+    </w:p>
+    <w:p>
+      <w:pPr>
+        <w:pStyle w:val="Heading2"/>
+        <w:rPr>
+          <w:color w:val="538135" w:themeColor="accent6" w:themeShade="BF"/>
+        </w:rPr>
+      </w:pPr>
+      <w:r>
+        <w:rPr>
+          <w:color w:val="538135" w:themeColor="accent6" w:themeShade="BF"/>
+        </w:rPr>
+        <w:t>/* Enable UDP and TCP */</w:t>
+      </w:r>
+    </w:p>
+    <w:p>
+      <w:pPr>
+        <w:pStyle w:val="Heading2"/>
+        <w:rPr>
+          <w:color w:val="538135" w:themeColor="accent6" w:themeShade="BF"/>
+        </w:rPr>
+      </w:pPr>
+      <w:r>
+        <w:rPr>
+          <w:color w:val="538135" w:themeColor="accent6" w:themeShade="BF"/>
+        </w:rPr>
+        <w:t>#define LWIP_UDP                1</w:t>
+      </w:r>
+    </w:p>
+    <w:p>
+      <w:pPr>
+        <w:pStyle w:val="Heading2"/>
+        <w:rPr>
+          <w:color w:val="538135" w:themeColor="accent6" w:themeShade="BF"/>
+        </w:rPr>
+      </w:pPr>
+      <w:r>
+        <w:rPr>
+          <w:color w:val="538135" w:themeColor="accent6" w:themeShade="BF"/>
+        </w:rPr>
+        <w:t>#define LWIP_TCP                1</w:t>
+      </w:r>
+    </w:p>
+    <w:p>
+      <w:pPr>
+        <w:pStyle w:val="Heading2"/>
+        <w:rPr>
+          <w:color w:val="538135" w:themeColor="accent6" w:themeShade="BF"/>
+        </w:rPr>
+      </w:pPr>
+      <w:r>
+        <w:rPr>
+          <w:color w:val="538135" w:themeColor="accent6" w:themeShade="BF"/>
+        </w:rPr>
+        <w:t>#define LWIP_DHCP               0  // 0 = Static IP, 1 = DHCP</w:t>
+      </w:r>
+    </w:p>
+    <w:p>
+      <w:pPr>
+        <w:pStyle w:val="Heading2"/>
+        <w:rPr>
+          <w:color w:val="538135" w:themeColor="accent6" w:themeShade="BF"/>
+        </w:rPr>
+      </w:pPr>
+    </w:p>
+    <w:p>
+      <w:pPr>
+        <w:pStyle w:val="Heading2"/>
+        <w:rPr>
+          <w:color w:val="538135" w:themeColor="accent6" w:themeShade="BF"/>
+        </w:rPr>
+      </w:pPr>
+      <w:r>
+        <w:rPr>
+          <w:color w:val="538135" w:themeColor="accent6" w:themeShade="BF"/>
+        </w:rPr>
+        <w:t>#endif</w:t>
+      </w:r>
+    </w:p>
+    <w:p>
+      <w:pPr>
+        <w:pStyle w:val="Heading2"/>
+        <w:rPr>
+          <w:color w:val="auto"/>
+          <w14:textFill>
+            <w14:solidFill>
+              <w14:srgbClr w14:val="000000">
+                <w14:lumMod w14:val="75000"/>
+              </w14:srgbClr>
+            </w14:solidFill>
+          </w14:textFill>
+        </w:rPr>
+      </w:pPr>
+      <w:r>
+        <w:rPr>
+          <w:color w:val="538135" w:themeColor="accent6" w:themeShade="BF"/>
+        </w:rPr>
+        <w:t>Use code with caution.</w:t>
+      </w:r>
+    </w:p>
+    <w:p>
+      <w:pPr>
+        <w:pStyle w:val="Heading1"/>
+      </w:pPr>
+      <w:r>
+        <w:t>Step 2: The Network Interface Port (ethernetif.c)</w:t>
+      </w:r>
+    </w:p>
+    <w:p>
+      <w:pPr>
+        <w:pStyle w:val="Heading1"/>
+      </w:pPr>
+      <w:r>
+        <w:t>This file links the low-level SPI functions of the ENC28J60 driver to the packet buffers (pbuf) of the lwIP stack. [</w:t>
+      </w:r>
+      <w:hyperlink r:id="rId13" w:history="1">
+        <w:r>
+          <w:rPr>
+            <w:rStyle w:val="Hyperlink"/>
+          </w:rPr>
+          <w:t>1</w:t>
+        </w:r>
+      </w:hyperlink>
+      <w:r>
+        <w:t>]</w:t>
+      </w:r>
+    </w:p>
+    <w:p>
+      <w:pPr>
+        <w:pStyle w:val="Heading2"/>
+        <w:rPr>
+          <w:color w:val="538135" w:themeColor="accent6" w:themeShade="BF"/>
+        </w:rPr>
+      </w:pPr>
+      <w:r>
+        <w:rPr>
+          <w:color w:val="538135" w:themeColor="accent6" w:themeShade="BF"/>
+        </w:rPr>
+        <w:t>c</w:t>
+      </w:r>
+    </w:p>
+    <w:p>
+      <w:pPr>
+        <w:pStyle w:val="Heading2"/>
+        <w:rPr>
+          <w:color w:val="538135" w:themeColor="accent6" w:themeShade="BF"/>
+        </w:rPr>
+      </w:pPr>
+      <w:r>
+        <w:rPr>
+          <w:color w:val="538135" w:themeColor="accent6" w:themeShade="BF"/>
+        </w:rPr>
+        <w:t>#include "lwip/netif.h"</w:t>
+      </w:r>
+    </w:p>
+    <w:p>
+      <w:pPr>
+        <w:pStyle w:val="Heading2"/>
+        <w:rPr>
+          <w:color w:val="538135" w:themeColor="accent6" w:themeShade="BF"/>
+        </w:rPr>
+      </w:pPr>
+      <w:r>
+        <w:rPr>
+          <w:color w:val="538135" w:themeColor="accent6" w:themeShade="BF"/>
+        </w:rPr>
+        <w:t>#include "lwip/pbuf.h"</w:t>
+      </w:r>
+    </w:p>
+    <w:p>
+      <w:pPr>
+        <w:pStyle w:val="Heading2"/>
+        <w:rPr>
+          <w:color w:val="538135" w:themeColor="accent6" w:themeShade="BF"/>
+        </w:rPr>
+      </w:pPr>
+      <w:r>
+        <w:rPr>
+          <w:color w:val="538135" w:themeColor="accent6" w:themeShade="BF"/>
+        </w:rPr>
+        <w:t>#include "netif/etharp.h"</w:t>
+      </w:r>
+    </w:p>
+    <w:p>
+      <w:pPr>
+        <w:pStyle w:val="Heading2"/>
+        <w:rPr>
+          <w:color w:val="538135" w:themeColor="accent6" w:themeShade="BF"/>
+        </w:rPr>
+      </w:pPr>
+      <w:r>
+        <w:rPr>
+          <w:color w:val="538135" w:themeColor="accent6" w:themeShade="BF"/>
+        </w:rPr>
+        <w:t>#include "enc28j60_driver.h" // Replace with your chip-specific SPI driver</w:t>
+      </w:r>
+    </w:p>
+    <w:p>
+      <w:pPr>
+        <w:pStyle w:val="Heading2"/>
+        <w:rPr>
+          <w:color w:val="538135" w:themeColor="accent6" w:themeShade="BF"/>
+        </w:rPr>
+      </w:pPr>
+    </w:p>
+    <w:p>
+      <w:pPr>
+        <w:pStyle w:val="Heading2"/>
+        <w:rPr>
+          <w:color w:val="538135" w:themeColor="accent6" w:themeShade="BF"/>
+        </w:rPr>
+      </w:pPr>
+      <w:r>
+        <w:rPr>
+          <w:color w:val="538135" w:themeColor="accent6" w:themeShade="BF"/>
+        </w:rPr>
+        <w:t>/* Low-level hardware initialization */</w:t>
+      </w:r>
+    </w:p>
+    <w:p>
+      <w:pPr>
+        <w:pStyle w:val="Heading2"/>
+        <w:rPr>
+          <w:color w:val="538135" w:themeColor="accent6" w:themeShade="BF"/>
+        </w:rPr>
+      </w:pPr>
+      <w:r>
+        <w:rPr>
+          <w:color w:val="538135" w:themeColor="accent6" w:themeShade="BF"/>
+        </w:rPr>
+        <w:t>static void low_level_init(struct netif *netif) {</w:t>
+      </w:r>
+    </w:p>
+    <w:p>
+      <w:pPr>
+        <w:pStyle w:val="Heading2"/>
+        <w:rPr>
+          <w:color w:val="538135" w:themeColor="accent6" w:themeShade="BF"/>
+        </w:rPr>
+      </w:pPr>
+      <w:r>
+        <w:rPr>
+          <w:color w:val="538135" w:themeColor="accent6" w:themeShade="BF"/>
+        </w:rPr>
+        <w:lastRenderedPageBreak/>
+        <w:t xml:space="preserve">    netif-&gt;hwaddr_len = ETHARP_HWADDR_LEN;</w:t>
+      </w:r>
+    </w:p>
+    <w:p>
+      <w:pPr>
+        <w:pStyle w:val="Heading2"/>
+        <w:rPr>
+          <w:color w:val="538135" w:themeColor="accent6" w:themeShade="BF"/>
+        </w:rPr>
+      </w:pPr>
+      <w:r>
+        <w:rPr>
+          <w:color w:val="538135" w:themeColor="accent6" w:themeShade="BF"/>
+        </w:rPr>
+        <w:t xml:space="preserve">    </w:t>
+      </w:r>
+    </w:p>
+    <w:p>
+      <w:pPr>
+        <w:pStyle w:val="Heading2"/>
+        <w:rPr>
+          <w:color w:val="538135" w:themeColor="accent6" w:themeShade="BF"/>
+        </w:rPr>
+      </w:pPr>
+      <w:r>
+        <w:rPr>
+          <w:color w:val="538135" w:themeColor="accent6" w:themeShade="BF"/>
+        </w:rPr>
+        <w:t xml:space="preserve">    // Set MAC Address (e.g., 00:08:DC:00:00:01)</w:t>
+      </w:r>
+    </w:p>
+    <w:p>
+      <w:pPr>
+        <w:pStyle w:val="Heading2"/>
+        <w:rPr>
+          <w:color w:val="538135" w:themeColor="accent6" w:themeShade="BF"/>
+        </w:rPr>
+      </w:pPr>
+      <w:r>
+        <w:rPr>
+          <w:color w:val="538135" w:themeColor="accent6" w:themeShade="BF"/>
+        </w:rPr>
+        <w:t xml:space="preserve">    netif-&gt;hwaddr[0] = 0x00; netif-&gt;hwaddr[1] = 0x08;</w:t>
+      </w:r>
+    </w:p>
+    <w:p>
+      <w:pPr>
+        <w:pStyle w:val="Heading2"/>
+        <w:rPr>
+          <w:color w:val="538135" w:themeColor="accent6" w:themeShade="BF"/>
+        </w:rPr>
+      </w:pPr>
+      <w:r>
+        <w:rPr>
+          <w:color w:val="538135" w:themeColor="accent6" w:themeShade="BF"/>
+        </w:rPr>
+        <w:t xml:space="preserve">    netif-&gt;hwaddr[2] = 0xDC; netif-&gt;hwaddr[3] = 0x00;</w:t>
+      </w:r>
+    </w:p>
+    <w:p>
+      <w:pPr>
+        <w:pStyle w:val="Heading2"/>
+        <w:rPr>
+          <w:color w:val="538135" w:themeColor="accent6" w:themeShade="BF"/>
+        </w:rPr>
+      </w:pPr>
+      <w:r>
+        <w:rPr>
+          <w:color w:val="538135" w:themeColor="accent6" w:themeShade="BF"/>
+        </w:rPr>
+        <w:t xml:space="preserve">    netif-&gt;hwaddr[4] = 0x00; netif-&gt;hwaddr[5] = 0x01;</w:t>
+      </w:r>
+    </w:p>
+    <w:p>
+      <w:pPr>
+        <w:pStyle w:val="Heading2"/>
+        <w:rPr>
+          <w:color w:val="538135" w:themeColor="accent6" w:themeShade="BF"/>
+        </w:rPr>
+      </w:pPr>
+      <w:r>
+        <w:rPr>
+          <w:color w:val="538135" w:themeColor="accent6" w:themeShade="BF"/>
+        </w:rPr>
+        <w:t xml:space="preserve">    </w:t>
+      </w:r>
+    </w:p>
+    <w:p>
+      <w:pPr>
+        <w:pStyle w:val="Heading2"/>
+        <w:rPr>
+          <w:color w:val="538135" w:themeColor="accent6" w:themeShade="BF"/>
+        </w:rPr>
+      </w:pPr>
+      <w:r>
+        <w:rPr>
+          <w:color w:val="538135" w:themeColor="accent6" w:themeShade="BF"/>
+        </w:rPr>
+        <w:t xml:space="preserve">    netif-&gt;mtu = 1500;</w:t>
+      </w:r>
+    </w:p>
+    <w:p>
+      <w:pPr>
+        <w:pStyle w:val="Heading2"/>
+        <w:rPr>
+          <w:color w:val="538135" w:themeColor="accent6" w:themeShade="BF"/>
+        </w:rPr>
+      </w:pPr>
+      <w:r>
+        <w:rPr>
+          <w:color w:val="538135" w:themeColor="accent6" w:themeShade="BF"/>
+        </w:rPr>
+        <w:t xml:space="preserve">    netif-&gt;flags = NETIF_FLAG_BROADCAST | NETIF_FLAG_ETHARP | NETIF_FLAG_LINK_UP;</w:t>
+      </w:r>
+    </w:p>
+    <w:p>
+      <w:pPr>
+        <w:pStyle w:val="Heading2"/>
+        <w:rPr>
+          <w:color w:val="538135" w:themeColor="accent6" w:themeShade="BF"/>
+        </w:rPr>
+      </w:pPr>
+    </w:p>
+    <w:p>
+      <w:pPr>
+        <w:pStyle w:val="Heading2"/>
+        <w:rPr>
+          <w:color w:val="538135" w:themeColor="accent6" w:themeShade="BF"/>
+        </w:rPr>
+      </w:pPr>
+      <w:r>
+        <w:rPr>
+          <w:color w:val="538135" w:themeColor="accent6" w:themeShade="BF"/>
+        </w:rPr>
+        <w:t xml:space="preserve">    ENC28J60_Init(netif-&gt;hwaddr); // Call your SPI physical layer init code</w:t>
+      </w:r>
+    </w:p>
+    <w:p>
+      <w:pPr>
+        <w:pStyle w:val="Heading2"/>
+        <w:rPr>
+          <w:color w:val="538135" w:themeColor="accent6" w:themeShade="BF"/>
+        </w:rPr>
+      </w:pPr>
+      <w:r>
+        <w:rPr>
+          <w:color w:val="538135" w:themeColor="accent6" w:themeShade="BF"/>
+        </w:rPr>
+        <w:t>}</w:t>
+      </w:r>
+    </w:p>
+    <w:p>
+      <w:pPr>
+        <w:pStyle w:val="Heading2"/>
+        <w:rPr>
+          <w:color w:val="538135" w:themeColor="accent6" w:themeShade="BF"/>
+        </w:rPr>
+      </w:pPr>
+    </w:p>
+    <w:p>
+      <w:pPr>
+        <w:pStyle w:val="Heading2"/>
+        <w:rPr>
+          <w:color w:val="538135" w:themeColor="accent6" w:themeShade="BF"/>
+        </w:rPr>
+      </w:pPr>
+      <w:r>
+        <w:rPr>
+          <w:color w:val="538135" w:themeColor="accent6" w:themeShade="BF"/>
+        </w:rPr>
+        <w:t>/* Transmit packet over SPI to ENC28J60 */</w:t>
+      </w:r>
+    </w:p>
+    <w:p>
+      <w:pPr>
+        <w:pStyle w:val="Heading2"/>
+        <w:rPr>
+          <w:color w:val="538135" w:themeColor="accent6" w:themeShade="BF"/>
+        </w:rPr>
+      </w:pPr>
+      <w:r>
+        <w:rPr>
+          <w:color w:val="538135" w:themeColor="accent6" w:themeShade="BF"/>
+        </w:rPr>
+        <w:t>static err_t low_level_output(struct netif *netif, struct pbuf *p) {</w:t>
+      </w:r>
+    </w:p>
+    <w:p>
+      <w:pPr>
+        <w:pStyle w:val="Heading2"/>
+        <w:rPr>
+          <w:color w:val="538135" w:themeColor="accent6" w:themeShade="BF"/>
+        </w:rPr>
+      </w:pPr>
+      <w:r>
+        <w:rPr>
+          <w:color w:val="538135" w:themeColor="accent6" w:themeShade="BF"/>
+        </w:rPr>
+        <w:t xml:space="preserve">    struct pbuf *q;</w:t>
+      </w:r>
+    </w:p>
+    <w:p>
+      <w:pPr>
+        <w:pStyle w:val="Heading2"/>
+        <w:rPr>
+          <w:color w:val="538135" w:themeColor="accent6" w:themeShade="BF"/>
+        </w:rPr>
+      </w:pPr>
+      <w:r>
+        <w:rPr>
+          <w:color w:val="538135" w:themeColor="accent6" w:themeShade="BF"/>
+        </w:rPr>
+        <w:t xml:space="preserve">    ENC28J60_TransmitStart(p-&gt;tot_len); // Alert ENC28J60 of oncoming payload</w:t>
+      </w:r>
+    </w:p>
+    <w:p>
+      <w:pPr>
+        <w:pStyle w:val="Heading2"/>
+        <w:rPr>
+          <w:color w:val="538135" w:themeColor="accent6" w:themeShade="BF"/>
+        </w:rPr>
+      </w:pPr>
+    </w:p>
+    <w:p>
+      <w:pPr>
+        <w:pStyle w:val="Heading2"/>
+        <w:rPr>
+          <w:color w:val="538135" w:themeColor="accent6" w:themeShade="BF"/>
+        </w:rPr>
+      </w:pPr>
+      <w:r>
+        <w:rPr>
+          <w:color w:val="538135" w:themeColor="accent6" w:themeShade="BF"/>
+        </w:rPr>
+        <w:t xml:space="preserve">    for(q = p; q != NULL; q = q-&gt;next) {</w:t>
+      </w:r>
+    </w:p>
+    <w:p>
+      <w:pPr>
+        <w:pStyle w:val="Heading2"/>
+        <w:rPr>
+          <w:color w:val="538135" w:themeColor="accent6" w:themeShade="BF"/>
+        </w:rPr>
+      </w:pPr>
+      <w:r>
+        <w:rPr>
+          <w:color w:val="538135" w:themeColor="accent6" w:themeShade="BF"/>
+        </w:rPr>
+        <w:t xml:space="preserve">        // Send buffer chunk via SPI</w:t>
+      </w:r>
+    </w:p>
+    <w:p>
+      <w:pPr>
+        <w:pStyle w:val="Heading2"/>
+        <w:rPr>
+          <w:color w:val="538135" w:themeColor="accent6" w:themeShade="BF"/>
+        </w:rPr>
+      </w:pPr>
+      <w:r>
+        <w:rPr>
+          <w:color w:val="538135" w:themeColor="accent6" w:themeShade="BF"/>
+        </w:rPr>
+        <w:t xml:space="preserve">        ENC28J60_WriteBuffer(q-&gt;payload, q-&gt;len); </w:t>
+      </w:r>
+    </w:p>
+    <w:p>
+      <w:pPr>
+        <w:pStyle w:val="Heading2"/>
+        <w:rPr>
+          <w:color w:val="538135" w:themeColor="accent6" w:themeShade="BF"/>
+        </w:rPr>
+      </w:pPr>
+      <w:r>
+        <w:rPr>
+          <w:color w:val="538135" w:themeColor="accent6" w:themeShade="BF"/>
+        </w:rPr>
+        <w:t xml:space="preserve">    }</w:t>
+      </w:r>
+    </w:p>
+    <w:p>
+      <w:pPr>
+        <w:pStyle w:val="Heading2"/>
+        <w:rPr>
+          <w:color w:val="538135" w:themeColor="accent6" w:themeShade="BF"/>
+        </w:rPr>
+      </w:pPr>
+    </w:p>
+    <w:p>
+      <w:pPr>
+        <w:pStyle w:val="Heading2"/>
+        <w:rPr>
+          <w:color w:val="538135" w:themeColor="accent6" w:themeShade="BF"/>
+        </w:rPr>
+      </w:pPr>
+      <w:r>
+        <w:rPr>
+          <w:color w:val="538135" w:themeColor="accent6" w:themeShade="BF"/>
+        </w:rPr>
+        <w:t xml:space="preserve">    ENC28J60_TransmitSend(); // Execute transmit command</w:t>
+      </w:r>
+    </w:p>
+    <w:p>
+      <w:pPr>
+        <w:pStyle w:val="Heading2"/>
+        <w:rPr>
+          <w:color w:val="538135" w:themeColor="accent6" w:themeShade="BF"/>
+        </w:rPr>
+      </w:pPr>
+      <w:r>
+        <w:rPr>
+          <w:color w:val="538135" w:themeColor="accent6" w:themeShade="BF"/>
+        </w:rPr>
+        <w:t xml:space="preserve">    return ERR_OK;</w:t>
+      </w:r>
+    </w:p>
+    <w:p>
+      <w:pPr>
+        <w:pStyle w:val="Heading2"/>
+        <w:rPr>
+          <w:color w:val="538135" w:themeColor="accent6" w:themeShade="BF"/>
+        </w:rPr>
+      </w:pPr>
+      <w:r>
+        <w:rPr>
+          <w:color w:val="538135" w:themeColor="accent6" w:themeShade="BF"/>
+        </w:rPr>
+        <w:t>}</w:t>
+      </w:r>
+    </w:p>
+    <w:p>
+      <w:pPr>
+        <w:pStyle w:val="Heading2"/>
+        <w:rPr>
+          <w:color w:val="538135" w:themeColor="accent6" w:themeShade="BF"/>
+        </w:rPr>
+      </w:pPr>
+    </w:p>
+    <w:p>
+      <w:pPr>
+        <w:pStyle w:val="Heading2"/>
+        <w:rPr>
+          <w:color w:val="538135" w:themeColor="accent6" w:themeShade="BF"/>
+        </w:rPr>
+      </w:pPr>
+      <w:r>
+        <w:rPr>
+          <w:color w:val="538135" w:themeColor="accent6" w:themeShade="BF"/>
+        </w:rPr>
+        <w:t>/* Receive packet from ENC28J60 over SPI */</w:t>
+      </w:r>
+    </w:p>
+    <w:p>
+      <w:pPr>
+        <w:pStyle w:val="Heading2"/>
+        <w:rPr>
+          <w:color w:val="538135" w:themeColor="accent6" w:themeShade="BF"/>
+        </w:rPr>
+      </w:pPr>
+      <w:r>
+        <w:rPr>
+          <w:color w:val="538135" w:themeColor="accent6" w:themeShade="BF"/>
+        </w:rPr>
+        <w:t>static struct pbuf* low_level_input(struct netif *netif) {</w:t>
+      </w:r>
+    </w:p>
+    <w:p>
+      <w:pPr>
+        <w:pStyle w:val="Heading2"/>
+        <w:rPr>
+          <w:color w:val="538135" w:themeColor="accent6" w:themeShade="BF"/>
+        </w:rPr>
+      </w:pPr>
+      <w:r>
+        <w:rPr>
+          <w:color w:val="538135" w:themeColor="accent6" w:themeShade="BF"/>
+        </w:rPr>
+        <w:t xml:space="preserve">    struct pbuf *p = NULL, *q;</w:t>
+      </w:r>
+    </w:p>
+    <w:p>
+      <w:pPr>
+        <w:pStyle w:val="Heading2"/>
+        <w:rPr>
+          <w:color w:val="538135" w:themeColor="accent6" w:themeShade="BF"/>
+        </w:rPr>
+      </w:pPr>
+      <w:r>
+        <w:rPr>
+          <w:color w:val="538135" w:themeColor="accent6" w:themeShade="BF"/>
+        </w:rPr>
+        <w:t xml:space="preserve">    uint16_t len = ENC28J60_GetReceivedPacketLength();</w:t>
+      </w:r>
+    </w:p>
+    <w:p>
+      <w:pPr>
+        <w:pStyle w:val="Heading2"/>
+        <w:rPr>
+          <w:color w:val="538135" w:themeColor="accent6" w:themeShade="BF"/>
+        </w:rPr>
+      </w:pPr>
+    </w:p>
+    <w:p>
+      <w:pPr>
+        <w:pStyle w:val="Heading2"/>
+        <w:rPr>
+          <w:color w:val="538135" w:themeColor="accent6" w:themeShade="BF"/>
+        </w:rPr>
+      </w:pPr>
+      <w:r>
+        <w:rPr>
+          <w:color w:val="538135" w:themeColor="accent6" w:themeShade="BF"/>
+        </w:rPr>
+        <w:t xml:space="preserve">    if (len == 0) return NULL;</w:t>
+      </w:r>
+    </w:p>
+    <w:p>
+      <w:pPr>
+        <w:pStyle w:val="Heading2"/>
+        <w:rPr>
+          <w:color w:val="538135" w:themeColor="accent6" w:themeShade="BF"/>
+        </w:rPr>
+      </w:pPr>
+    </w:p>
+    <w:p>
+      <w:pPr>
+        <w:pStyle w:val="Heading2"/>
+        <w:rPr>
+          <w:color w:val="538135" w:themeColor="accent6" w:themeShade="BF"/>
+        </w:rPr>
+      </w:pPr>
+      <w:r>
+        <w:rPr>
+          <w:color w:val="538135" w:themeColor="accent6" w:themeShade="BF"/>
+        </w:rPr>
+        <w:t xml:space="preserve">    // Allocate packet buffer memory inside lwIP heap</w:t>
+      </w:r>
+    </w:p>
+    <w:p>
+      <w:pPr>
+        <w:pStyle w:val="Heading2"/>
+        <w:rPr>
+          <w:color w:val="538135" w:themeColor="accent6" w:themeShade="BF"/>
+        </w:rPr>
+      </w:pPr>
+      <w:r>
+        <w:rPr>
+          <w:color w:val="538135" w:themeColor="accent6" w:themeShade="BF"/>
+        </w:rPr>
+        <w:t xml:space="preserve">    p = pbuf_alloc(PBUF_RAW, len, PBUF_POOL);</w:t>
+      </w:r>
+    </w:p>
+    <w:p>
+      <w:pPr>
+        <w:pStyle w:val="Heading2"/>
+        <w:rPr>
+          <w:color w:val="538135" w:themeColor="accent6" w:themeShade="BF"/>
+        </w:rPr>
+      </w:pPr>
+      <w:r>
+        <w:rPr>
+          <w:color w:val="538135" w:themeColor="accent6" w:themeShade="BF"/>
+        </w:rPr>
+        <w:t xml:space="preserve">    if (p != NULL) {</w:t>
+      </w:r>
+    </w:p>
+    <w:p>
+      <w:pPr>
+        <w:pStyle w:val="Heading2"/>
+        <w:rPr>
+          <w:color w:val="538135" w:themeColor="accent6" w:themeShade="BF"/>
+        </w:rPr>
+      </w:pPr>
+      <w:r>
+        <w:rPr>
+          <w:color w:val="538135" w:themeColor="accent6" w:themeShade="BF"/>
+        </w:rPr>
+        <w:t xml:space="preserve">        for (q = p; q != NULL; q = q-&gt;next) {</w:t>
+      </w:r>
+    </w:p>
+    <w:p>
+      <w:pPr>
+        <w:pStyle w:val="Heading2"/>
+        <w:rPr>
+          <w:color w:val="538135" w:themeColor="accent6" w:themeShade="BF"/>
+        </w:rPr>
+      </w:pPr>
+      <w:r>
+        <w:rPr>
+          <w:color w:val="538135" w:themeColor="accent6" w:themeShade="BF"/>
+        </w:rPr>
+        <w:t xml:space="preserve">            ENC28J60_ReadBuffer(q-&gt;payload, q-&gt;len); // Read chunk via SPI</w:t>
+      </w:r>
+    </w:p>
+    <w:p>
+      <w:pPr>
+        <w:pStyle w:val="Heading2"/>
+        <w:rPr>
+          <w:color w:val="538135" w:themeColor="accent6" w:themeShade="BF"/>
+        </w:rPr>
+      </w:pPr>
+      <w:r>
+        <w:rPr>
+          <w:color w:val="538135" w:themeColor="accent6" w:themeShade="BF"/>
+        </w:rPr>
+        <w:t xml:space="preserve">        }</w:t>
+      </w:r>
+    </w:p>
+    <w:p>
+      <w:pPr>
+        <w:pStyle w:val="Heading2"/>
+        <w:rPr>
+          <w:color w:val="538135" w:themeColor="accent6" w:themeShade="BF"/>
+        </w:rPr>
+      </w:pPr>
+      <w:r>
+        <w:rPr>
+          <w:color w:val="538135" w:themeColor="accent6" w:themeShade="BF"/>
+        </w:rPr>
+        <w:t xml:space="preserve">        ENC28J60_FreeRxBuffer(); // Clear ENC28J60 RX memory slot</w:t>
+      </w:r>
+    </w:p>
+    <w:p>
+      <w:pPr>
+        <w:pStyle w:val="Heading2"/>
+        <w:rPr>
+          <w:color w:val="538135" w:themeColor="accent6" w:themeShade="BF"/>
+        </w:rPr>
+      </w:pPr>
+      <w:r>
+        <w:rPr>
+          <w:color w:val="538135" w:themeColor="accent6" w:themeShade="BF"/>
+        </w:rPr>
+        <w:t xml:space="preserve">    }</w:t>
+      </w:r>
+    </w:p>
+    <w:p>
+      <w:pPr>
+        <w:pStyle w:val="Heading2"/>
+        <w:rPr>
+          <w:color w:val="538135" w:themeColor="accent6" w:themeShade="BF"/>
+        </w:rPr>
+      </w:pPr>
+      <w:r>
+        <w:rPr>
+          <w:color w:val="538135" w:themeColor="accent6" w:themeShade="BF"/>
+        </w:rPr>
+        <w:t xml:space="preserve">    return p;</w:t>
+      </w:r>
+    </w:p>
+    <w:p>
+      <w:pPr>
+        <w:pStyle w:val="Heading2"/>
+        <w:rPr>
+          <w:color w:val="538135" w:themeColor="accent6" w:themeShade="BF"/>
+        </w:rPr>
+      </w:pPr>
+      <w:r>
+        <w:rPr>
+          <w:color w:val="538135" w:themeColor="accent6" w:themeShade="BF"/>
+        </w:rPr>
+        <w:t>}</w:t>
+      </w:r>
+    </w:p>
+    <w:p>
+      <w:pPr>
+        <w:pStyle w:val="Heading2"/>
+        <w:rPr>
+          <w:color w:val="538135" w:themeColor="accent6" w:themeShade="BF"/>
+        </w:rPr>
+      </w:pPr>
+    </w:p>
+    <w:p>
+      <w:pPr>
+        <w:pStyle w:val="Heading2"/>
+        <w:rPr>
+          <w:color w:val="538135" w:themeColor="accent6" w:themeShade="BF"/>
+        </w:rPr>
+      </w:pPr>
+      <w:r>
+        <w:rPr>
+          <w:color w:val="538135" w:themeColor="accent6" w:themeShade="BF"/>
+        </w:rPr>
+        <w:t>/* Initialization callback handled by lwIP */</w:t>
+      </w:r>
+    </w:p>
+    <w:p>
+      <w:pPr>
+        <w:pStyle w:val="Heading2"/>
+        <w:rPr>
+          <w:color w:val="538135" w:themeColor="accent6" w:themeShade="BF"/>
+        </w:rPr>
+      </w:pPr>
+      <w:r>
+        <w:rPr>
+          <w:color w:val="538135" w:themeColor="accent6" w:themeShade="BF"/>
+        </w:rPr>
+        <w:t>err_t enc28j60_netif_init(struct netif *netif) {</w:t>
+      </w:r>
+    </w:p>
+    <w:p>
+      <w:pPr>
+        <w:pStyle w:val="Heading2"/>
+        <w:rPr>
+          <w:color w:val="538135" w:themeColor="accent6" w:themeShade="BF"/>
+        </w:rPr>
+      </w:pPr>
+      <w:r>
+        <w:rPr>
+          <w:color w:val="538135" w:themeColor="accent6" w:themeShade="BF"/>
+        </w:rPr>
+        <w:t xml:space="preserve">    netif-&gt;name[0] = 'e';</w:t>
+      </w:r>
+    </w:p>
+    <w:p>
+      <w:pPr>
+        <w:pStyle w:val="Heading2"/>
+        <w:rPr>
+          <w:color w:val="538135" w:themeColor="accent6" w:themeShade="BF"/>
+        </w:rPr>
+      </w:pPr>
+      <w:r>
+        <w:rPr>
+          <w:color w:val="538135" w:themeColor="accent6" w:themeShade="BF"/>
+        </w:rPr>
+        <w:lastRenderedPageBreak/>
+        <w:t xml:space="preserve">    netif-&gt;name[1] = 'n';</w:t>
+      </w:r>
+    </w:p>
+    <w:p>
+      <w:pPr>
+        <w:pStyle w:val="Heading2"/>
+        <w:rPr>
+          <w:color w:val="538135" w:themeColor="accent6" w:themeShade="BF"/>
+        </w:rPr>
+      </w:pPr>
+      <w:r>
+        <w:rPr>
+          <w:color w:val="538135" w:themeColor="accent6" w:themeShade="BF"/>
+        </w:rPr>
+        <w:t xml:space="preserve">    netif-&gt;output = etharp_output; // Assigns the ARP handler</w:t>
+      </w:r>
+    </w:p>
+    <w:p>
+      <w:pPr>
+        <w:pStyle w:val="Heading2"/>
+        <w:rPr>
+          <w:color w:val="538135" w:themeColor="accent6" w:themeShade="BF"/>
+        </w:rPr>
+      </w:pPr>
+      <w:r>
+        <w:rPr>
+          <w:color w:val="538135" w:themeColor="accent6" w:themeShade="BF"/>
+        </w:rPr>
+        <w:t xml:space="preserve">    netif-&gt;linkoutput = low_level_output;</w:t>
+      </w:r>
+    </w:p>
+    <w:p>
+      <w:pPr>
+        <w:pStyle w:val="Heading2"/>
+        <w:rPr>
+          <w:color w:val="538135" w:themeColor="accent6" w:themeShade="BF"/>
+        </w:rPr>
+      </w:pPr>
+    </w:p>
+    <w:p>
+      <w:pPr>
+        <w:pStyle w:val="Heading2"/>
+        <w:rPr>
+          <w:color w:val="538135" w:themeColor="accent6" w:themeShade="BF"/>
+        </w:rPr>
+      </w:pPr>
+      <w:r>
+        <w:rPr>
+          <w:color w:val="538135" w:themeColor="accent6" w:themeShade="BF"/>
+        </w:rPr>
+        <w:t xml:space="preserve">    low_level_init(netif);</w:t>
+      </w:r>
+    </w:p>
+    <w:p>
+      <w:pPr>
+        <w:pStyle w:val="Heading2"/>
+        <w:rPr>
+          <w:color w:val="538135" w:themeColor="accent6" w:themeShade="BF"/>
+        </w:rPr>
+      </w:pPr>
+      <w:r>
+        <w:rPr>
+          <w:color w:val="538135" w:themeColor="accent6" w:themeShade="BF"/>
+        </w:rPr>
+        <w:t xml:space="preserve">    return ERR_OK;</w:t>
+      </w:r>
+    </w:p>
+    <w:p>
+      <w:pPr>
+        <w:pStyle w:val="Heading2"/>
+        <w:rPr>
+          <w:color w:val="538135" w:themeColor="accent6" w:themeShade="BF"/>
+        </w:rPr>
+      </w:pPr>
+      <w:r>
+        <w:rPr>
+          <w:color w:val="538135" w:themeColor="accent6" w:themeShade="BF"/>
+        </w:rPr>
+        <w:t>}</w:t>
+      </w:r>
+    </w:p>
+    <w:p>
+      <w:pPr>
+        <w:pStyle w:val="Heading2"/>
+        <w:rPr>
+          <w:color w:val="538135" w:themeColor="accent6" w:themeShade="BF"/>
+        </w:rPr>
+      </w:pPr>
+    </w:p>
+    <w:p>
+      <w:pPr>
+        <w:pStyle w:val="Heading2"/>
+        <w:rPr>
+          <w:color w:val="538135" w:themeColor="accent6" w:themeShade="BF"/>
+        </w:rPr>
+      </w:pPr>
+      <w:r>
+        <w:rPr>
+          <w:color w:val="538135" w:themeColor="accent6" w:themeShade="BF"/>
+        </w:rPr>
+        <w:t>/* Poll this function inside your main application loop */</w:t>
+      </w:r>
+    </w:p>
+    <w:p>
+      <w:pPr>
+        <w:pStyle w:val="Heading2"/>
+        <w:rPr>
+          <w:color w:val="538135" w:themeColor="accent6" w:themeShade="BF"/>
+        </w:rPr>
+      </w:pPr>
+      <w:r>
+        <w:rPr>
+          <w:color w:val="538135" w:themeColor="accent6" w:themeShade="BF"/>
+        </w:rPr>
+        <w:t>void enc28j60_netif_poll(struct netif *netif) {</w:t>
+      </w:r>
+    </w:p>
+    <w:p>
+      <w:pPr>
+        <w:pStyle w:val="Heading2"/>
+        <w:rPr>
+          <w:color w:val="538135" w:themeColor="accent6" w:themeShade="BF"/>
+        </w:rPr>
+      </w:pPr>
+      <w:r>
+        <w:rPr>
+          <w:color w:val="538135" w:themeColor="accent6" w:themeShade="BF"/>
+        </w:rPr>
+        <w:t xml:space="preserve">    struct pbuf *p = low_level_input(netif);</w:t>
+      </w:r>
+    </w:p>
+    <w:p>
+      <w:pPr>
+        <w:pStyle w:val="Heading2"/>
+        <w:rPr>
+          <w:color w:val="538135" w:themeColor="accent6" w:themeShade="BF"/>
+        </w:rPr>
+      </w:pPr>
+      <w:r>
+        <w:rPr>
+          <w:color w:val="538135" w:themeColor="accent6" w:themeShade="BF"/>
+        </w:rPr>
+        <w:t xml:space="preserve">    if (p != NULL) {</w:t>
+      </w:r>
+    </w:p>
+    <w:p>
+      <w:pPr>
+        <w:pStyle w:val="Heading2"/>
+        <w:rPr>
+          <w:color w:val="538135" w:themeColor="accent6" w:themeShade="BF"/>
+        </w:rPr>
+      </w:pPr>
+      <w:r>
+        <w:rPr>
+          <w:color w:val="538135" w:themeColor="accent6" w:themeShade="BF"/>
+        </w:rPr>
+        <w:t xml:space="preserve">        if (netif-&gt;input(p, netif) != ERR_OK) {</w:t>
+      </w:r>
+    </w:p>
+    <w:p>
+      <w:pPr>
+        <w:pStyle w:val="Heading2"/>
+        <w:rPr>
+          <w:color w:val="538135" w:themeColor="accent6" w:themeShade="BF"/>
+        </w:rPr>
+      </w:pPr>
+      <w:r>
+        <w:rPr>
+          <w:color w:val="538135" w:themeColor="accent6" w:themeShade="BF"/>
+        </w:rPr>
+        <w:t xml:space="preserve">            pbuf_free(p);</w:t>
+      </w:r>
+    </w:p>
+    <w:p>
+      <w:pPr>
+        <w:pStyle w:val="Heading2"/>
+        <w:rPr>
+          <w:color w:val="538135" w:themeColor="accent6" w:themeShade="BF"/>
+        </w:rPr>
+      </w:pPr>
+      <w:r>
+        <w:rPr>
+          <w:color w:val="538135" w:themeColor="accent6" w:themeShade="BF"/>
+        </w:rPr>
+        <w:t xml:space="preserve">        }</w:t>
+      </w:r>
+    </w:p>
+    <w:p>
+      <w:pPr>
+        <w:pStyle w:val="Heading2"/>
+        <w:rPr>
+          <w:color w:val="538135" w:themeColor="accent6" w:themeShade="BF"/>
+        </w:rPr>
+      </w:pPr>
+      <w:r>
+        <w:rPr>
+          <w:color w:val="538135" w:themeColor="accent6" w:themeShade="BF"/>
+        </w:rPr>
+        <w:t xml:space="preserve">    }</w:t>
+      </w:r>
+    </w:p>
+    <w:p>
+      <w:pPr>
+        <w:pStyle w:val="Heading2"/>
+        <w:rPr>
+          <w:color w:val="538135" w:themeColor="accent6" w:themeShade="BF"/>
+        </w:rPr>
+      </w:pPr>
+      <w:r>
+        <w:rPr>
+          <w:color w:val="538135" w:themeColor="accent6" w:themeShade="BF"/>
+        </w:rPr>
+        <w:t>}</w:t>
+      </w:r>
+    </w:p>
+    <w:p>
+      <w:pPr>
+        <w:pStyle w:val="Heading2"/>
+        <w:rPr>
+          <w:color w:val="538135" w:themeColor="accent6" w:themeShade="BF"/>
+        </w:rPr>
+      </w:pPr>
+      <w:r>
+        <w:rPr>
+          <w:color w:val="538135" w:themeColor="accent6" w:themeShade="BF"/>
+        </w:rPr>
+        <w:t>Use code with caution.</w:t>
+      </w:r>
+    </w:p>
+    <w:p>
+      <w:pPr>
+        <w:pStyle w:val="Heading1"/>
+      </w:pPr>
+      <w:r>
+        <w:t>Step 3: Main Initialization and Runtime Loop (main.c)</w:t>
+      </w:r>
+    </w:p>
+    <w:p>
+      <w:pPr>
+        <w:pStyle w:val="Heading1"/>
+      </w:pPr>
+      <w:r>
+        <w:t>Initialize the stack, register your interface, configure static IP settings, and handle networking in the primary application loop. [</w:t>
+      </w:r>
+      <w:hyperlink r:id="rId14" w:history="1">
+        <w:r>
+          <w:rPr>
+            <w:rStyle w:val="Hyperlink"/>
+          </w:rPr>
+          <w:t>1</w:t>
+        </w:r>
+      </w:hyperlink>
+      <w:r>
+        <w:t>]</w:t>
+      </w:r>
+    </w:p>
+    <w:p>
+      <w:pPr>
+        <w:pStyle w:val="Heading2"/>
+        <w:rPr>
+          <w:color w:val="538135" w:themeColor="accent6" w:themeShade="BF"/>
+        </w:rPr>
+      </w:pPr>
+      <w:r>
+        <w:rPr>
+          <w:color w:val="538135" w:themeColor="accent6" w:themeShade="BF"/>
+        </w:rPr>
+        <w:t>c</w:t>
+      </w:r>
+    </w:p>
+    <w:p>
+      <w:pPr>
+        <w:pStyle w:val="Heading2"/>
+        <w:rPr>
+          <w:color w:val="538135" w:themeColor="accent6" w:themeShade="BF"/>
+        </w:rPr>
+      </w:pPr>
+      <w:r>
+        <w:rPr>
+          <w:color w:val="538135" w:themeColor="accent6" w:themeShade="BF"/>
+        </w:rPr>
+        <w:t>#include "lwip/init.h"</w:t>
+      </w:r>
+    </w:p>
+    <w:p>
+      <w:pPr>
+        <w:pStyle w:val="Heading2"/>
+        <w:rPr>
+          <w:color w:val="538135" w:themeColor="accent6" w:themeShade="BF"/>
+        </w:rPr>
+      </w:pPr>
+      <w:r>
+        <w:rPr>
+          <w:color w:val="538135" w:themeColor="accent6" w:themeShade="BF"/>
+        </w:rPr>
+        <w:t>#include "lwip/netif.h"</w:t>
+      </w:r>
+    </w:p>
+    <w:p>
+      <w:pPr>
+        <w:pStyle w:val="Heading2"/>
+        <w:rPr>
+          <w:color w:val="538135" w:themeColor="accent6" w:themeShade="BF"/>
+        </w:rPr>
+      </w:pPr>
+      <w:r>
+        <w:rPr>
+          <w:color w:val="538135" w:themeColor="accent6" w:themeShade="BF"/>
+        </w:rPr>
+        <w:t>#include "lwip/ip_addr.h"</w:t>
+      </w:r>
+    </w:p>
+    <w:p>
+      <w:pPr>
+        <w:pStyle w:val="Heading2"/>
+        <w:rPr>
+          <w:color w:val="538135" w:themeColor="accent6" w:themeShade="BF"/>
+        </w:rPr>
+      </w:pPr>
+      <w:r>
+        <w:rPr>
+          <w:color w:val="538135" w:themeColor="accent6" w:themeShade="BF"/>
+        </w:rPr>
+        <w:t>#include "lwip/timeouts.h"</w:t>
+      </w:r>
+    </w:p>
+    <w:p>
+      <w:pPr>
+        <w:pStyle w:val="Heading2"/>
+        <w:rPr>
+          <w:color w:val="538135" w:themeColor="accent6" w:themeShade="BF"/>
+        </w:rPr>
+      </w:pPr>
+      <w:r>
+        <w:rPr>
+          <w:color w:val="538135" w:themeColor="accent6" w:themeShade="BF"/>
+        </w:rPr>
+        <w:t>#include "ethernetif.h"</w:t>
+      </w:r>
+    </w:p>
+    <w:p>
+      <w:pPr>
+        <w:pStyle w:val="Heading2"/>
+        <w:rPr>
+          <w:color w:val="538135" w:themeColor="accent6" w:themeShade="BF"/>
+        </w:rPr>
+      </w:pPr>
+    </w:p>
+    <w:p>
+      <w:pPr>
+        <w:pStyle w:val="Heading2"/>
+        <w:rPr>
+          <w:color w:val="538135" w:themeColor="accent6" w:themeShade="BF"/>
+        </w:rPr>
+      </w:pPr>
+      <w:r>
+        <w:rPr>
+          <w:color w:val="538135" w:themeColor="accent6" w:themeShade="BF"/>
+        </w:rPr>
+        <w:t>struct netif enc28j60_netif;</w:t>
+      </w:r>
+    </w:p>
+    <w:p>
+      <w:pPr>
+        <w:pStyle w:val="Heading2"/>
+        <w:rPr>
+          <w:color w:val="538135" w:themeColor="accent6" w:themeShade="BF"/>
+        </w:rPr>
+      </w:pPr>
+    </w:p>
+    <w:p>
+      <w:pPr>
+        <w:pStyle w:val="Heading2"/>
+        <w:rPr>
+          <w:color w:val="538135" w:themeColor="accent6" w:themeShade="BF"/>
+        </w:rPr>
+      </w:pPr>
+      <w:r>
+        <w:rPr>
+          <w:color w:val="538135" w:themeColor="accent6" w:themeShade="BF"/>
+        </w:rPr>
+        <w:t>int main(void) {</w:t>
+      </w:r>
+    </w:p>
+    <w:p>
+      <w:pPr>
+        <w:pStyle w:val="Heading2"/>
+        <w:rPr>
+          <w:color w:val="538135" w:themeColor="accent6" w:themeShade="BF"/>
+        </w:rPr>
+      </w:pPr>
+      <w:r>
+        <w:rPr>
+          <w:color w:val="538135" w:themeColor="accent6" w:themeShade="BF"/>
+        </w:rPr>
+        <w:t xml:space="preserve">    // 1. Initialize MCU clock, GPIO, and SPI peripherals here </w:t>
+      </w:r>
+    </w:p>
+    <w:p>
+      <w:pPr>
+        <w:pStyle w:val="Heading2"/>
+        <w:rPr>
+          <w:color w:val="538135" w:themeColor="accent6" w:themeShade="BF"/>
+        </w:rPr>
+      </w:pPr>
+      <w:r>
+        <w:rPr>
+          <w:color w:val="538135" w:themeColor="accent6" w:themeShade="BF"/>
+        </w:rPr>
+        <w:t xml:space="preserve">    </w:t>
+      </w:r>
+    </w:p>
+    <w:p>
+      <w:pPr>
+        <w:pStyle w:val="Heading2"/>
+        <w:rPr>
+          <w:color w:val="538135" w:themeColor="accent6" w:themeShade="BF"/>
+        </w:rPr>
+      </w:pPr>
+      <w:r>
+        <w:rPr>
+          <w:color w:val="538135" w:themeColor="accent6" w:themeShade="BF"/>
+        </w:rPr>
+        <w:t xml:space="preserve">    // 2. Initialize lwIP Stack</w:t>
+      </w:r>
+    </w:p>
+    <w:p>
+      <w:pPr>
+        <w:pStyle w:val="Heading2"/>
+        <w:rPr>
+          <w:color w:val="538135" w:themeColor="accent6" w:themeShade="BF"/>
+        </w:rPr>
+      </w:pPr>
+      <w:r>
+        <w:rPr>
+          <w:color w:val="538135" w:themeColor="accent6" w:themeShade="BF"/>
+        </w:rPr>
+        <w:t xml:space="preserve">    lwip_init();</w:t>
+      </w:r>
+    </w:p>
+    <w:p>
+      <w:pPr>
+        <w:pStyle w:val="Heading2"/>
+        <w:rPr>
+          <w:color w:val="538135" w:themeColor="accent6" w:themeShade="BF"/>
+        </w:rPr>
+      </w:pPr>
+    </w:p>
+    <w:p>
+      <w:pPr>
+        <w:pStyle w:val="Heading2"/>
+        <w:rPr>
+          <w:color w:val="538135" w:themeColor="accent6" w:themeShade="BF"/>
+        </w:rPr>
+      </w:pPr>
+      <w:r>
+        <w:rPr>
+          <w:color w:val="538135" w:themeColor="accent6" w:themeShade="BF"/>
+        </w:rPr>
+        <w:t xml:space="preserve">    // 3. Define Network Configurations (Static IP setup)</w:t>
+      </w:r>
+    </w:p>
+    <w:p>
+      <w:pPr>
+        <w:pStyle w:val="Heading2"/>
+        <w:rPr>
+          <w:color w:val="538135" w:themeColor="accent6" w:themeShade="BF"/>
+        </w:rPr>
+      </w:pPr>
+      <w:r>
+        <w:rPr>
+          <w:color w:val="538135" w:themeColor="accent6" w:themeShade="BF"/>
+        </w:rPr>
+        <w:t xml:space="preserve">    ip4_addr_t ipaddr, netmask, gw;</w:t>
+      </w:r>
+    </w:p>
+    <w:p>
+      <w:pPr>
+        <w:pStyle w:val="Heading2"/>
+        <w:rPr>
+          <w:color w:val="538135" w:themeColor="accent6" w:themeShade="BF"/>
+        </w:rPr>
+      </w:pPr>
+      <w:r>
+        <w:rPr>
+          <w:color w:val="538135" w:themeColor="accent6" w:themeShade="BF"/>
+        </w:rPr>
+        <w:t xml:space="preserve">    IP4_ADDR(&amp;ipaddr, 192, 168, 1, 150);  // Static IP address</w:t>
+      </w:r>
+    </w:p>
+    <w:p>
+      <w:pPr>
+        <w:pStyle w:val="Heading2"/>
+        <w:rPr>
+          <w:color w:val="538135" w:themeColor="accent6" w:themeShade="BF"/>
+        </w:rPr>
+      </w:pPr>
+      <w:r>
+        <w:rPr>
+          <w:color w:val="538135" w:themeColor="accent6" w:themeShade="BF"/>
+        </w:rPr>
+        <w:t xml:space="preserve">    IP4_ADDR(&amp;netmask, 255, 255, 255, 0); // Netmask</w:t>
+      </w:r>
+    </w:p>
+    <w:p>
+      <w:pPr>
+        <w:pStyle w:val="Heading2"/>
+        <w:rPr>
+          <w:color w:val="538135" w:themeColor="accent6" w:themeShade="BF"/>
+        </w:rPr>
+      </w:pPr>
+      <w:r>
+        <w:rPr>
+          <w:color w:val="538135" w:themeColor="accent6" w:themeShade="BF"/>
+        </w:rPr>
+        <w:t xml:space="preserve">    IP4_ADDR(&amp;gw, 192, 168, 1, 1);        // Gateway IP</w:t>
+      </w:r>
+    </w:p>
+    <w:p>
+      <w:pPr>
+        <w:pStyle w:val="Heading2"/>
+        <w:rPr>
+          <w:color w:val="538135" w:themeColor="accent6" w:themeShade="BF"/>
+        </w:rPr>
+      </w:pPr>
+    </w:p>
+    <w:p>
+      <w:pPr>
+        <w:pStyle w:val="Heading2"/>
+        <w:rPr>
+          <w:color w:val="538135" w:themeColor="accent6" w:themeShade="BF"/>
+        </w:rPr>
+      </w:pPr>
+      <w:r>
+        <w:rPr>
+          <w:color w:val="538135" w:themeColor="accent6" w:themeShade="BF"/>
+        </w:rPr>
+        <w:t xml:space="preserve">    // 4. Bind ENC28J60 interface to lwIP</w:t>
+      </w:r>
+    </w:p>
+    <w:p>
+      <w:pPr>
+        <w:pStyle w:val="Heading2"/>
+        <w:rPr>
+          <w:color w:val="538135" w:themeColor="accent6" w:themeShade="BF"/>
+        </w:rPr>
+      </w:pPr>
+      <w:r>
+        <w:rPr>
+          <w:color w:val="538135" w:themeColor="accent6" w:themeShade="BF"/>
+        </w:rPr>
+        <w:t xml:space="preserve">    netif_add(&amp;enc28j60_netif, &amp;ipaddr, &amp;netmask, &amp;gw, NULL, &amp;enc28j60_netif_init, &amp;ethernet_input);</w:t>
+      </w:r>
+    </w:p>
+    <w:p>
+      <w:pPr>
+        <w:pStyle w:val="Heading2"/>
+        <w:rPr>
+          <w:color w:val="538135" w:themeColor="accent6" w:themeShade="BF"/>
+        </w:rPr>
+      </w:pPr>
+      <w:r>
+        <w:rPr>
+          <w:color w:val="538135" w:themeColor="accent6" w:themeShade="BF"/>
+        </w:rPr>
+        <w:t xml:space="preserve">    netif_set_default(&amp;enc28j60_netif);</w:t>
+      </w:r>
+    </w:p>
+    <w:p>
+      <w:pPr>
+        <w:pStyle w:val="Heading2"/>
+        <w:rPr>
+          <w:color w:val="538135" w:themeColor="accent6" w:themeShade="BF"/>
+        </w:rPr>
+      </w:pPr>
+      <w:r>
+        <w:rPr>
+          <w:color w:val="538135" w:themeColor="accent6" w:themeShade="BF"/>
+        </w:rPr>
+        <w:lastRenderedPageBreak/>
+        <w:t xml:space="preserve">    netif_set_up(&amp;enc28j60_netif);</w:t>
+      </w:r>
+    </w:p>
+    <w:p>
+      <w:pPr>
+        <w:pStyle w:val="Heading2"/>
+        <w:rPr>
+          <w:color w:val="538135" w:themeColor="accent6" w:themeShade="BF"/>
+        </w:rPr>
+      </w:pPr>
+    </w:p>
+    <w:p>
+      <w:pPr>
+        <w:pStyle w:val="Heading2"/>
+        <w:rPr>
+          <w:color w:val="538135" w:themeColor="accent6" w:themeShade="BF"/>
+        </w:rPr>
+      </w:pPr>
+      <w:r>
+        <w:rPr>
+          <w:color w:val="538135" w:themeColor="accent6" w:themeShade="BF"/>
+        </w:rPr>
+        <w:t xml:space="preserve">    // 5. Main Runtime Loop</w:t>
+      </w:r>
+    </w:p>
+    <w:p>
+      <w:pPr>
+        <w:pStyle w:val="Heading2"/>
+        <w:rPr>
+          <w:color w:val="538135" w:themeColor="accent6" w:themeShade="BF"/>
+        </w:rPr>
+      </w:pPr>
+      <w:r>
+        <w:rPr>
+          <w:color w:val="538135" w:themeColor="accent6" w:themeShade="BF"/>
+        </w:rPr>
+        <w:t xml:space="preserve">    while (1) {</w:t>
+      </w:r>
+    </w:p>
+    <w:p>
+      <w:pPr>
+        <w:pStyle w:val="Heading2"/>
+        <w:rPr>
+          <w:color w:val="538135" w:themeColor="accent6" w:themeShade="BF"/>
+        </w:rPr>
+      </w:pPr>
+      <w:r>
+        <w:rPr>
+          <w:color w:val="538135" w:themeColor="accent6" w:themeShade="BF"/>
+        </w:rPr>
+        <w:t xml:space="preserve">        // Look for inbound Ethernet data packets</w:t>
+      </w:r>
+    </w:p>
+    <w:p>
+      <w:pPr>
+        <w:pStyle w:val="Heading2"/>
+        <w:rPr>
+          <w:color w:val="538135" w:themeColor="accent6" w:themeShade="BF"/>
+        </w:rPr>
+      </w:pPr>
+      <w:r>
+        <w:rPr>
+          <w:color w:val="538135" w:themeColor="accent6" w:themeShade="BF"/>
+        </w:rPr>
+        <w:t xml:space="preserve">        enc28j60_netif_poll(&amp;enc28j60_netif);</w:t>
+      </w:r>
+    </w:p>
+    <w:p>
+      <w:pPr>
+        <w:pStyle w:val="Heading2"/>
+        <w:rPr>
+          <w:color w:val="538135" w:themeColor="accent6" w:themeShade="BF"/>
+        </w:rPr>
+      </w:pPr>
+      <w:r>
+        <w:rPr>
+          <w:color w:val="538135" w:themeColor="accent6" w:themeShade="BF"/>
+        </w:rPr>
+        <w:t xml:space="preserve">        </w:t>
+      </w:r>
+    </w:p>
+    <w:p>
+      <w:pPr>
+        <w:pStyle w:val="Heading2"/>
+        <w:rPr>
+          <w:color w:val="538135" w:themeColor="accent6" w:themeShade="BF"/>
+        </w:rPr>
+      </w:pPr>
+      <w:r>
+        <w:rPr>
+          <w:color w:val="538135" w:themeColor="accent6" w:themeShade="BF"/>
+        </w:rPr>
+        <w:t xml:space="preserve">        // Handle internal lwIP software timers (ARP, TCP retransmissions, etc.)</w:t>
+      </w:r>
+    </w:p>
+    <w:p>
+      <w:pPr>
+        <w:pStyle w:val="Heading2"/>
+        <w:rPr>
+          <w:color w:val="538135" w:themeColor="accent6" w:themeShade="BF"/>
+        </w:rPr>
+      </w:pPr>
+      <w:r>
+        <w:rPr>
+          <w:color w:val="538135" w:themeColor="accent6" w:themeShade="BF"/>
+        </w:rPr>
+        <w:t xml:space="preserve">        sys_check_timeouts();</w:t>
+      </w:r>
+    </w:p>
+    <w:p>
+      <w:pPr>
+        <w:pStyle w:val="Heading2"/>
+        <w:rPr>
+          <w:color w:val="538135" w:themeColor="accent6" w:themeShade="BF"/>
+        </w:rPr>
+      </w:pPr>
+      <w:r>
+        <w:rPr>
+          <w:color w:val="538135" w:themeColor="accent6" w:themeShade="BF"/>
+        </w:rPr>
+        <w:t xml:space="preserve">    }</w:t>
+      </w:r>
+    </w:p>
+    <w:p>
+      <w:pPr>
+        <w:pStyle w:val="Heading2"/>
+        <w:rPr>
+          <w:color w:val="538135" w:themeColor="accent6" w:themeShade="BF"/>
+        </w:rPr>
+      </w:pPr>
+      <w:r>
+        <w:rPr>
+          <w:color w:val="538135" w:themeColor="accent6" w:themeShade="BF"/>
+        </w:rPr>
+        <w:t>}</w:t>
+      </w:r>
+    </w:p>
+    <w:p>
+      <w:pPr>
+        <w:pStyle w:val="Heading2"/>
+        <w:rPr>
+          <w:color w:val="538135" w:themeColor="accent6" w:themeShade="BF"/>
+        </w:rPr>
+      </w:pPr>
+      <w:r>
+        <w:rPr>
+          <w:color w:val="538135" w:themeColor="accent6" w:themeShade="BF"/>
+        </w:rPr>
+        <w:t>Use code with caution.</w:t>
+      </w:r>
+    </w:p>
+    <w:p>
+      <w:pPr>
+        <w:pStyle w:val="Heading1"/>
+      </w:pPr>
+      <w:r>
+        <w:t>Key Considerations</w:t>
+      </w:r>
+    </w:p>
+    <w:p>
+      <w:pPr>
+        <w:pStyle w:val="Heading1"/>
+      </w:pPr>
+      <w:r>
+        <w:t>SPI Speed Constraints: The ENC28J60 clock maxes out at a 20 MHz SPI clock frequency. Ensure your microcontroller's SPI prescaler doesn't exceed this limit. [</w:t>
+      </w:r>
+      <w:hyperlink r:id="rId15" w:history="1">
+        <w:r>
+          <w:rPr>
+            <w:rStyle w:val="Hyperlink"/>
+          </w:rPr>
+          <w:t>1</w:t>
+        </w:r>
+      </w:hyperlink>
+      <w:r>
+        <w:t xml:space="preserve">, </w:t>
+      </w:r>
+      <w:hyperlink r:id="rId16" w:history="1">
+        <w:r>
+          <w:rPr>
+            <w:rStyle w:val="Hyperlink"/>
+          </w:rPr>
+          <w:t>2</w:t>
+        </w:r>
+      </w:hyperlink>
+      <w:r>
+        <w:t xml:space="preserve">, </w:t>
+      </w:r>
+      <w:hyperlink r:id="rId17" w:history="1">
+        <w:r>
+          <w:rPr>
+            <w:rStyle w:val="Hyperlink"/>
+          </w:rPr>
+          <w:t>3</w:t>
+        </w:r>
+      </w:hyperlink>
+      <w:r>
+        <w:t xml:space="preserve">, </w:t>
+      </w:r>
+      <w:hyperlink r:id="rId18" w:history="1">
+        <w:r>
+          <w:rPr>
+            <w:rStyle w:val="Hyperlink"/>
+          </w:rPr>
+          <w:t>4</w:t>
+        </w:r>
+      </w:hyperlink>
+      <w:r>
+        <w:t>]</w:t>
+      </w:r>
+    </w:p>
+    <w:p>
+      <w:pPr>
+        <w:pStyle w:val="Heading1"/>
+      </w:pPr>
+      <w:r>
+        <w:t>ERXWM Errata: The ENC28J60 contains silicon errata affecting packet reception filters. Verify that your low-level ENC28J60_Init code explicitly implements the official Microchip errata workarounds (such as enabling the EIE.PKTIE interrupt flag manually or applying custom receive buffer logic). [</w:t>
+      </w:r>
+      <w:hyperlink r:id="rId19" w:history="1">
+        <w:r>
+          <w:rPr>
+            <w:rStyle w:val="Hyperlink"/>
+          </w:rPr>
+          <w:t>1</w:t>
+        </w:r>
+      </w:hyperlink>
+      <w:r>
+        <w:t>]</w:t>
+      </w:r>
+    </w:p>
+    <w:p>
+      <w:pPr>
+        <w:pStyle w:val="Heading1"/>
+      </w:pPr>
+      <w:r>
+        <w:t xml:space="preserve">Pre-made Driver Examples: If you are using popular hardware platforms, you can reference the </w:t>
+      </w:r>
+      <w:hyperlink r:id="rId20" w:tgtFrame="_blank" w:history="1">
+        <w:r>
+          <w:rPr>
+            <w:rStyle w:val="Hyperlink"/>
+          </w:rPr>
+          <w:t>Juddling Raspberry Pi Pico lwIP Port</w:t>
+        </w:r>
+      </w:hyperlink>
+      <w:r>
+        <w:t xml:space="preserve"> or the matwey generic C port for full implementations of the low-level SPI register maps. [</w:t>
+      </w:r>
+      <w:hyperlink r:id="rId21" w:history="1">
+        <w:r>
+          <w:rPr>
+            <w:rStyle w:val="Hyperlink"/>
+          </w:rPr>
+          <w:t>1</w:t>
+        </w:r>
+      </w:hyperlink>
+      <w:r>
+        <w:t xml:space="preserve">, </w:t>
+      </w:r>
+      <w:hyperlink r:id="rId22" w:history="1">
+        <w:r>
+          <w:rPr>
+            <w:rStyle w:val="Hyperlink"/>
+          </w:rPr>
+          <w:t>2</w:t>
+        </w:r>
+      </w:hyperlink>
+      <w:r>
+        <w:t>]</w:t>
+      </w:r>
+    </w:p>
+    <w:p>
+      <w:pPr>
+        <w:pStyle w:val="Heading1"/>
+      </w:pPr>
+      <w:r>
+        <w:t>If you want help writing or adapting the SPI driver code, let me know:</w:t>
+      </w:r>
+    </w:p>
+    <w:p>
+      <w:pPr>
+        <w:pStyle w:val="Heading1"/>
+      </w:pPr>
+      <w:r>
+        <w:t>What microcontroller architecture you are using (e.g., STM32, AVR, RP2040)?</w:t>
+      </w:r>
+    </w:p>
+    <w:p>
+      <w:pPr>
+        <w:pStyle w:val="Heading1"/>
+      </w:pPr>
+      <w:r>
+        <w:t>Whether you want to use Hardware Interrupts (INT pin) or Polling</w:t>
+      </w:r>
+    </w:p>
+    <w:p>
+      <w:pPr>
+        <w:pStyle w:val="Heading1"/>
+      </w:pPr>
     </w:p>
     <w:sectPr>
       <w:pgSz w:w="11906" w:h="16838"/>
@@ -489,6 +2658,155 @@
     </w:lvl>
   </w:abstractNum>
   <w:abstractNum w:abstractNumId="1" w15:restartNumberingAfterBreak="0">
+    <w:nsid w:val="0F4166D7"/>
+    <w:multiLevelType w:val="multilevel"/>
+    <w:tmpl w:val="0E1A5A78"/>
+    <w:lvl w:ilvl="0">
+      <w:start w:val="1"/>
+      <w:numFmt w:val="bullet"/>
+      <w:lvlText w:val=""/>
+      <w:lvlJc w:val="left"/>
+      <w:pPr>
+        <w:tabs>
+          <w:tab w:val="num" w:pos="720"/>
+        </w:tabs>
+        <w:ind w:left="720" w:hanging="360"/>
+      </w:pPr>
+      <w:rPr>
+        <w:rFonts w:ascii="Symbol" w:hAnsi="Symbol" w:hint="default"/>
+        <w:sz w:val="20"/>
+      </w:rPr>
+    </w:lvl>
+    <w:lvl w:ilvl="1" w:tentative="1">
+      <w:start w:val="1"/>
+      <w:numFmt w:val="bullet"/>
+      <w:lvlText w:val="o"/>
+      <w:lvlJc w:val="left"/>
+      <w:pPr>
+        <w:tabs>
+          <w:tab w:val="num" w:pos="1440"/>
+        </w:tabs>
+        <w:ind w:left="1440" w:hanging="360"/>
+      </w:pPr>
+      <w:rPr>
+        <w:rFonts w:ascii="Courier New" w:hAnsi="Courier New" w:hint="default"/>
+        <w:sz w:val="20"/>
+      </w:rPr>
+    </w:lvl>
+    <w:lvl w:ilvl="2" w:tentative="1">
+      <w:start w:val="1"/>
+      <w:numFmt w:val="bullet"/>
+      <w:lvlText w:val=""/>
+      <w:lvlJc w:val="left"/>
+      <w:pPr>
+        <w:tabs>
+          <w:tab w:val="num" w:pos="2160"/>
+        </w:tabs>
+        <w:ind w:left="2160" w:hanging="360"/>
+      </w:pPr>
+      <w:rPr>
+        <w:rFonts w:ascii="Wingdings" w:hAnsi="Wingdings" w:hint="default"/>
+        <w:sz w:val="20"/>
+      </w:rPr>
+    </w:lvl>
+    <w:lvl w:ilvl="3" w:tentative="1">
+      <w:start w:val="1"/>
+      <w:numFmt w:val="bullet"/>
+      <w:lvlText w:val=""/>
+      <w:lvlJc w:val="left"/>
+      <w:pPr>
+        <w:tabs>
+          <w:tab w:val="num" w:pos="2880"/>
+        </w:tabs>
+        <w:ind w:left="2880" w:hanging="360"/>
+      </w:pPr>
+      <w:rPr>
+        <w:rFonts w:ascii="Wingdings" w:hAnsi="Wingdings" w:hint="default"/>
+        <w:sz w:val="20"/>
+      </w:rPr>
+    </w:lvl>
+    <w:lvl w:ilvl="4" w:tentative="1">
+      <w:start w:val="1"/>
+      <w:numFmt w:val="bullet"/>
+      <w:lvlText w:val=""/>
+      <w:lvlJc w:val="left"/>
+      <w:pPr>
+        <w:tabs>
+          <w:tab w:val="num" w:pos="3600"/>
+        </w:tabs>
+        <w:ind w:left="3600" w:hanging="360"/>
+      </w:pPr>
+      <w:rPr>
+        <w:rFonts w:ascii="Wingdings" w:hAnsi="Wingdings" w:hint="default"/>
+        <w:sz w:val="20"/>
+      </w:rPr>
+    </w:lvl>
+    <w:lvl w:ilvl="5" w:tentative="1">
+      <w:start w:val="1"/>
+      <w:numFmt w:val="bullet"/>
+      <w:lvlText w:val=""/>
+      <w:lvlJc w:val="left"/>
+      <w:pPr>
+        <w:tabs>
+          <w:tab w:val="num" w:pos="4320"/>
+        </w:tabs>
+        <w:ind w:left="4320" w:hanging="360"/>
+      </w:pPr>
+      <w:rPr>
+        <w:rFonts w:ascii="Wingdings" w:hAnsi="Wingdings" w:hint="default"/>
+        <w:sz w:val="20"/>
+      </w:rPr>
+    </w:lvl>
+    <w:lvl w:ilvl="6" w:tentative="1">
+      <w:start w:val="1"/>
+      <w:numFmt w:val="bullet"/>
+      <w:lvlText w:val=""/>
+      <w:lvlJc w:val="left"/>
+      <w:pPr>
+        <w:tabs>
+          <w:tab w:val="num" w:pos="5040"/>
+        </w:tabs>
+        <w:ind w:left="5040" w:hanging="360"/>
+      </w:pPr>
+      <w:rPr>
+        <w:rFonts w:ascii="Wingdings" w:hAnsi="Wingdings" w:hint="default"/>
+        <w:sz w:val="20"/>
+      </w:rPr>
+    </w:lvl>
+    <w:lvl w:ilvl="7" w:tentative="1">
+      <w:start w:val="1"/>
+      <w:numFmt w:val="bullet"/>
+      <w:lvlText w:val=""/>
+      <w:lvlJc w:val="left"/>
+      <w:pPr>
+        <w:tabs>
+          <w:tab w:val="num" w:pos="5760"/>
+        </w:tabs>
+        <w:ind w:left="5760" w:hanging="360"/>
+      </w:pPr>
+      <w:rPr>
+        <w:rFonts w:ascii="Wingdings" w:hAnsi="Wingdings" w:hint="default"/>
+        <w:sz w:val="20"/>
+      </w:rPr>
+    </w:lvl>
+    <w:lvl w:ilvl="8" w:tentative="1">
+      <w:start w:val="1"/>
+      <w:numFmt w:val="bullet"/>
+      <w:lvlText w:val=""/>
+      <w:lvlJc w:val="left"/>
+      <w:pPr>
+        <w:tabs>
+          <w:tab w:val="num" w:pos="6480"/>
+        </w:tabs>
+        <w:ind w:left="6480" w:hanging="360"/>
+      </w:pPr>
+      <w:rPr>
+        <w:rFonts w:ascii="Wingdings" w:hAnsi="Wingdings" w:hint="default"/>
+        <w:sz w:val="20"/>
+      </w:rPr>
+    </w:lvl>
+  </w:abstractNum>
+  <w:abstractNum w:abstractNumId="2" w15:restartNumberingAfterBreak="0">
     <w:nsid w:val="4E071653"/>
     <w:multiLevelType w:val="hybridMultilevel"/>
     <w:tmpl w:val="A3A43FE2"/>
@@ -579,7 +2897,7 @@
       </w:pPr>
     </w:lvl>
   </w:abstractNum>
-  <w:abstractNum w:abstractNumId="2" w15:restartNumberingAfterBreak="0">
+  <w:abstractNum w:abstractNumId="3" w15:restartNumberingAfterBreak="0">
     <w:nsid w:val="623013B6"/>
     <w:multiLevelType w:val="hybridMultilevel"/>
     <w:tmpl w:val="CEE4757E"/>
@@ -666,16 +2984,171 @@
       <w:pPr>
         <w:ind w:left="7200" w:hanging="180"/>
       </w:pPr>
+    </w:lvl>
+  </w:abstractNum>
+  <w:abstractNum w:abstractNumId="4" w15:restartNumberingAfterBreak="0">
+    <w:nsid w:val="7EA00F3E"/>
+    <w:multiLevelType w:val="multilevel"/>
+    <w:tmpl w:val="C39233BA"/>
+    <w:lvl w:ilvl="0">
+      <w:start w:val="1"/>
+      <w:numFmt w:val="bullet"/>
+      <w:lvlText w:val=""/>
+      <w:lvlJc w:val="left"/>
+      <w:pPr>
+        <w:tabs>
+          <w:tab w:val="num" w:pos="720"/>
+        </w:tabs>
+        <w:ind w:left="720" w:hanging="360"/>
+      </w:pPr>
+      <w:rPr>
+        <w:rFonts w:ascii="Symbol" w:hAnsi="Symbol" w:hint="default"/>
+        <w:sz w:val="20"/>
+      </w:rPr>
+    </w:lvl>
+    <w:lvl w:ilvl="1" w:tentative="1">
+      <w:start w:val="1"/>
+      <w:numFmt w:val="bullet"/>
+      <w:lvlText w:val="o"/>
+      <w:lvlJc w:val="left"/>
+      <w:pPr>
+        <w:tabs>
+          <w:tab w:val="num" w:pos="1440"/>
+        </w:tabs>
+        <w:ind w:left="1440" w:hanging="360"/>
+      </w:pPr>
+      <w:rPr>
+        <w:rFonts w:ascii="Courier New" w:hAnsi="Courier New" w:hint="default"/>
+        <w:sz w:val="20"/>
+      </w:rPr>
+    </w:lvl>
+    <w:lvl w:ilvl="2" w:tentative="1">
+      <w:start w:val="1"/>
+      <w:numFmt w:val="bullet"/>
+      <w:lvlText w:val=""/>
+      <w:lvlJc w:val="left"/>
+      <w:pPr>
+        <w:tabs>
+          <w:tab w:val="num" w:pos="2160"/>
+        </w:tabs>
+        <w:ind w:left="2160" w:hanging="360"/>
+      </w:pPr>
+      <w:rPr>
+        <w:rFonts w:ascii="Wingdings" w:hAnsi="Wingdings" w:hint="default"/>
+        <w:sz w:val="20"/>
+      </w:rPr>
+    </w:lvl>
+    <w:lvl w:ilvl="3" w:tentative="1">
+      <w:start w:val="1"/>
+      <w:numFmt w:val="bullet"/>
+      <w:lvlText w:val=""/>
+      <w:lvlJc w:val="left"/>
+      <w:pPr>
+        <w:tabs>
+          <w:tab w:val="num" w:pos="2880"/>
+        </w:tabs>
+        <w:ind w:left="2880" w:hanging="360"/>
+      </w:pPr>
+      <w:rPr>
+        <w:rFonts w:ascii="Wingdings" w:hAnsi="Wingdings" w:hint="default"/>
+        <w:sz w:val="20"/>
+      </w:rPr>
+    </w:lvl>
+    <w:lvl w:ilvl="4" w:tentative="1">
+      <w:start w:val="1"/>
+      <w:numFmt w:val="bullet"/>
+      <w:lvlText w:val=""/>
+      <w:lvlJc w:val="left"/>
+      <w:pPr>
+        <w:tabs>
+          <w:tab w:val="num" w:pos="3600"/>
+        </w:tabs>
+        <w:ind w:left="3600" w:hanging="360"/>
+      </w:pPr>
+      <w:rPr>
+        <w:rFonts w:ascii="Wingdings" w:hAnsi="Wingdings" w:hint="default"/>
+        <w:sz w:val="20"/>
+      </w:rPr>
+    </w:lvl>
+    <w:lvl w:ilvl="5" w:tentative="1">
+      <w:start w:val="1"/>
+      <w:numFmt w:val="bullet"/>
+      <w:lvlText w:val=""/>
+      <w:lvlJc w:val="left"/>
+      <w:pPr>
+        <w:tabs>
+          <w:tab w:val="num" w:pos="4320"/>
+        </w:tabs>
+        <w:ind w:left="4320" w:hanging="360"/>
+      </w:pPr>
+      <w:rPr>
+        <w:rFonts w:ascii="Wingdings" w:hAnsi="Wingdings" w:hint="default"/>
+        <w:sz w:val="20"/>
+      </w:rPr>
+    </w:lvl>
+    <w:lvl w:ilvl="6" w:tentative="1">
+      <w:start w:val="1"/>
+      <w:numFmt w:val="bullet"/>
+      <w:lvlText w:val=""/>
+      <w:lvlJc w:val="left"/>
+      <w:pPr>
+        <w:tabs>
+          <w:tab w:val="num" w:pos="5040"/>
+        </w:tabs>
+        <w:ind w:left="5040" w:hanging="360"/>
+      </w:pPr>
+      <w:rPr>
+        <w:rFonts w:ascii="Wingdings" w:hAnsi="Wingdings" w:hint="default"/>
+        <w:sz w:val="20"/>
+      </w:rPr>
+    </w:lvl>
+    <w:lvl w:ilvl="7" w:tentative="1">
+      <w:start w:val="1"/>
+      <w:numFmt w:val="bullet"/>
+      <w:lvlText w:val=""/>
+      <w:lvlJc w:val="left"/>
+      <w:pPr>
+        <w:tabs>
+          <w:tab w:val="num" w:pos="5760"/>
+        </w:tabs>
+        <w:ind w:left="5760" w:hanging="360"/>
+      </w:pPr>
+      <w:rPr>
+        <w:rFonts w:ascii="Wingdings" w:hAnsi="Wingdings" w:hint="default"/>
+        <w:sz w:val="20"/>
+      </w:rPr>
+    </w:lvl>
+    <w:lvl w:ilvl="8" w:tentative="1">
+      <w:start w:val="1"/>
+      <w:numFmt w:val="bullet"/>
+      <w:lvlText w:val=""/>
+      <w:lvlJc w:val="left"/>
+      <w:pPr>
+        <w:tabs>
+          <w:tab w:val="num" w:pos="6480"/>
+        </w:tabs>
+        <w:ind w:left="6480" w:hanging="360"/>
+      </w:pPr>
+      <w:rPr>
+        <w:rFonts w:ascii="Wingdings" w:hAnsi="Wingdings" w:hint="default"/>
+        <w:sz w:val="20"/>
+      </w:rPr>
     </w:lvl>
   </w:abstractNum>
   <w:num w:numId="1" w16cid:durableId="1896895946">
     <w:abstractNumId w:val="0"/>
   </w:num>
   <w:num w:numId="2" w16cid:durableId="728070831">
+    <w:abstractNumId w:val="3"/>
+  </w:num>
+  <w:num w:numId="3" w16cid:durableId="1802963803">
     <w:abstractNumId w:val="2"/>
   </w:num>
-  <w:num w:numId="3" w16cid:durableId="1802963803">
+  <w:num w:numId="4" w16cid:durableId="606695220">
     <w:abstractNumId w:val="1"/>
+  </w:num>
+  <w:num w:numId="5" w16cid:durableId="2054578542">
+    <w:abstractNumId w:val="4"/>
   </w:num>
 </w:numbering>
 </file>
@@ -1095,6 +3568,50 @@
       <w:szCs w:val="32"/>
     </w:rPr>
   </w:style>
+  <w:style w:type="paragraph" w:styleId="Heading1">
+    <w:name w:val="heading 1"/>
+    <w:basedOn w:val="Normal"/>
+    <w:next w:val="Normal"/>
+    <w:link w:val="Heading1Char"/>
+    <w:uiPriority w:val="9"/>
+    <w:qFormat/>
+    <w:rsid w:val="002A281C"/>
+    <w:pPr>
+      <w:numPr>
+        <w:numId w:val="0"/>
+      </w:numPr>
+      <w:ind w:left="360"/>
+      <w:outlineLvl w:val="0"/>
+    </w:pPr>
+    <w:rPr>
+      <w:b w:val="0"/>
+      <w:bCs w:val="0"/>
+      <w:color w:val="auto"/>
+      <w:sz w:val="28"/>
+      <w:szCs w:val="28"/>
+    </w:rPr>
+  </w:style>
+  <w:style w:type="paragraph" w:styleId="Heading2">
+    <w:name w:val="heading 2"/>
+    <w:basedOn w:val="Heading1"/>
+    <w:next w:val="Normal"/>
+    <w:link w:val="Heading2Char"/>
+    <w:uiPriority w:val="9"/>
+    <w:unhideWhenUsed/>
+    <w:qFormat/>
+    <w:rsid w:val="00EA4D5C"/>
+    <w:pPr>
+      <w:jc w:val="both"/>
+      <w:outlineLvl w:val="1"/>
+    </w:pPr>
+    <w:rPr>
+      <w:i/>
+      <w:iCs/>
+      <w:color w:val="538135" w:themeColor="accent6" w:themeShade="BF"/>
+      <w:sz w:val="22"/>
+      <w:szCs w:val="22"/>
+    </w:rPr>
+  </w:style>
   <w:style w:type="character" w:default="1" w:styleId="DefaultParagraphFont">
     <w:name w:val="Default Paragraph Font"/>
     <w:uiPriority w:val="1"/>
@@ -1158,6 +3675,64 @@
     <w:rsid w:val="006542A7"/>
     <w:rPr>
       <w:color w:val="666666"/>
+    </w:rPr>
+  </w:style>
+  <w:style w:type="character" w:styleId="SubtleEmphasis">
+    <w:name w:val="Subtle Emphasis"/>
+    <w:basedOn w:val="DefaultParagraphFont"/>
+    <w:uiPriority w:val="19"/>
+    <w:qFormat/>
+    <w:rsid w:val="002D4B48"/>
+    <w:rPr>
+      <w:i/>
+      <w:iCs/>
+      <w:color w:val="404040" w:themeColor="text1" w:themeTint="BF"/>
+    </w:rPr>
+  </w:style>
+  <w:style w:type="character" w:customStyle="1" w:styleId="Heading1Char">
+    <w:name w:val="Heading 1 Char"/>
+    <w:basedOn w:val="DefaultParagraphFont"/>
+    <w:link w:val="Heading1"/>
+    <w:uiPriority w:val="9"/>
+    <w:rsid w:val="002A281C"/>
+    <w:rPr>
+      <w:sz w:val="28"/>
+      <w:szCs w:val="28"/>
+    </w:rPr>
+  </w:style>
+  <w:style w:type="character" w:styleId="Hyperlink">
+    <w:name w:val="Hyperlink"/>
+    <w:basedOn w:val="DefaultParagraphFont"/>
+    <w:uiPriority w:val="99"/>
+    <w:unhideWhenUsed/>
+    <w:rsid w:val="002A281C"/>
+    <w:rPr>
+      <w:color w:val="0563C1" w:themeColor="hyperlink"/>
+      <w:u w:val="single"/>
+    </w:rPr>
+  </w:style>
+  <w:style w:type="character" w:styleId="UnresolvedMention">
+    <w:name w:val="Unresolved Mention"/>
+    <w:basedOn w:val="DefaultParagraphFont"/>
+    <w:uiPriority w:val="99"/>
+    <w:semiHidden/>
+    <w:unhideWhenUsed/>
+    <w:rsid w:val="002A281C"/>
+    <w:rPr>
+      <w:color w:val="605E5C"/>
+      <w:shd w:val="clear" w:color="auto" w:fill="E1DFDD"/>
+    </w:rPr>
+  </w:style>
+  <w:style w:type="character" w:customStyle="1" w:styleId="Heading2Char">
+    <w:name w:val="Heading 2 Char"/>
+    <w:basedOn w:val="DefaultParagraphFont"/>
+    <w:link w:val="Heading2"/>
+    <w:uiPriority w:val="9"/>
+    <w:rsid w:val="00EA4D5C"/>
+    <w:rPr>
+      <w:i/>
+      <w:iCs/>
+      <w:color w:val="538135" w:themeColor="accent6" w:themeShade="BF"/>
     </w:rPr>
   </w:style>
 </w:styles>

</xml_diff>

<commit_message>
- ENC28J60 SPI command related bug fixes. - Added synch time between SPI CS sequence. - Taken and configure code example related to "https://github.com/farhadkhodaei/smart-home-with-stm32f030f4p6-enc28j60.git" for low level TCP/IP stack. - removed line "ENC28J60_SetBitField(ECON1, ECON1_TXRST | ECON1_RXRST): which causes "ECON1_RXEN" bit to set. - Finally the receive logic works correctly but the reference code not able to sample data.
</commit_message>
<xml_diff>
--- a/Ethernet_Port/Plan.docx
+++ b/Ethernet_Port/Plan.docx
@@ -632,264 +632,156 @@
     <w:p>
       <w:pPr>
         <w:pStyle w:val="Heading2"/>
+      </w:pPr>
+      <w:r>
+        <w:t>c</w:t>
+      </w:r>
+    </w:p>
+    <w:p>
+      <w:pPr>
+        <w:pStyle w:val="Heading2"/>
+      </w:pPr>
+      <w:r>
+        <w:t>#ifndef __LWIPOPTS_H__</w:t>
+      </w:r>
+    </w:p>
+    <w:p>
+      <w:pPr>
+        <w:pStyle w:val="Heading2"/>
+      </w:pPr>
+      <w:r>
+        <w:t>#define __LWIPOPTS_H__</w:t>
+      </w:r>
+    </w:p>
+    <w:p>
+      <w:pPr>
+        <w:pStyle w:val="Heading2"/>
+      </w:pPr>
+    </w:p>
+    <w:p>
+      <w:pPr>
+        <w:pStyle w:val="Heading2"/>
+      </w:pPr>
+      <w:r>
+        <w:t>#define NO_SYS                  1  // 1 = Bare-metal (No OS / No FreeRTOS)</w:t>
+      </w:r>
+    </w:p>
+    <w:p>
+      <w:pPr>
+        <w:pStyle w:val="Heading2"/>
+      </w:pPr>
+      <w:r>
+        <w:t>#define SYS_LIGHTWEIGHT_PROT    0</w:t>
+      </w:r>
+    </w:p>
+    <w:p>
+      <w:pPr>
+        <w:pStyle w:val="Heading2"/>
+      </w:pPr>
+      <w:r>
+        <w:t>#define MEM_ALIGNMENT           4</w:t>
+      </w:r>
+    </w:p>
+    <w:p>
+      <w:pPr>
+        <w:pStyle w:val="Heading2"/>
+      </w:pPr>
+    </w:p>
+    <w:p>
+      <w:pPr>
+        <w:pStyle w:val="Heading2"/>
+      </w:pPr>
+      <w:r>
+        <w:t>/* Memory optimizations for smaller microcontrollers */</w:t>
+      </w:r>
+    </w:p>
+    <w:p>
+      <w:pPr>
+        <w:pStyle w:val="Heading2"/>
+      </w:pPr>
+      <w:r>
+        <w:t>#define MEM_SIZE                2048</w:t>
+      </w:r>
+    </w:p>
+    <w:p>
+      <w:pPr>
+        <w:pStyle w:val="Heading2"/>
+      </w:pPr>
+      <w:r>
+        <w:t>#define MEMP_NUM_PBUF           8</w:t>
+      </w:r>
+    </w:p>
+    <w:p>
+      <w:pPr>
+        <w:pStyle w:val="Heading2"/>
+      </w:pPr>
+      <w:r>
+        <w:t>#define MEMP_NUM_TCP_PCB        4</w:t>
+      </w:r>
+    </w:p>
+    <w:p>
+      <w:pPr>
+        <w:pStyle w:val="Heading2"/>
+      </w:pPr>
+      <w:r>
+        <w:t>#define MEMP_NUM_UDP_PCB        4</w:t>
+      </w:r>
+    </w:p>
+    <w:p>
+      <w:pPr>
+        <w:pStyle w:val="Heading2"/>
+      </w:pPr>
+    </w:p>
+    <w:p>
+      <w:pPr>
+        <w:pStyle w:val="Heading2"/>
+      </w:pPr>
+      <w:r>
+        <w:t>/* Enable UDP and TCP */</w:t>
+      </w:r>
+    </w:p>
+    <w:p>
+      <w:pPr>
+        <w:pStyle w:val="Heading2"/>
+      </w:pPr>
+      <w:r>
+        <w:t>#define LWIP_UDP                1</w:t>
+      </w:r>
+    </w:p>
+    <w:p>
+      <w:pPr>
+        <w:pStyle w:val="Heading2"/>
+      </w:pPr>
+      <w:r>
+        <w:t>#define LWIP_TCP                1</w:t>
+      </w:r>
+    </w:p>
+    <w:p>
+      <w:pPr>
+        <w:pStyle w:val="Heading2"/>
+      </w:pPr>
+      <w:r>
+        <w:t>#define LWIP_DHCP               0  // 0 = Static IP, 1 = DHCP</w:t>
+      </w:r>
+    </w:p>
+    <w:p>
+      <w:pPr>
+        <w:pStyle w:val="Heading2"/>
+      </w:pPr>
+    </w:p>
+    <w:p>
+      <w:pPr>
+        <w:pStyle w:val="Heading2"/>
+      </w:pPr>
+      <w:r>
+        <w:t>#endif</w:t>
+      </w:r>
+    </w:p>
+    <w:p>
+      <w:pPr>
+        <w:pStyle w:val="Heading2"/>
         <w:rPr>
-          <w:color w:val="538135" w:themeColor="accent6" w:themeShade="BF"/>
-        </w:rPr>
-      </w:pPr>
-      <w:r>
-        <w:rPr>
-          <w:color w:val="538135" w:themeColor="accent6" w:themeShade="BF"/>
-        </w:rPr>
-        <w:t>c</w:t>
-      </w:r>
-    </w:p>
-    <w:p>
-      <w:pPr>
-        <w:pStyle w:val="Heading2"/>
-        <w:rPr>
-          <w:color w:val="538135" w:themeColor="accent6" w:themeShade="BF"/>
-        </w:rPr>
-      </w:pPr>
-      <w:r>
-        <w:rPr>
-          <w:color w:val="538135" w:themeColor="accent6" w:themeShade="BF"/>
-        </w:rPr>
-        <w:t>#ifndef __LWIPOPTS_H__</w:t>
-      </w:r>
-    </w:p>
-    <w:p>
-      <w:pPr>
-        <w:pStyle w:val="Heading2"/>
-        <w:rPr>
-          <w:color w:val="538135" w:themeColor="accent6" w:themeShade="BF"/>
-        </w:rPr>
-      </w:pPr>
-      <w:r>
-        <w:rPr>
-          <w:color w:val="538135" w:themeColor="accent6" w:themeShade="BF"/>
-        </w:rPr>
-        <w:t>#define __LWIPOPTS_H__</w:t>
-      </w:r>
-    </w:p>
-    <w:p>
-      <w:pPr>
-        <w:pStyle w:val="Heading2"/>
-        <w:rPr>
-          <w:color w:val="538135" w:themeColor="accent6" w:themeShade="BF"/>
-        </w:rPr>
-      </w:pPr>
-    </w:p>
-    <w:p>
-      <w:pPr>
-        <w:pStyle w:val="Heading2"/>
-        <w:rPr>
-          <w:color w:val="538135" w:themeColor="accent6" w:themeShade="BF"/>
-        </w:rPr>
-      </w:pPr>
-      <w:r>
-        <w:rPr>
-          <w:color w:val="538135" w:themeColor="accent6" w:themeShade="BF"/>
-        </w:rPr>
-        <w:t>#define NO_SYS                  1  // 1 = Bare-metal (No OS / No FreeRTOS)</w:t>
-      </w:r>
-    </w:p>
-    <w:p>
-      <w:pPr>
-        <w:pStyle w:val="Heading2"/>
-        <w:rPr>
-          <w:color w:val="538135" w:themeColor="accent6" w:themeShade="BF"/>
-        </w:rPr>
-      </w:pPr>
-      <w:r>
-        <w:rPr>
-          <w:color w:val="538135" w:themeColor="accent6" w:themeShade="BF"/>
-        </w:rPr>
-        <w:t>#define SYS_LIGHTWEIGHT_PROT    0</w:t>
-      </w:r>
-    </w:p>
-    <w:p>
-      <w:pPr>
-        <w:pStyle w:val="Heading2"/>
-        <w:rPr>
-          <w:color w:val="538135" w:themeColor="accent6" w:themeShade="BF"/>
-        </w:rPr>
-      </w:pPr>
-      <w:r>
-        <w:rPr>
-          <w:color w:val="538135" w:themeColor="accent6" w:themeShade="BF"/>
-        </w:rPr>
-        <w:t>#define MEM_ALIGNMENT           4</w:t>
-      </w:r>
-    </w:p>
-    <w:p>
-      <w:pPr>
-        <w:pStyle w:val="Heading2"/>
-        <w:rPr>
-          <w:color w:val="538135" w:themeColor="accent6" w:themeShade="BF"/>
-        </w:rPr>
-      </w:pPr>
-    </w:p>
-    <w:p>
-      <w:pPr>
-        <w:pStyle w:val="Heading2"/>
-        <w:rPr>
-          <w:color w:val="538135" w:themeColor="accent6" w:themeShade="BF"/>
-        </w:rPr>
-      </w:pPr>
-      <w:r>
-        <w:rPr>
-          <w:color w:val="538135" w:themeColor="accent6" w:themeShade="BF"/>
-        </w:rPr>
-        <w:t>/* Memory optimizations for smaller microcontrollers */</w:t>
-      </w:r>
-    </w:p>
-    <w:p>
-      <w:pPr>
-        <w:pStyle w:val="Heading2"/>
-        <w:rPr>
-          <w:color w:val="538135" w:themeColor="accent6" w:themeShade="BF"/>
-        </w:rPr>
-      </w:pPr>
-      <w:r>
-        <w:rPr>
-          <w:color w:val="538135" w:themeColor="accent6" w:themeShade="BF"/>
-        </w:rPr>
-        <w:t>#define MEM_SIZE                2048</w:t>
-      </w:r>
-    </w:p>
-    <w:p>
-      <w:pPr>
-        <w:pStyle w:val="Heading2"/>
-        <w:rPr>
-          <w:color w:val="538135" w:themeColor="accent6" w:themeShade="BF"/>
-        </w:rPr>
-      </w:pPr>
-      <w:r>
-        <w:rPr>
-          <w:color w:val="538135" w:themeColor="accent6" w:themeShade="BF"/>
-        </w:rPr>
-        <w:t>#define MEMP_NUM_PBUF           8</w:t>
-      </w:r>
-    </w:p>
-    <w:p>
-      <w:pPr>
-        <w:pStyle w:val="Heading2"/>
-        <w:rPr>
-          <w:color w:val="538135" w:themeColor="accent6" w:themeShade="BF"/>
-        </w:rPr>
-      </w:pPr>
-      <w:r>
-        <w:rPr>
-          <w:color w:val="538135" w:themeColor="accent6" w:themeShade="BF"/>
-        </w:rPr>
-        <w:t>#define MEMP_NUM_TCP_PCB        4</w:t>
-      </w:r>
-    </w:p>
-    <w:p>
-      <w:pPr>
-        <w:pStyle w:val="Heading2"/>
-        <w:rPr>
-          <w:color w:val="538135" w:themeColor="accent6" w:themeShade="BF"/>
-        </w:rPr>
-      </w:pPr>
-      <w:r>
-        <w:rPr>
-          <w:color w:val="538135" w:themeColor="accent6" w:themeShade="BF"/>
-        </w:rPr>
-        <w:t>#define MEMP_NUM_UDP_PCB        4</w:t>
-      </w:r>
-    </w:p>
-    <w:p>
-      <w:pPr>
-        <w:pStyle w:val="Heading2"/>
-        <w:rPr>
-          <w:color w:val="538135" w:themeColor="accent6" w:themeShade="BF"/>
-        </w:rPr>
-      </w:pPr>
-    </w:p>
-    <w:p>
-      <w:pPr>
-        <w:pStyle w:val="Heading2"/>
-        <w:rPr>
-          <w:color w:val="538135" w:themeColor="accent6" w:themeShade="BF"/>
-        </w:rPr>
-      </w:pPr>
-      <w:r>
-        <w:rPr>
-          <w:color w:val="538135" w:themeColor="accent6" w:themeShade="BF"/>
-        </w:rPr>
-        <w:t>/* Enable UDP and TCP */</w:t>
-      </w:r>
-    </w:p>
-    <w:p>
-      <w:pPr>
-        <w:pStyle w:val="Heading2"/>
-        <w:rPr>
-          <w:color w:val="538135" w:themeColor="accent6" w:themeShade="BF"/>
-        </w:rPr>
-      </w:pPr>
-      <w:r>
-        <w:rPr>
-          <w:color w:val="538135" w:themeColor="accent6" w:themeShade="BF"/>
-        </w:rPr>
-        <w:t>#define LWIP_UDP                1</w:t>
-      </w:r>
-    </w:p>
-    <w:p>
-      <w:pPr>
-        <w:pStyle w:val="Heading2"/>
-        <w:rPr>
-          <w:color w:val="538135" w:themeColor="accent6" w:themeShade="BF"/>
-        </w:rPr>
-      </w:pPr>
-      <w:r>
-        <w:rPr>
-          <w:color w:val="538135" w:themeColor="accent6" w:themeShade="BF"/>
-        </w:rPr>
-        <w:t>#define LWIP_TCP                1</w:t>
-      </w:r>
-    </w:p>
-    <w:p>
-      <w:pPr>
-        <w:pStyle w:val="Heading2"/>
-        <w:rPr>
-          <w:color w:val="538135" w:themeColor="accent6" w:themeShade="BF"/>
-        </w:rPr>
-      </w:pPr>
-      <w:r>
-        <w:rPr>
-          <w:color w:val="538135" w:themeColor="accent6" w:themeShade="BF"/>
-        </w:rPr>
-        <w:t>#define LWIP_DHCP               0  // 0 = Static IP, 1 = DHCP</w:t>
-      </w:r>
-    </w:p>
-    <w:p>
-      <w:pPr>
-        <w:pStyle w:val="Heading2"/>
-        <w:rPr>
-          <w:color w:val="538135" w:themeColor="accent6" w:themeShade="BF"/>
-        </w:rPr>
-      </w:pPr>
-    </w:p>
-    <w:p>
-      <w:pPr>
-        <w:pStyle w:val="Heading2"/>
-        <w:rPr>
-          <w:color w:val="538135" w:themeColor="accent6" w:themeShade="BF"/>
-        </w:rPr>
-      </w:pPr>
-      <w:r>
-        <w:rPr>
-          <w:color w:val="538135" w:themeColor="accent6" w:themeShade="BF"/>
-        </w:rPr>
-        <w:t>#endif</w:t>
-      </w:r>
-    </w:p>
-    <w:p>
-      <w:pPr>
-        <w:pStyle w:val="Heading2"/>
-        <w:rPr>
-          <w:color w:val="auto"/>
+          <w:color w:val="000000"/>
           <w14:textFill>
             <w14:solidFill>
               <w14:srgbClr w14:val="000000">
@@ -900,9 +792,6 @@
         </w:rPr>
       </w:pPr>
       <w:r>
-        <w:rPr>
-          <w:color w:val="538135" w:themeColor="accent6" w:themeShade="BF"/>
-        </w:rPr>
         <w:t>Use code with caution.</w:t>
       </w:r>
     </w:p>
@@ -936,972 +825,561 @@
     <w:p>
       <w:pPr>
         <w:pStyle w:val="Heading2"/>
-        <w:rPr>
-          <w:color w:val="538135" w:themeColor="accent6" w:themeShade="BF"/>
-        </w:rPr>
-      </w:pPr>
-      <w:r>
-        <w:rPr>
-          <w:color w:val="538135" w:themeColor="accent6" w:themeShade="BF"/>
-        </w:rPr>
+      </w:pPr>
+      <w:r>
         <w:t>c</w:t>
       </w:r>
     </w:p>
     <w:p>
       <w:pPr>
         <w:pStyle w:val="Heading2"/>
-        <w:rPr>
-          <w:color w:val="538135" w:themeColor="accent6" w:themeShade="BF"/>
-        </w:rPr>
-      </w:pPr>
-      <w:r>
-        <w:rPr>
-          <w:color w:val="538135" w:themeColor="accent6" w:themeShade="BF"/>
-        </w:rPr>
+      </w:pPr>
+      <w:r>
         <w:t>#include "lwip/netif.h"</w:t>
       </w:r>
     </w:p>
     <w:p>
       <w:pPr>
         <w:pStyle w:val="Heading2"/>
-        <w:rPr>
-          <w:color w:val="538135" w:themeColor="accent6" w:themeShade="BF"/>
-        </w:rPr>
-      </w:pPr>
-      <w:r>
-        <w:rPr>
-          <w:color w:val="538135" w:themeColor="accent6" w:themeShade="BF"/>
-        </w:rPr>
+      </w:pPr>
+      <w:r>
         <w:t>#include "lwip/pbuf.h"</w:t>
       </w:r>
     </w:p>
     <w:p>
       <w:pPr>
         <w:pStyle w:val="Heading2"/>
-        <w:rPr>
-          <w:color w:val="538135" w:themeColor="accent6" w:themeShade="BF"/>
-        </w:rPr>
-      </w:pPr>
-      <w:r>
-        <w:rPr>
-          <w:color w:val="538135" w:themeColor="accent6" w:themeShade="BF"/>
-        </w:rPr>
+      </w:pPr>
+      <w:r>
         <w:t>#include "netif/etharp.h"</w:t>
       </w:r>
     </w:p>
     <w:p>
       <w:pPr>
         <w:pStyle w:val="Heading2"/>
-        <w:rPr>
-          <w:color w:val="538135" w:themeColor="accent6" w:themeShade="BF"/>
-        </w:rPr>
-      </w:pPr>
-      <w:r>
-        <w:rPr>
-          <w:color w:val="538135" w:themeColor="accent6" w:themeShade="BF"/>
-        </w:rPr>
+      </w:pPr>
+      <w:r>
         <w:t>#include "enc28j60_driver.h" // Replace with your chip-specific SPI driver</w:t>
       </w:r>
     </w:p>
     <w:p>
       <w:pPr>
         <w:pStyle w:val="Heading2"/>
-        <w:rPr>
-          <w:color w:val="538135" w:themeColor="accent6" w:themeShade="BF"/>
-        </w:rPr>
-      </w:pPr>
-    </w:p>
-    <w:p>
-      <w:pPr>
-        <w:pStyle w:val="Heading2"/>
-        <w:rPr>
-          <w:color w:val="538135" w:themeColor="accent6" w:themeShade="BF"/>
-        </w:rPr>
-      </w:pPr>
-      <w:r>
-        <w:rPr>
-          <w:color w:val="538135" w:themeColor="accent6" w:themeShade="BF"/>
-        </w:rPr>
+      </w:pPr>
+    </w:p>
+    <w:p>
+      <w:pPr>
+        <w:pStyle w:val="Heading2"/>
+      </w:pPr>
+      <w:r>
         <w:t>/* Low-level hardware initialization */</w:t>
       </w:r>
     </w:p>
     <w:p>
       <w:pPr>
         <w:pStyle w:val="Heading2"/>
-        <w:rPr>
-          <w:color w:val="538135" w:themeColor="accent6" w:themeShade="BF"/>
-        </w:rPr>
-      </w:pPr>
-      <w:r>
-        <w:rPr>
-          <w:color w:val="538135" w:themeColor="accent6" w:themeShade="BF"/>
-        </w:rPr>
+      </w:pPr>
+      <w:r>
         <w:t>static void low_level_init(struct netif *netif) {</w:t>
       </w:r>
     </w:p>
     <w:p>
       <w:pPr>
         <w:pStyle w:val="Heading2"/>
-        <w:rPr>
-          <w:color w:val="538135" w:themeColor="accent6" w:themeShade="BF"/>
-        </w:rPr>
-      </w:pPr>
-      <w:r>
-        <w:rPr>
-          <w:color w:val="538135" w:themeColor="accent6" w:themeShade="BF"/>
-        </w:rPr>
+      </w:pPr>
+      <w:r>
+        <w:t xml:space="preserve">    netif-&gt;hwaddr_len = ETHARP_HWADDR_LEN;</w:t>
+      </w:r>
+    </w:p>
+    <w:p>
+      <w:pPr>
+        <w:pStyle w:val="Heading2"/>
+      </w:pPr>
+      <w:r>
+        <w:t xml:space="preserve">    </w:t>
+      </w:r>
+    </w:p>
+    <w:p>
+      <w:pPr>
+        <w:pStyle w:val="Heading2"/>
+      </w:pPr>
+      <w:r>
         <w:lastRenderedPageBreak/>
-        <w:t xml:space="preserve">    netif-&gt;hwaddr_len = ETHARP_HWADDR_LEN;</w:t>
-      </w:r>
-    </w:p>
-    <w:p>
-      <w:pPr>
-        <w:pStyle w:val="Heading2"/>
-        <w:rPr>
-          <w:color w:val="538135" w:themeColor="accent6" w:themeShade="BF"/>
-        </w:rPr>
-      </w:pPr>
-      <w:r>
-        <w:rPr>
-          <w:color w:val="538135" w:themeColor="accent6" w:themeShade="BF"/>
-        </w:rPr>
+        <w:t xml:space="preserve">    // Set MAC Address (e.g., 00:08:DC:00:00:01)</w:t>
+      </w:r>
+    </w:p>
+    <w:p>
+      <w:pPr>
+        <w:pStyle w:val="Heading2"/>
+      </w:pPr>
+      <w:r>
+        <w:t xml:space="preserve">    netif-&gt;hwaddr[0] = 0x00; netif-&gt;hwaddr[1] = 0x08;</w:t>
+      </w:r>
+    </w:p>
+    <w:p>
+      <w:pPr>
+        <w:pStyle w:val="Heading2"/>
+      </w:pPr>
+      <w:r>
+        <w:t xml:space="preserve">    netif-&gt;hwaddr[2] = 0xDC; netif-&gt;hwaddr[3] = 0x00;</w:t>
+      </w:r>
+    </w:p>
+    <w:p>
+      <w:pPr>
+        <w:pStyle w:val="Heading2"/>
+      </w:pPr>
+      <w:r>
+        <w:t xml:space="preserve">    netif-&gt;hwaddr[4] = 0x00; netif-&gt;hwaddr[5] = 0x01;</w:t>
+      </w:r>
+    </w:p>
+    <w:p>
+      <w:pPr>
+        <w:pStyle w:val="Heading2"/>
+      </w:pPr>
+      <w:r>
         <w:t xml:space="preserve">    </w:t>
       </w:r>
     </w:p>
     <w:p>
       <w:pPr>
         <w:pStyle w:val="Heading2"/>
-        <w:rPr>
-          <w:color w:val="538135" w:themeColor="accent6" w:themeShade="BF"/>
-        </w:rPr>
-      </w:pPr>
-      <w:r>
-        <w:rPr>
-          <w:color w:val="538135" w:themeColor="accent6" w:themeShade="BF"/>
-        </w:rPr>
-        <w:t xml:space="preserve">    // Set MAC Address (e.g., 00:08:DC:00:00:01)</w:t>
-      </w:r>
-    </w:p>
-    <w:p>
-      <w:pPr>
-        <w:pStyle w:val="Heading2"/>
-        <w:rPr>
-          <w:color w:val="538135" w:themeColor="accent6" w:themeShade="BF"/>
-        </w:rPr>
-      </w:pPr>
-      <w:r>
-        <w:rPr>
-          <w:color w:val="538135" w:themeColor="accent6" w:themeShade="BF"/>
-        </w:rPr>
-        <w:t xml:space="preserve">    netif-&gt;hwaddr[0] = 0x00; netif-&gt;hwaddr[1] = 0x08;</w:t>
-      </w:r>
-    </w:p>
-    <w:p>
-      <w:pPr>
-        <w:pStyle w:val="Heading2"/>
-        <w:rPr>
-          <w:color w:val="538135" w:themeColor="accent6" w:themeShade="BF"/>
-        </w:rPr>
-      </w:pPr>
-      <w:r>
-        <w:rPr>
-          <w:color w:val="538135" w:themeColor="accent6" w:themeShade="BF"/>
-        </w:rPr>
-        <w:t xml:space="preserve">    netif-&gt;hwaddr[2] = 0xDC; netif-&gt;hwaddr[3] = 0x00;</w:t>
-      </w:r>
-    </w:p>
-    <w:p>
-      <w:pPr>
-        <w:pStyle w:val="Heading2"/>
-        <w:rPr>
-          <w:color w:val="538135" w:themeColor="accent6" w:themeShade="BF"/>
-        </w:rPr>
-      </w:pPr>
-      <w:r>
-        <w:rPr>
-          <w:color w:val="538135" w:themeColor="accent6" w:themeShade="BF"/>
-        </w:rPr>
-        <w:t xml:space="preserve">    netif-&gt;hwaddr[4] = 0x00; netif-&gt;hwaddr[5] = 0x01;</w:t>
-      </w:r>
-    </w:p>
-    <w:p>
-      <w:pPr>
-        <w:pStyle w:val="Heading2"/>
-        <w:rPr>
-          <w:color w:val="538135" w:themeColor="accent6" w:themeShade="BF"/>
-        </w:rPr>
-      </w:pPr>
-      <w:r>
-        <w:rPr>
-          <w:color w:val="538135" w:themeColor="accent6" w:themeShade="BF"/>
-        </w:rPr>
-        <w:t xml:space="preserve">    </w:t>
-      </w:r>
-    </w:p>
-    <w:p>
-      <w:pPr>
-        <w:pStyle w:val="Heading2"/>
-        <w:rPr>
-          <w:color w:val="538135" w:themeColor="accent6" w:themeShade="BF"/>
-        </w:rPr>
-      </w:pPr>
-      <w:r>
-        <w:rPr>
-          <w:color w:val="538135" w:themeColor="accent6" w:themeShade="BF"/>
-        </w:rPr>
+      </w:pPr>
+      <w:r>
         <w:t xml:space="preserve">    netif-&gt;mtu = 1500;</w:t>
       </w:r>
     </w:p>
     <w:p>
       <w:pPr>
         <w:pStyle w:val="Heading2"/>
-        <w:rPr>
-          <w:color w:val="538135" w:themeColor="accent6" w:themeShade="BF"/>
-        </w:rPr>
-      </w:pPr>
-      <w:r>
-        <w:rPr>
-          <w:color w:val="538135" w:themeColor="accent6" w:themeShade="BF"/>
-        </w:rPr>
+      </w:pPr>
+      <w:r>
         <w:t xml:space="preserve">    netif-&gt;flags = NETIF_FLAG_BROADCAST | NETIF_FLAG_ETHARP | NETIF_FLAG_LINK_UP;</w:t>
       </w:r>
     </w:p>
     <w:p>
       <w:pPr>
         <w:pStyle w:val="Heading2"/>
-        <w:rPr>
-          <w:color w:val="538135" w:themeColor="accent6" w:themeShade="BF"/>
-        </w:rPr>
-      </w:pPr>
-    </w:p>
-    <w:p>
-      <w:pPr>
-        <w:pStyle w:val="Heading2"/>
-        <w:rPr>
-          <w:color w:val="538135" w:themeColor="accent6" w:themeShade="BF"/>
-        </w:rPr>
-      </w:pPr>
-      <w:r>
-        <w:rPr>
-          <w:color w:val="538135" w:themeColor="accent6" w:themeShade="BF"/>
-        </w:rPr>
+      </w:pPr>
+    </w:p>
+    <w:p>
+      <w:pPr>
+        <w:pStyle w:val="Heading2"/>
+      </w:pPr>
+      <w:r>
         <w:t xml:space="preserve">    ENC28J60_Init(netif-&gt;hwaddr); // Call your SPI physical layer init code</w:t>
       </w:r>
     </w:p>
     <w:p>
       <w:pPr>
         <w:pStyle w:val="Heading2"/>
-        <w:rPr>
-          <w:color w:val="538135" w:themeColor="accent6" w:themeShade="BF"/>
-        </w:rPr>
-      </w:pPr>
-      <w:r>
-        <w:rPr>
-          <w:color w:val="538135" w:themeColor="accent6" w:themeShade="BF"/>
-        </w:rPr>
+      </w:pPr>
+      <w:r>
         <w:t>}</w:t>
       </w:r>
     </w:p>
     <w:p>
       <w:pPr>
         <w:pStyle w:val="Heading2"/>
-        <w:rPr>
-          <w:color w:val="538135" w:themeColor="accent6" w:themeShade="BF"/>
-        </w:rPr>
-      </w:pPr>
-    </w:p>
-    <w:p>
-      <w:pPr>
-        <w:pStyle w:val="Heading2"/>
-        <w:rPr>
-          <w:color w:val="538135" w:themeColor="accent6" w:themeShade="BF"/>
-        </w:rPr>
-      </w:pPr>
-      <w:r>
-        <w:rPr>
-          <w:color w:val="538135" w:themeColor="accent6" w:themeShade="BF"/>
-        </w:rPr>
+      </w:pPr>
+    </w:p>
+    <w:p>
+      <w:pPr>
+        <w:pStyle w:val="Heading2"/>
+      </w:pPr>
+      <w:r>
         <w:t>/* Transmit packet over SPI to ENC28J60 */</w:t>
       </w:r>
     </w:p>
     <w:p>
       <w:pPr>
         <w:pStyle w:val="Heading2"/>
-        <w:rPr>
-          <w:color w:val="538135" w:themeColor="accent6" w:themeShade="BF"/>
-        </w:rPr>
-      </w:pPr>
-      <w:r>
-        <w:rPr>
-          <w:color w:val="538135" w:themeColor="accent6" w:themeShade="BF"/>
-        </w:rPr>
+      </w:pPr>
+      <w:r>
         <w:t>static err_t low_level_output(struct netif *netif, struct pbuf *p) {</w:t>
       </w:r>
     </w:p>
     <w:p>
       <w:pPr>
         <w:pStyle w:val="Heading2"/>
-        <w:rPr>
-          <w:color w:val="538135" w:themeColor="accent6" w:themeShade="BF"/>
-        </w:rPr>
-      </w:pPr>
-      <w:r>
-        <w:rPr>
-          <w:color w:val="538135" w:themeColor="accent6" w:themeShade="BF"/>
-        </w:rPr>
+      </w:pPr>
+      <w:r>
         <w:t xml:space="preserve">    struct pbuf *q;</w:t>
       </w:r>
     </w:p>
     <w:p>
       <w:pPr>
         <w:pStyle w:val="Heading2"/>
-        <w:rPr>
-          <w:color w:val="538135" w:themeColor="accent6" w:themeShade="BF"/>
-        </w:rPr>
-      </w:pPr>
-      <w:r>
-        <w:rPr>
-          <w:color w:val="538135" w:themeColor="accent6" w:themeShade="BF"/>
-        </w:rPr>
+      </w:pPr>
+      <w:r>
         <w:t xml:space="preserve">    ENC28J60_TransmitStart(p-&gt;tot_len); // Alert ENC28J60 of oncoming payload</w:t>
       </w:r>
     </w:p>
     <w:p>
       <w:pPr>
         <w:pStyle w:val="Heading2"/>
-        <w:rPr>
-          <w:color w:val="538135" w:themeColor="accent6" w:themeShade="BF"/>
-        </w:rPr>
-      </w:pPr>
-    </w:p>
-    <w:p>
-      <w:pPr>
-        <w:pStyle w:val="Heading2"/>
-        <w:rPr>
-          <w:color w:val="538135" w:themeColor="accent6" w:themeShade="BF"/>
-        </w:rPr>
-      </w:pPr>
-      <w:r>
-        <w:rPr>
-          <w:color w:val="538135" w:themeColor="accent6" w:themeShade="BF"/>
-        </w:rPr>
+      </w:pPr>
+    </w:p>
+    <w:p>
+      <w:pPr>
+        <w:pStyle w:val="Heading2"/>
+      </w:pPr>
+      <w:r>
         <w:t xml:space="preserve">    for(q = p; q != NULL; q = q-&gt;next) {</w:t>
       </w:r>
     </w:p>
     <w:p>
       <w:pPr>
         <w:pStyle w:val="Heading2"/>
-        <w:rPr>
-          <w:color w:val="538135" w:themeColor="accent6" w:themeShade="BF"/>
-        </w:rPr>
-      </w:pPr>
-      <w:r>
-        <w:rPr>
-          <w:color w:val="538135" w:themeColor="accent6" w:themeShade="BF"/>
-        </w:rPr>
+      </w:pPr>
+      <w:r>
         <w:t xml:space="preserve">        // Send buffer chunk via SPI</w:t>
       </w:r>
     </w:p>
     <w:p>
       <w:pPr>
         <w:pStyle w:val="Heading2"/>
-        <w:rPr>
-          <w:color w:val="538135" w:themeColor="accent6" w:themeShade="BF"/>
-        </w:rPr>
-      </w:pPr>
-      <w:r>
-        <w:rPr>
-          <w:color w:val="538135" w:themeColor="accent6" w:themeShade="BF"/>
-        </w:rPr>
+      </w:pPr>
+      <w:r>
         <w:t xml:space="preserve">        ENC28J60_WriteBuffer(q-&gt;payload, q-&gt;len); </w:t>
       </w:r>
     </w:p>
     <w:p>
       <w:pPr>
         <w:pStyle w:val="Heading2"/>
-        <w:rPr>
-          <w:color w:val="538135" w:themeColor="accent6" w:themeShade="BF"/>
-        </w:rPr>
-      </w:pPr>
-      <w:r>
-        <w:rPr>
-          <w:color w:val="538135" w:themeColor="accent6" w:themeShade="BF"/>
-        </w:rPr>
+      </w:pPr>
+      <w:r>
         <w:t xml:space="preserve">    }</w:t>
       </w:r>
     </w:p>
     <w:p>
       <w:pPr>
         <w:pStyle w:val="Heading2"/>
-        <w:rPr>
-          <w:color w:val="538135" w:themeColor="accent6" w:themeShade="BF"/>
-        </w:rPr>
-      </w:pPr>
-    </w:p>
-    <w:p>
-      <w:pPr>
-        <w:pStyle w:val="Heading2"/>
-        <w:rPr>
-          <w:color w:val="538135" w:themeColor="accent6" w:themeShade="BF"/>
-        </w:rPr>
-      </w:pPr>
-      <w:r>
-        <w:rPr>
-          <w:color w:val="538135" w:themeColor="accent6" w:themeShade="BF"/>
-        </w:rPr>
+      </w:pPr>
+    </w:p>
+    <w:p>
+      <w:pPr>
+        <w:pStyle w:val="Heading2"/>
+      </w:pPr>
+      <w:r>
         <w:t xml:space="preserve">    ENC28J60_TransmitSend(); // Execute transmit command</w:t>
       </w:r>
     </w:p>
     <w:p>
       <w:pPr>
         <w:pStyle w:val="Heading2"/>
-        <w:rPr>
-          <w:color w:val="538135" w:themeColor="accent6" w:themeShade="BF"/>
-        </w:rPr>
-      </w:pPr>
-      <w:r>
-        <w:rPr>
-          <w:color w:val="538135" w:themeColor="accent6" w:themeShade="BF"/>
-        </w:rPr>
+      </w:pPr>
+      <w:r>
         <w:t xml:space="preserve">    return ERR_OK;</w:t>
       </w:r>
     </w:p>
     <w:p>
       <w:pPr>
         <w:pStyle w:val="Heading2"/>
-        <w:rPr>
-          <w:color w:val="538135" w:themeColor="accent6" w:themeShade="BF"/>
-        </w:rPr>
-      </w:pPr>
-      <w:r>
-        <w:rPr>
-          <w:color w:val="538135" w:themeColor="accent6" w:themeShade="BF"/>
-        </w:rPr>
+      </w:pPr>
+      <w:r>
         <w:t>}</w:t>
       </w:r>
     </w:p>
     <w:p>
       <w:pPr>
         <w:pStyle w:val="Heading2"/>
-        <w:rPr>
-          <w:color w:val="538135" w:themeColor="accent6" w:themeShade="BF"/>
-        </w:rPr>
-      </w:pPr>
-    </w:p>
-    <w:p>
-      <w:pPr>
-        <w:pStyle w:val="Heading2"/>
-        <w:rPr>
-          <w:color w:val="538135" w:themeColor="accent6" w:themeShade="BF"/>
-        </w:rPr>
-      </w:pPr>
-      <w:r>
-        <w:rPr>
-          <w:color w:val="538135" w:themeColor="accent6" w:themeShade="BF"/>
-        </w:rPr>
+      </w:pPr>
+    </w:p>
+    <w:p>
+      <w:pPr>
+        <w:pStyle w:val="Heading2"/>
+      </w:pPr>
+      <w:r>
         <w:t>/* Receive packet from ENC28J60 over SPI */</w:t>
       </w:r>
     </w:p>
     <w:p>
       <w:pPr>
         <w:pStyle w:val="Heading2"/>
-        <w:rPr>
-          <w:color w:val="538135" w:themeColor="accent6" w:themeShade="BF"/>
-        </w:rPr>
-      </w:pPr>
-      <w:r>
-        <w:rPr>
-          <w:color w:val="538135" w:themeColor="accent6" w:themeShade="BF"/>
-        </w:rPr>
+      </w:pPr>
+      <w:r>
         <w:t>static struct pbuf* low_level_input(struct netif *netif) {</w:t>
       </w:r>
     </w:p>
     <w:p>
       <w:pPr>
         <w:pStyle w:val="Heading2"/>
-        <w:rPr>
-          <w:color w:val="538135" w:themeColor="accent6" w:themeShade="BF"/>
-        </w:rPr>
-      </w:pPr>
-      <w:r>
-        <w:rPr>
-          <w:color w:val="538135" w:themeColor="accent6" w:themeShade="BF"/>
-        </w:rPr>
+      </w:pPr>
+      <w:r>
         <w:t xml:space="preserve">    struct pbuf *p = NULL, *q;</w:t>
       </w:r>
     </w:p>
     <w:p>
       <w:pPr>
         <w:pStyle w:val="Heading2"/>
-        <w:rPr>
-          <w:color w:val="538135" w:themeColor="accent6" w:themeShade="BF"/>
-        </w:rPr>
-      </w:pPr>
-      <w:r>
-        <w:rPr>
-          <w:color w:val="538135" w:themeColor="accent6" w:themeShade="BF"/>
-        </w:rPr>
+      </w:pPr>
+      <w:r>
         <w:t xml:space="preserve">    uint16_t len = ENC28J60_GetReceivedPacketLength();</w:t>
       </w:r>
     </w:p>
     <w:p>
       <w:pPr>
         <w:pStyle w:val="Heading2"/>
-        <w:rPr>
-          <w:color w:val="538135" w:themeColor="accent6" w:themeShade="BF"/>
-        </w:rPr>
-      </w:pPr>
-    </w:p>
-    <w:p>
-      <w:pPr>
-        <w:pStyle w:val="Heading2"/>
-        <w:rPr>
-          <w:color w:val="538135" w:themeColor="accent6" w:themeShade="BF"/>
-        </w:rPr>
-      </w:pPr>
-      <w:r>
-        <w:rPr>
-          <w:color w:val="538135" w:themeColor="accent6" w:themeShade="BF"/>
-        </w:rPr>
+      </w:pPr>
+    </w:p>
+    <w:p>
+      <w:pPr>
+        <w:pStyle w:val="Heading2"/>
+      </w:pPr>
+      <w:r>
         <w:t xml:space="preserve">    if (len == 0) return NULL;</w:t>
       </w:r>
     </w:p>
     <w:p>
       <w:pPr>
         <w:pStyle w:val="Heading2"/>
-        <w:rPr>
-          <w:color w:val="538135" w:themeColor="accent6" w:themeShade="BF"/>
-        </w:rPr>
-      </w:pPr>
-    </w:p>
-    <w:p>
-      <w:pPr>
-        <w:pStyle w:val="Heading2"/>
-        <w:rPr>
-          <w:color w:val="538135" w:themeColor="accent6" w:themeShade="BF"/>
-        </w:rPr>
-      </w:pPr>
-      <w:r>
-        <w:rPr>
-          <w:color w:val="538135" w:themeColor="accent6" w:themeShade="BF"/>
-        </w:rPr>
+      </w:pPr>
+    </w:p>
+    <w:p>
+      <w:pPr>
+        <w:pStyle w:val="Heading2"/>
+      </w:pPr>
+      <w:r>
         <w:t xml:space="preserve">    // Allocate packet buffer memory inside lwIP heap</w:t>
       </w:r>
     </w:p>
     <w:p>
       <w:pPr>
         <w:pStyle w:val="Heading2"/>
-        <w:rPr>
-          <w:color w:val="538135" w:themeColor="accent6" w:themeShade="BF"/>
-        </w:rPr>
-      </w:pPr>
-      <w:r>
-        <w:rPr>
-          <w:color w:val="538135" w:themeColor="accent6" w:themeShade="BF"/>
-        </w:rPr>
+      </w:pPr>
+      <w:r>
         <w:t xml:space="preserve">    p = pbuf_alloc(PBUF_RAW, len, PBUF_POOL);</w:t>
       </w:r>
     </w:p>
     <w:p>
       <w:pPr>
         <w:pStyle w:val="Heading2"/>
-        <w:rPr>
-          <w:color w:val="538135" w:themeColor="accent6" w:themeShade="BF"/>
-        </w:rPr>
-      </w:pPr>
-      <w:r>
-        <w:rPr>
-          <w:color w:val="538135" w:themeColor="accent6" w:themeShade="BF"/>
-        </w:rPr>
+      </w:pPr>
+      <w:r>
         <w:t xml:space="preserve">    if (p != NULL) {</w:t>
       </w:r>
     </w:p>
     <w:p>
       <w:pPr>
         <w:pStyle w:val="Heading2"/>
-        <w:rPr>
-          <w:color w:val="538135" w:themeColor="accent6" w:themeShade="BF"/>
-        </w:rPr>
-      </w:pPr>
-      <w:r>
-        <w:rPr>
-          <w:color w:val="538135" w:themeColor="accent6" w:themeShade="BF"/>
-        </w:rPr>
+      </w:pPr>
+      <w:r>
         <w:t xml:space="preserve">        for (q = p; q != NULL; q = q-&gt;next) {</w:t>
       </w:r>
     </w:p>
     <w:p>
       <w:pPr>
         <w:pStyle w:val="Heading2"/>
-        <w:rPr>
-          <w:color w:val="538135" w:themeColor="accent6" w:themeShade="BF"/>
-        </w:rPr>
-      </w:pPr>
-      <w:r>
-        <w:rPr>
-          <w:color w:val="538135" w:themeColor="accent6" w:themeShade="BF"/>
-        </w:rPr>
+      </w:pPr>
+      <w:r>
         <w:t xml:space="preserve">            ENC28J60_ReadBuffer(q-&gt;payload, q-&gt;len); // Read chunk via SPI</w:t>
       </w:r>
     </w:p>
     <w:p>
       <w:pPr>
         <w:pStyle w:val="Heading2"/>
-        <w:rPr>
-          <w:color w:val="538135" w:themeColor="accent6" w:themeShade="BF"/>
-        </w:rPr>
-      </w:pPr>
-      <w:r>
-        <w:rPr>
-          <w:color w:val="538135" w:themeColor="accent6" w:themeShade="BF"/>
-        </w:rPr>
+      </w:pPr>
+      <w:r>
         <w:t xml:space="preserve">        }</w:t>
       </w:r>
     </w:p>
     <w:p>
       <w:pPr>
         <w:pStyle w:val="Heading2"/>
-        <w:rPr>
-          <w:color w:val="538135" w:themeColor="accent6" w:themeShade="BF"/>
-        </w:rPr>
-      </w:pPr>
-      <w:r>
-        <w:rPr>
-          <w:color w:val="538135" w:themeColor="accent6" w:themeShade="BF"/>
-        </w:rPr>
+      </w:pPr>
+      <w:r>
         <w:t xml:space="preserve">        ENC28J60_FreeRxBuffer(); // Clear ENC28J60 RX memory slot</w:t>
       </w:r>
     </w:p>
     <w:p>
       <w:pPr>
         <w:pStyle w:val="Heading2"/>
-        <w:rPr>
-          <w:color w:val="538135" w:themeColor="accent6" w:themeShade="BF"/>
-        </w:rPr>
-      </w:pPr>
-      <w:r>
-        <w:rPr>
-          <w:color w:val="538135" w:themeColor="accent6" w:themeShade="BF"/>
-        </w:rPr>
+      </w:pPr>
+      <w:r>
         <w:t xml:space="preserve">    }</w:t>
       </w:r>
     </w:p>
     <w:p>
       <w:pPr>
         <w:pStyle w:val="Heading2"/>
-        <w:rPr>
-          <w:color w:val="538135" w:themeColor="accent6" w:themeShade="BF"/>
-        </w:rPr>
-      </w:pPr>
-      <w:r>
-        <w:rPr>
-          <w:color w:val="538135" w:themeColor="accent6" w:themeShade="BF"/>
-        </w:rPr>
+      </w:pPr>
+      <w:r>
         <w:t xml:space="preserve">    return p;</w:t>
       </w:r>
     </w:p>
     <w:p>
       <w:pPr>
         <w:pStyle w:val="Heading2"/>
-        <w:rPr>
-          <w:color w:val="538135" w:themeColor="accent6" w:themeShade="BF"/>
-        </w:rPr>
-      </w:pPr>
-      <w:r>
-        <w:rPr>
-          <w:color w:val="538135" w:themeColor="accent6" w:themeShade="BF"/>
-        </w:rPr>
+      </w:pPr>
+      <w:r>
         <w:t>}</w:t>
       </w:r>
     </w:p>
     <w:p>
       <w:pPr>
         <w:pStyle w:val="Heading2"/>
-        <w:rPr>
-          <w:color w:val="538135" w:themeColor="accent6" w:themeShade="BF"/>
-        </w:rPr>
-      </w:pPr>
-    </w:p>
-    <w:p>
-      <w:pPr>
-        <w:pStyle w:val="Heading2"/>
-        <w:rPr>
-          <w:color w:val="538135" w:themeColor="accent6" w:themeShade="BF"/>
-        </w:rPr>
-      </w:pPr>
-      <w:r>
-        <w:rPr>
-          <w:color w:val="538135" w:themeColor="accent6" w:themeShade="BF"/>
-        </w:rPr>
+      </w:pPr>
+    </w:p>
+    <w:p>
+      <w:pPr>
+        <w:pStyle w:val="Heading2"/>
+      </w:pPr>
+      <w:r>
         <w:t>/* Initialization callback handled by lwIP */</w:t>
       </w:r>
     </w:p>
     <w:p>
       <w:pPr>
         <w:pStyle w:val="Heading2"/>
-        <w:rPr>
-          <w:color w:val="538135" w:themeColor="accent6" w:themeShade="BF"/>
-        </w:rPr>
-      </w:pPr>
-      <w:r>
-        <w:rPr>
-          <w:color w:val="538135" w:themeColor="accent6" w:themeShade="BF"/>
-        </w:rPr>
+      </w:pPr>
+      <w:r>
         <w:t>err_t enc28j60_netif_init(struct netif *netif) {</w:t>
       </w:r>
     </w:p>
     <w:p>
       <w:pPr>
         <w:pStyle w:val="Heading2"/>
-        <w:rPr>
-          <w:color w:val="538135" w:themeColor="accent6" w:themeShade="BF"/>
-        </w:rPr>
-      </w:pPr>
-      <w:r>
-        <w:rPr>
-          <w:color w:val="538135" w:themeColor="accent6" w:themeShade="BF"/>
-        </w:rPr>
+      </w:pPr>
+      <w:r>
         <w:t xml:space="preserve">    netif-&gt;name[0] = 'e';</w:t>
       </w:r>
     </w:p>
     <w:p>
       <w:pPr>
         <w:pStyle w:val="Heading2"/>
-        <w:rPr>
-          <w:color w:val="538135" w:themeColor="accent6" w:themeShade="BF"/>
-        </w:rPr>
-      </w:pPr>
-      <w:r>
-        <w:rPr>
-          <w:color w:val="538135" w:themeColor="accent6" w:themeShade="BF"/>
-        </w:rPr>
+      </w:pPr>
+      <w:r>
+        <w:t xml:space="preserve">    netif-&gt;name[1] = 'n';</w:t>
+      </w:r>
+    </w:p>
+    <w:p>
+      <w:pPr>
+        <w:pStyle w:val="Heading2"/>
+      </w:pPr>
+      <w:r>
+        <w:t xml:space="preserve">    netif-&gt;output = etharp_output; // Assigns the ARP handler</w:t>
+      </w:r>
+    </w:p>
+    <w:p>
+      <w:pPr>
+        <w:pStyle w:val="Heading2"/>
+      </w:pPr>
+      <w:r>
         <w:lastRenderedPageBreak/>
-        <w:t xml:space="preserve">    netif-&gt;name[1] = 'n';</w:t>
-      </w:r>
-    </w:p>
-    <w:p>
-      <w:pPr>
-        <w:pStyle w:val="Heading2"/>
-        <w:rPr>
-          <w:color w:val="538135" w:themeColor="accent6" w:themeShade="BF"/>
-        </w:rPr>
-      </w:pPr>
-      <w:r>
-        <w:rPr>
-          <w:color w:val="538135" w:themeColor="accent6" w:themeShade="BF"/>
-        </w:rPr>
-        <w:t xml:space="preserve">    netif-&gt;output = etharp_output; // Assigns the ARP handler</w:t>
-      </w:r>
-    </w:p>
-    <w:p>
-      <w:pPr>
-        <w:pStyle w:val="Heading2"/>
-        <w:rPr>
-          <w:color w:val="538135" w:themeColor="accent6" w:themeShade="BF"/>
-        </w:rPr>
-      </w:pPr>
-      <w:r>
-        <w:rPr>
-          <w:color w:val="538135" w:themeColor="accent6" w:themeShade="BF"/>
-        </w:rPr>
         <w:t xml:space="preserve">    netif-&gt;linkoutput = low_level_output;</w:t>
       </w:r>
     </w:p>
     <w:p>
       <w:pPr>
         <w:pStyle w:val="Heading2"/>
-        <w:rPr>
-          <w:color w:val="538135" w:themeColor="accent6" w:themeShade="BF"/>
-        </w:rPr>
-      </w:pPr>
-    </w:p>
-    <w:p>
-      <w:pPr>
-        <w:pStyle w:val="Heading2"/>
-        <w:rPr>
-          <w:color w:val="538135" w:themeColor="accent6" w:themeShade="BF"/>
-        </w:rPr>
-      </w:pPr>
-      <w:r>
-        <w:rPr>
-          <w:color w:val="538135" w:themeColor="accent6" w:themeShade="BF"/>
-        </w:rPr>
+      </w:pPr>
+    </w:p>
+    <w:p>
+      <w:pPr>
+        <w:pStyle w:val="Heading2"/>
+      </w:pPr>
+      <w:r>
         <w:t xml:space="preserve">    low_level_init(netif);</w:t>
       </w:r>
     </w:p>
     <w:p>
       <w:pPr>
         <w:pStyle w:val="Heading2"/>
-        <w:rPr>
-          <w:color w:val="538135" w:themeColor="accent6" w:themeShade="BF"/>
-        </w:rPr>
-      </w:pPr>
-      <w:r>
-        <w:rPr>
-          <w:color w:val="538135" w:themeColor="accent6" w:themeShade="BF"/>
-        </w:rPr>
+      </w:pPr>
+      <w:r>
         <w:t xml:space="preserve">    return ERR_OK;</w:t>
       </w:r>
     </w:p>
     <w:p>
       <w:pPr>
         <w:pStyle w:val="Heading2"/>
-        <w:rPr>
-          <w:color w:val="538135" w:themeColor="accent6" w:themeShade="BF"/>
-        </w:rPr>
-      </w:pPr>
-      <w:r>
-        <w:rPr>
-          <w:color w:val="538135" w:themeColor="accent6" w:themeShade="BF"/>
-        </w:rPr>
+      </w:pPr>
+      <w:r>
         <w:t>}</w:t>
       </w:r>
     </w:p>
     <w:p>
       <w:pPr>
         <w:pStyle w:val="Heading2"/>
-        <w:rPr>
-          <w:color w:val="538135" w:themeColor="accent6" w:themeShade="BF"/>
-        </w:rPr>
-      </w:pPr>
-    </w:p>
-    <w:p>
-      <w:pPr>
-        <w:pStyle w:val="Heading2"/>
-        <w:rPr>
-          <w:color w:val="538135" w:themeColor="accent6" w:themeShade="BF"/>
-        </w:rPr>
-      </w:pPr>
-      <w:r>
-        <w:rPr>
-          <w:color w:val="538135" w:themeColor="accent6" w:themeShade="BF"/>
-        </w:rPr>
+      </w:pPr>
+    </w:p>
+    <w:p>
+      <w:pPr>
+        <w:pStyle w:val="Heading2"/>
+      </w:pPr>
+      <w:r>
         <w:t>/* Poll this function inside your main application loop */</w:t>
       </w:r>
     </w:p>
     <w:p>
       <w:pPr>
         <w:pStyle w:val="Heading2"/>
-        <w:rPr>
-          <w:color w:val="538135" w:themeColor="accent6" w:themeShade="BF"/>
-        </w:rPr>
-      </w:pPr>
-      <w:r>
-        <w:rPr>
-          <w:color w:val="538135" w:themeColor="accent6" w:themeShade="BF"/>
-        </w:rPr>
+      </w:pPr>
+      <w:r>
         <w:t>void enc28j60_netif_poll(struct netif *netif) {</w:t>
       </w:r>
     </w:p>
     <w:p>
       <w:pPr>
         <w:pStyle w:val="Heading2"/>
-        <w:rPr>
-          <w:color w:val="538135" w:themeColor="accent6" w:themeShade="BF"/>
-        </w:rPr>
-      </w:pPr>
-      <w:r>
-        <w:rPr>
-          <w:color w:val="538135" w:themeColor="accent6" w:themeShade="BF"/>
-        </w:rPr>
+      </w:pPr>
+      <w:r>
         <w:t xml:space="preserve">    struct pbuf *p = low_level_input(netif);</w:t>
       </w:r>
     </w:p>
     <w:p>
       <w:pPr>
         <w:pStyle w:val="Heading2"/>
-        <w:rPr>
-          <w:color w:val="538135" w:themeColor="accent6" w:themeShade="BF"/>
-        </w:rPr>
-      </w:pPr>
-      <w:r>
-        <w:rPr>
-          <w:color w:val="538135" w:themeColor="accent6" w:themeShade="BF"/>
-        </w:rPr>
+      </w:pPr>
+      <w:r>
         <w:t xml:space="preserve">    if (p != NULL) {</w:t>
       </w:r>
     </w:p>
     <w:p>
       <w:pPr>
         <w:pStyle w:val="Heading2"/>
-        <w:rPr>
-          <w:color w:val="538135" w:themeColor="accent6" w:themeShade="BF"/>
-        </w:rPr>
-      </w:pPr>
-      <w:r>
-        <w:rPr>
-          <w:color w:val="538135" w:themeColor="accent6" w:themeShade="BF"/>
-        </w:rPr>
+      </w:pPr>
+      <w:r>
         <w:t xml:space="preserve">        if (netif-&gt;input(p, netif) != ERR_OK) {</w:t>
       </w:r>
     </w:p>
     <w:p>
       <w:pPr>
         <w:pStyle w:val="Heading2"/>
-        <w:rPr>
-          <w:color w:val="538135" w:themeColor="accent6" w:themeShade="BF"/>
-        </w:rPr>
-      </w:pPr>
-      <w:r>
-        <w:rPr>
-          <w:color w:val="538135" w:themeColor="accent6" w:themeShade="BF"/>
-        </w:rPr>
+      </w:pPr>
+      <w:r>
         <w:t xml:space="preserve">            pbuf_free(p);</w:t>
       </w:r>
     </w:p>
     <w:p>
       <w:pPr>
         <w:pStyle w:val="Heading2"/>
-        <w:rPr>
-          <w:color w:val="538135" w:themeColor="accent6" w:themeShade="BF"/>
-        </w:rPr>
-      </w:pPr>
-      <w:r>
-        <w:rPr>
-          <w:color w:val="538135" w:themeColor="accent6" w:themeShade="BF"/>
-        </w:rPr>
+      </w:pPr>
+      <w:r>
         <w:t xml:space="preserve">        }</w:t>
       </w:r>
     </w:p>
     <w:p>
       <w:pPr>
         <w:pStyle w:val="Heading2"/>
-        <w:rPr>
-          <w:color w:val="538135" w:themeColor="accent6" w:themeShade="BF"/>
-        </w:rPr>
-      </w:pPr>
-      <w:r>
-        <w:rPr>
-          <w:color w:val="538135" w:themeColor="accent6" w:themeShade="BF"/>
-        </w:rPr>
+      </w:pPr>
+      <w:r>
         <w:t xml:space="preserve">    }</w:t>
       </w:r>
     </w:p>
     <w:p>
       <w:pPr>
         <w:pStyle w:val="Heading2"/>
-        <w:rPr>
-          <w:color w:val="538135" w:themeColor="accent6" w:themeShade="BF"/>
-        </w:rPr>
-      </w:pPr>
-      <w:r>
-        <w:rPr>
-          <w:color w:val="538135" w:themeColor="accent6" w:themeShade="BF"/>
-        </w:rPr>
+      </w:pPr>
+      <w:r>
         <w:t>}</w:t>
       </w:r>
     </w:p>
     <w:p>
       <w:pPr>
         <w:pStyle w:val="Heading2"/>
-        <w:rPr>
-          <w:color w:val="538135" w:themeColor="accent6" w:themeShade="BF"/>
-        </w:rPr>
-      </w:pPr>
-      <w:r>
-        <w:rPr>
-          <w:color w:val="538135" w:themeColor="accent6" w:themeShade="BF"/>
-        </w:rPr>
+      </w:pPr>
+      <w:r>
         <w:t>Use code with caution.</w:t>
       </w:r>
     </w:p>
@@ -1935,475 +1413,274 @@
     <w:p>
       <w:pPr>
         <w:pStyle w:val="Heading2"/>
-        <w:rPr>
-          <w:color w:val="538135" w:themeColor="accent6" w:themeShade="BF"/>
-        </w:rPr>
-      </w:pPr>
-      <w:r>
-        <w:rPr>
-          <w:color w:val="538135" w:themeColor="accent6" w:themeShade="BF"/>
-        </w:rPr>
+      </w:pPr>
+      <w:r>
         <w:t>c</w:t>
       </w:r>
     </w:p>
     <w:p>
       <w:pPr>
         <w:pStyle w:val="Heading2"/>
-        <w:rPr>
-          <w:color w:val="538135" w:themeColor="accent6" w:themeShade="BF"/>
-        </w:rPr>
-      </w:pPr>
-      <w:r>
-        <w:rPr>
-          <w:color w:val="538135" w:themeColor="accent6" w:themeShade="BF"/>
-        </w:rPr>
+      </w:pPr>
+      <w:r>
         <w:t>#include "lwip/init.h"</w:t>
       </w:r>
     </w:p>
     <w:p>
       <w:pPr>
         <w:pStyle w:val="Heading2"/>
-        <w:rPr>
-          <w:color w:val="538135" w:themeColor="accent6" w:themeShade="BF"/>
-        </w:rPr>
-      </w:pPr>
-      <w:r>
-        <w:rPr>
-          <w:color w:val="538135" w:themeColor="accent6" w:themeShade="BF"/>
-        </w:rPr>
+      </w:pPr>
+      <w:r>
         <w:t>#include "lwip/netif.h"</w:t>
       </w:r>
     </w:p>
     <w:p>
       <w:pPr>
         <w:pStyle w:val="Heading2"/>
-        <w:rPr>
-          <w:color w:val="538135" w:themeColor="accent6" w:themeShade="BF"/>
-        </w:rPr>
-      </w:pPr>
-      <w:r>
-        <w:rPr>
-          <w:color w:val="538135" w:themeColor="accent6" w:themeShade="BF"/>
-        </w:rPr>
+      </w:pPr>
+      <w:r>
         <w:t>#include "lwip/ip_addr.h"</w:t>
       </w:r>
     </w:p>
     <w:p>
       <w:pPr>
         <w:pStyle w:val="Heading2"/>
-        <w:rPr>
-          <w:color w:val="538135" w:themeColor="accent6" w:themeShade="BF"/>
-        </w:rPr>
-      </w:pPr>
-      <w:r>
-        <w:rPr>
-          <w:color w:val="538135" w:themeColor="accent6" w:themeShade="BF"/>
-        </w:rPr>
+      </w:pPr>
+      <w:r>
         <w:t>#include "lwip/timeouts.h"</w:t>
       </w:r>
     </w:p>
     <w:p>
       <w:pPr>
         <w:pStyle w:val="Heading2"/>
-        <w:rPr>
-          <w:color w:val="538135" w:themeColor="accent6" w:themeShade="BF"/>
-        </w:rPr>
-      </w:pPr>
-      <w:r>
-        <w:rPr>
-          <w:color w:val="538135" w:themeColor="accent6" w:themeShade="BF"/>
-        </w:rPr>
+      </w:pPr>
+      <w:r>
         <w:t>#include "ethernetif.h"</w:t>
       </w:r>
     </w:p>
     <w:p>
       <w:pPr>
         <w:pStyle w:val="Heading2"/>
-        <w:rPr>
-          <w:color w:val="538135" w:themeColor="accent6" w:themeShade="BF"/>
-        </w:rPr>
-      </w:pPr>
-    </w:p>
-    <w:p>
-      <w:pPr>
-        <w:pStyle w:val="Heading2"/>
-        <w:rPr>
-          <w:color w:val="538135" w:themeColor="accent6" w:themeShade="BF"/>
-        </w:rPr>
-      </w:pPr>
-      <w:r>
-        <w:rPr>
-          <w:color w:val="538135" w:themeColor="accent6" w:themeShade="BF"/>
-        </w:rPr>
+      </w:pPr>
+    </w:p>
+    <w:p>
+      <w:pPr>
+        <w:pStyle w:val="Heading2"/>
+      </w:pPr>
+      <w:r>
         <w:t>struct netif enc28j60_netif;</w:t>
       </w:r>
     </w:p>
     <w:p>
       <w:pPr>
         <w:pStyle w:val="Heading2"/>
-        <w:rPr>
-          <w:color w:val="538135" w:themeColor="accent6" w:themeShade="BF"/>
-        </w:rPr>
-      </w:pPr>
-    </w:p>
-    <w:p>
-      <w:pPr>
-        <w:pStyle w:val="Heading2"/>
-        <w:rPr>
-          <w:color w:val="538135" w:themeColor="accent6" w:themeShade="BF"/>
-        </w:rPr>
-      </w:pPr>
-      <w:r>
-        <w:rPr>
-          <w:color w:val="538135" w:themeColor="accent6" w:themeShade="BF"/>
-        </w:rPr>
+      </w:pPr>
+    </w:p>
+    <w:p>
+      <w:pPr>
+        <w:pStyle w:val="Heading2"/>
+      </w:pPr>
+      <w:r>
         <w:t>int main(void) {</w:t>
       </w:r>
     </w:p>
     <w:p>
       <w:pPr>
         <w:pStyle w:val="Heading2"/>
-        <w:rPr>
-          <w:color w:val="538135" w:themeColor="accent6" w:themeShade="BF"/>
-        </w:rPr>
-      </w:pPr>
-      <w:r>
-        <w:rPr>
-          <w:color w:val="538135" w:themeColor="accent6" w:themeShade="BF"/>
-        </w:rPr>
+      </w:pPr>
+      <w:r>
         <w:t xml:space="preserve">    // 1. Initialize MCU clock, GPIO, and SPI peripherals here </w:t>
       </w:r>
     </w:p>
     <w:p>
       <w:pPr>
         <w:pStyle w:val="Heading2"/>
-        <w:rPr>
-          <w:color w:val="538135" w:themeColor="accent6" w:themeShade="BF"/>
-        </w:rPr>
-      </w:pPr>
-      <w:r>
-        <w:rPr>
-          <w:color w:val="538135" w:themeColor="accent6" w:themeShade="BF"/>
-        </w:rPr>
+      </w:pPr>
+      <w:r>
         <w:t xml:space="preserve">    </w:t>
       </w:r>
     </w:p>
     <w:p>
       <w:pPr>
         <w:pStyle w:val="Heading2"/>
-        <w:rPr>
-          <w:color w:val="538135" w:themeColor="accent6" w:themeShade="BF"/>
-        </w:rPr>
-      </w:pPr>
-      <w:r>
-        <w:rPr>
-          <w:color w:val="538135" w:themeColor="accent6" w:themeShade="BF"/>
-        </w:rPr>
+      </w:pPr>
+      <w:r>
         <w:t xml:space="preserve">    // 2. Initialize lwIP Stack</w:t>
       </w:r>
     </w:p>
     <w:p>
       <w:pPr>
         <w:pStyle w:val="Heading2"/>
-        <w:rPr>
-          <w:color w:val="538135" w:themeColor="accent6" w:themeShade="BF"/>
-        </w:rPr>
-      </w:pPr>
-      <w:r>
-        <w:rPr>
-          <w:color w:val="538135" w:themeColor="accent6" w:themeShade="BF"/>
-        </w:rPr>
+      </w:pPr>
+      <w:r>
         <w:t xml:space="preserve">    lwip_init();</w:t>
       </w:r>
     </w:p>
     <w:p>
       <w:pPr>
         <w:pStyle w:val="Heading2"/>
-        <w:rPr>
-          <w:color w:val="538135" w:themeColor="accent6" w:themeShade="BF"/>
-        </w:rPr>
-      </w:pPr>
-    </w:p>
-    <w:p>
-      <w:pPr>
-        <w:pStyle w:val="Heading2"/>
-        <w:rPr>
-          <w:color w:val="538135" w:themeColor="accent6" w:themeShade="BF"/>
-        </w:rPr>
-      </w:pPr>
-      <w:r>
-        <w:rPr>
-          <w:color w:val="538135" w:themeColor="accent6" w:themeShade="BF"/>
-        </w:rPr>
+      </w:pPr>
+    </w:p>
+    <w:p>
+      <w:pPr>
+        <w:pStyle w:val="Heading2"/>
+      </w:pPr>
+      <w:r>
         <w:t xml:space="preserve">    // 3. Define Network Configurations (Static IP setup)</w:t>
       </w:r>
     </w:p>
     <w:p>
       <w:pPr>
         <w:pStyle w:val="Heading2"/>
-        <w:rPr>
-          <w:color w:val="538135" w:themeColor="accent6" w:themeShade="BF"/>
-        </w:rPr>
-      </w:pPr>
-      <w:r>
-        <w:rPr>
-          <w:color w:val="538135" w:themeColor="accent6" w:themeShade="BF"/>
-        </w:rPr>
+      </w:pPr>
+      <w:r>
         <w:t xml:space="preserve">    ip4_addr_t ipaddr, netmask, gw;</w:t>
       </w:r>
     </w:p>
     <w:p>
       <w:pPr>
         <w:pStyle w:val="Heading2"/>
-        <w:rPr>
-          <w:color w:val="538135" w:themeColor="accent6" w:themeShade="BF"/>
-        </w:rPr>
-      </w:pPr>
-      <w:r>
-        <w:rPr>
-          <w:color w:val="538135" w:themeColor="accent6" w:themeShade="BF"/>
-        </w:rPr>
+      </w:pPr>
+      <w:r>
         <w:t xml:space="preserve">    IP4_ADDR(&amp;ipaddr, 192, 168, 1, 150);  // Static IP address</w:t>
       </w:r>
     </w:p>
     <w:p>
       <w:pPr>
         <w:pStyle w:val="Heading2"/>
-        <w:rPr>
-          <w:color w:val="538135" w:themeColor="accent6" w:themeShade="BF"/>
-        </w:rPr>
-      </w:pPr>
-      <w:r>
-        <w:rPr>
-          <w:color w:val="538135" w:themeColor="accent6" w:themeShade="BF"/>
-        </w:rPr>
+      </w:pPr>
+      <w:r>
         <w:t xml:space="preserve">    IP4_ADDR(&amp;netmask, 255, 255, 255, 0); // Netmask</w:t>
       </w:r>
     </w:p>
     <w:p>
       <w:pPr>
         <w:pStyle w:val="Heading2"/>
-        <w:rPr>
-          <w:color w:val="538135" w:themeColor="accent6" w:themeShade="BF"/>
-        </w:rPr>
-      </w:pPr>
-      <w:r>
-        <w:rPr>
-          <w:color w:val="538135" w:themeColor="accent6" w:themeShade="BF"/>
-        </w:rPr>
+      </w:pPr>
+      <w:r>
         <w:t xml:space="preserve">    IP4_ADDR(&amp;gw, 192, 168, 1, 1);        // Gateway IP</w:t>
       </w:r>
     </w:p>
     <w:p>
       <w:pPr>
         <w:pStyle w:val="Heading2"/>
-        <w:rPr>
-          <w:color w:val="538135" w:themeColor="accent6" w:themeShade="BF"/>
-        </w:rPr>
-      </w:pPr>
-    </w:p>
-    <w:p>
-      <w:pPr>
-        <w:pStyle w:val="Heading2"/>
-        <w:rPr>
-          <w:color w:val="538135" w:themeColor="accent6" w:themeShade="BF"/>
-        </w:rPr>
-      </w:pPr>
-      <w:r>
-        <w:rPr>
-          <w:color w:val="538135" w:themeColor="accent6" w:themeShade="BF"/>
-        </w:rPr>
+      </w:pPr>
+    </w:p>
+    <w:p>
+      <w:pPr>
+        <w:pStyle w:val="Heading2"/>
+      </w:pPr>
+      <w:r>
         <w:t xml:space="preserve">    // 4. Bind ENC28J60 interface to lwIP</w:t>
       </w:r>
     </w:p>
     <w:p>
       <w:pPr>
         <w:pStyle w:val="Heading2"/>
-        <w:rPr>
-          <w:color w:val="538135" w:themeColor="accent6" w:themeShade="BF"/>
-        </w:rPr>
-      </w:pPr>
-      <w:r>
-        <w:rPr>
-          <w:color w:val="538135" w:themeColor="accent6" w:themeShade="BF"/>
-        </w:rPr>
+      </w:pPr>
+      <w:r>
         <w:t xml:space="preserve">    netif_add(&amp;enc28j60_netif, &amp;ipaddr, &amp;netmask, &amp;gw, NULL, &amp;enc28j60_netif_init, &amp;ethernet_input);</w:t>
       </w:r>
     </w:p>
     <w:p>
       <w:pPr>
         <w:pStyle w:val="Heading2"/>
-        <w:rPr>
-          <w:color w:val="538135" w:themeColor="accent6" w:themeShade="BF"/>
-        </w:rPr>
-      </w:pPr>
-      <w:r>
-        <w:rPr>
-          <w:color w:val="538135" w:themeColor="accent6" w:themeShade="BF"/>
-        </w:rPr>
+      </w:pPr>
+      <w:r>
         <w:t xml:space="preserve">    netif_set_default(&amp;enc28j60_netif);</w:t>
       </w:r>
     </w:p>
     <w:p>
       <w:pPr>
         <w:pStyle w:val="Heading2"/>
-        <w:rPr>
-          <w:color w:val="538135" w:themeColor="accent6" w:themeShade="BF"/>
-        </w:rPr>
-      </w:pPr>
-      <w:r>
-        <w:rPr>
-          <w:color w:val="538135" w:themeColor="accent6" w:themeShade="BF"/>
-        </w:rPr>
+      </w:pPr>
+      <w:r>
+        <w:t xml:space="preserve">    netif_set_up(&amp;enc28j60_netif);</w:t>
+      </w:r>
+    </w:p>
+    <w:p>
+      <w:pPr>
+        <w:pStyle w:val="Heading2"/>
+      </w:pPr>
+    </w:p>
+    <w:p>
+      <w:pPr>
+        <w:pStyle w:val="Heading2"/>
+      </w:pPr>
+      <w:r>
         <w:lastRenderedPageBreak/>
-        <w:t xml:space="preserve">    netif_set_up(&amp;enc28j60_netif);</w:t>
-      </w:r>
-    </w:p>
-    <w:p>
-      <w:pPr>
-        <w:pStyle w:val="Heading2"/>
-        <w:rPr>
-          <w:color w:val="538135" w:themeColor="accent6" w:themeShade="BF"/>
-        </w:rPr>
-      </w:pPr>
-    </w:p>
-    <w:p>
-      <w:pPr>
-        <w:pStyle w:val="Heading2"/>
-        <w:rPr>
-          <w:color w:val="538135" w:themeColor="accent6" w:themeShade="BF"/>
-        </w:rPr>
-      </w:pPr>
-      <w:r>
-        <w:rPr>
-          <w:color w:val="538135" w:themeColor="accent6" w:themeShade="BF"/>
-        </w:rPr>
         <w:t xml:space="preserve">    // 5. Main Runtime Loop</w:t>
       </w:r>
     </w:p>
     <w:p>
       <w:pPr>
         <w:pStyle w:val="Heading2"/>
-        <w:rPr>
-          <w:color w:val="538135" w:themeColor="accent6" w:themeShade="BF"/>
-        </w:rPr>
-      </w:pPr>
-      <w:r>
-        <w:rPr>
-          <w:color w:val="538135" w:themeColor="accent6" w:themeShade="BF"/>
-        </w:rPr>
+      </w:pPr>
+      <w:r>
         <w:t xml:space="preserve">    while (1) {</w:t>
       </w:r>
     </w:p>
     <w:p>
       <w:pPr>
         <w:pStyle w:val="Heading2"/>
-        <w:rPr>
-          <w:color w:val="538135" w:themeColor="accent6" w:themeShade="BF"/>
-        </w:rPr>
-      </w:pPr>
-      <w:r>
-        <w:rPr>
-          <w:color w:val="538135" w:themeColor="accent6" w:themeShade="BF"/>
-        </w:rPr>
+      </w:pPr>
+      <w:r>
         <w:t xml:space="preserve">        // Look for inbound Ethernet data packets</w:t>
       </w:r>
     </w:p>
     <w:p>
       <w:pPr>
         <w:pStyle w:val="Heading2"/>
-        <w:rPr>
-          <w:color w:val="538135" w:themeColor="accent6" w:themeShade="BF"/>
-        </w:rPr>
-      </w:pPr>
-      <w:r>
-        <w:rPr>
-          <w:color w:val="538135" w:themeColor="accent6" w:themeShade="BF"/>
-        </w:rPr>
+      </w:pPr>
+      <w:r>
         <w:t xml:space="preserve">        enc28j60_netif_poll(&amp;enc28j60_netif);</w:t>
       </w:r>
     </w:p>
     <w:p>
       <w:pPr>
         <w:pStyle w:val="Heading2"/>
-        <w:rPr>
-          <w:color w:val="538135" w:themeColor="accent6" w:themeShade="BF"/>
-        </w:rPr>
-      </w:pPr>
-      <w:r>
-        <w:rPr>
-          <w:color w:val="538135" w:themeColor="accent6" w:themeShade="BF"/>
-        </w:rPr>
+      </w:pPr>
+      <w:r>
         <w:t xml:space="preserve">        </w:t>
       </w:r>
     </w:p>
     <w:p>
       <w:pPr>
         <w:pStyle w:val="Heading2"/>
-        <w:rPr>
-          <w:color w:val="538135" w:themeColor="accent6" w:themeShade="BF"/>
-        </w:rPr>
-      </w:pPr>
-      <w:r>
-        <w:rPr>
-          <w:color w:val="538135" w:themeColor="accent6" w:themeShade="BF"/>
-        </w:rPr>
+      </w:pPr>
+      <w:r>
         <w:t xml:space="preserve">        // Handle internal lwIP software timers (ARP, TCP retransmissions, etc.)</w:t>
       </w:r>
     </w:p>
     <w:p>
       <w:pPr>
         <w:pStyle w:val="Heading2"/>
-        <w:rPr>
-          <w:color w:val="538135" w:themeColor="accent6" w:themeShade="BF"/>
-        </w:rPr>
-      </w:pPr>
-      <w:r>
-        <w:rPr>
-          <w:color w:val="538135" w:themeColor="accent6" w:themeShade="BF"/>
-        </w:rPr>
+      </w:pPr>
+      <w:r>
         <w:t xml:space="preserve">        sys_check_timeouts();</w:t>
       </w:r>
     </w:p>
     <w:p>
       <w:pPr>
         <w:pStyle w:val="Heading2"/>
-        <w:rPr>
-          <w:color w:val="538135" w:themeColor="accent6" w:themeShade="BF"/>
-        </w:rPr>
-      </w:pPr>
-      <w:r>
-        <w:rPr>
-          <w:color w:val="538135" w:themeColor="accent6" w:themeShade="BF"/>
-        </w:rPr>
+      </w:pPr>
+      <w:r>
         <w:t xml:space="preserve">    }</w:t>
       </w:r>
     </w:p>
     <w:p>
       <w:pPr>
         <w:pStyle w:val="Heading2"/>
-        <w:rPr>
-          <w:color w:val="538135" w:themeColor="accent6" w:themeShade="BF"/>
-        </w:rPr>
-      </w:pPr>
-      <w:r>
-        <w:rPr>
-          <w:color w:val="538135" w:themeColor="accent6" w:themeShade="BF"/>
-        </w:rPr>
+      </w:pPr>
+      <w:r>
         <w:t>}</w:t>
       </w:r>
     </w:p>
     <w:p>
       <w:pPr>
         <w:pStyle w:val="Heading2"/>
-        <w:rPr>
-          <w:color w:val="538135" w:themeColor="accent6" w:themeShade="BF"/>
-        </w:rPr>
-      </w:pPr>
-      <w:r>
-        <w:rPr>
-          <w:color w:val="538135" w:themeColor="accent6" w:themeShade="BF"/>
-        </w:rPr>
+      </w:pPr>
+      <w:r>
         <w:t>Use code with caution.</w:t>
       </w:r>
     </w:p>
@@ -2555,6 +1832,549 @@
       <w:pPr>
         <w:pStyle w:val="Heading1"/>
       </w:pPr>
+    </w:p>
+    <w:p>
+      <w:pPr>
+        <w:numPr>
+          <w:ilvl w:val="0"/>
+          <w:numId w:val="0"/>
+        </w:numPr>
+        <w:ind w:left="360" w:hanging="360"/>
+      </w:pPr>
+    </w:p>
+    <w:p>
+      <w:pPr>
+        <w:numPr>
+          <w:ilvl w:val="0"/>
+          <w:numId w:val="0"/>
+        </w:numPr>
+        <w:ind w:left="360" w:hanging="360"/>
+      </w:pPr>
+    </w:p>
+    <w:p>
+      <w:pPr>
+        <w:numPr>
+          <w:ilvl w:val="0"/>
+          <w:numId w:val="0"/>
+        </w:numPr>
+        <w:ind w:left="360" w:hanging="360"/>
+      </w:pPr>
+    </w:p>
+    <w:p>
+      <w:pPr>
+        <w:numPr>
+          <w:ilvl w:val="0"/>
+          <w:numId w:val="0"/>
+        </w:numPr>
+        <w:ind w:left="360" w:hanging="360"/>
+      </w:pPr>
+    </w:p>
+    <w:p>
+      <w:pPr>
+        <w:numPr>
+          <w:ilvl w:val="0"/>
+          <w:numId w:val="0"/>
+        </w:numPr>
+        <w:ind w:left="360" w:hanging="360"/>
+      </w:pPr>
+    </w:p>
+    <w:p>
+      <w:pPr>
+        <w:numPr>
+          <w:ilvl w:val="0"/>
+          <w:numId w:val="0"/>
+        </w:numPr>
+        <w:ind w:left="360" w:hanging="360"/>
+      </w:pPr>
+    </w:p>
+    <w:p>
+      <w:pPr>
+        <w:numPr>
+          <w:ilvl w:val="0"/>
+          <w:numId w:val="0"/>
+        </w:numPr>
+        <w:ind w:left="360" w:hanging="360"/>
+      </w:pPr>
+    </w:p>
+    <w:p>
+      <w:pPr>
+        <w:numPr>
+          <w:ilvl w:val="0"/>
+          <w:numId w:val="0"/>
+        </w:numPr>
+        <w:ind w:left="360" w:hanging="360"/>
+      </w:pPr>
+    </w:p>
+    <w:p>
+      <w:pPr>
+        <w:numPr>
+          <w:ilvl w:val="0"/>
+          <w:numId w:val="0"/>
+        </w:numPr>
+        <w:ind w:left="360" w:hanging="360"/>
+      </w:pPr>
+    </w:p>
+    <w:p>
+      <w:pPr>
+        <w:numPr>
+          <w:ilvl w:val="0"/>
+          <w:numId w:val="0"/>
+        </w:numPr>
+        <w:ind w:left="360" w:hanging="360"/>
+      </w:pPr>
+    </w:p>
+    <w:p>
+      <w:pPr>
+        <w:numPr>
+          <w:ilvl w:val="0"/>
+          <w:numId w:val="0"/>
+        </w:numPr>
+        <w:ind w:left="360" w:hanging="360"/>
+      </w:pPr>
+    </w:p>
+    <w:p>
+      <w:pPr>
+        <w:numPr>
+          <w:ilvl w:val="0"/>
+          <w:numId w:val="0"/>
+        </w:numPr>
+        <w:ind w:left="360" w:hanging="360"/>
+      </w:pPr>
+    </w:p>
+    <w:p>
+      <w:pPr>
+        <w:numPr>
+          <w:ilvl w:val="0"/>
+          <w:numId w:val="0"/>
+        </w:numPr>
+        <w:ind w:left="360" w:hanging="360"/>
+      </w:pPr>
+    </w:p>
+    <w:p>
+      <w:pPr>
+        <w:numPr>
+          <w:ilvl w:val="0"/>
+          <w:numId w:val="0"/>
+        </w:numPr>
+        <w:ind w:left="360" w:hanging="360"/>
+      </w:pPr>
+    </w:p>
+    <w:p>
+      <w:pPr>
+        <w:numPr>
+          <w:ilvl w:val="0"/>
+          <w:numId w:val="0"/>
+        </w:numPr>
+        <w:ind w:left="360" w:hanging="360"/>
+      </w:pPr>
+    </w:p>
+    <w:p>
+      <w:pPr>
+        <w:numPr>
+          <w:ilvl w:val="0"/>
+          <w:numId w:val="0"/>
+        </w:numPr>
+        <w:ind w:left="360"/>
+      </w:pPr>
+      <w:r>
+        <w:lastRenderedPageBreak/>
+        <w:t>//------------- Help ----------------//</w:t>
+      </w:r>
+    </w:p>
+    <w:p>
+      <w:pPr>
+        <w:pStyle w:val="Heading1"/>
+      </w:pPr>
+      <w:r>
+        <w:t>ECON1 = 0x1F.</w:t>
+      </w:r>
+    </w:p>
+    <w:p>
+      <w:pPr>
+        <w:pStyle w:val="Heading1"/>
+      </w:pPr>
+      <w:r>
+        <w:t>ECON</w:t>
+      </w:r>
+      <w:r>
+        <w:t>2</w:t>
+      </w:r>
+      <w:r>
+        <w:t xml:space="preserve"> = 0x1</w:t>
+      </w:r>
+      <w:r>
+        <w:t>E</w:t>
+      </w:r>
+      <w:r>
+        <w:t>.</w:t>
+      </w:r>
+    </w:p>
+    <w:p>
+      <w:pPr>
+        <w:pStyle w:val="Heading1"/>
+      </w:pPr>
+    </w:p>
+    <w:p>
+      <w:pPr>
+        <w:pStyle w:val="Heading1"/>
+      </w:pPr>
+      <w:r>
+        <w:t>0x</w:t>
+      </w:r>
+      <w:r>
+        <w:t>1</w:t>
+      </w:r>
+      <w:r>
+        <w:t>F = Read ECON1.</w:t>
+      </w:r>
+    </w:p>
+    <w:p>
+      <w:pPr>
+        <w:pStyle w:val="Heading1"/>
+      </w:pPr>
+      <w:r>
+        <w:t>0x5F = Write ECON1.</w:t>
+      </w:r>
+    </w:p>
+    <w:p>
+      <w:pPr>
+        <w:pStyle w:val="Heading1"/>
+      </w:pPr>
+      <w:r>
+        <w:t>0x</w:t>
+      </w:r>
+      <w:r>
+        <w:t>9</w:t>
+      </w:r>
+      <w:r>
+        <w:t xml:space="preserve">F = </w:t>
+      </w:r>
+      <w:r>
+        <w:t>BFS</w:t>
+      </w:r>
+      <w:r>
+        <w:t xml:space="preserve"> of</w:t>
+      </w:r>
+      <w:r>
+        <w:t xml:space="preserve"> ECON1.</w:t>
+      </w:r>
+    </w:p>
+    <w:p>
+      <w:pPr>
+        <w:pStyle w:val="Heading1"/>
+      </w:pPr>
+      <w:r>
+        <w:t>0xBF = BFC of ECON1</w:t>
+      </w:r>
+    </w:p>
+    <w:p>
+      <w:pPr>
+        <w:pStyle w:val="Heading1"/>
+      </w:pPr>
+    </w:p>
+    <w:p>
+      <w:pPr>
+        <w:pStyle w:val="Heading1"/>
+      </w:pPr>
+      <w:r>
+        <w:t>0x</w:t>
+      </w:r>
+      <w:r>
+        <w:t>1E</w:t>
+      </w:r>
+      <w:r>
+        <w:t xml:space="preserve"> = Read ECON</w:t>
+      </w:r>
+      <w:r>
+        <w:t>2</w:t>
+      </w:r>
+      <w:r>
+        <w:t>.</w:t>
+      </w:r>
+    </w:p>
+    <w:p>
+      <w:pPr>
+        <w:pStyle w:val="Heading1"/>
+      </w:pPr>
+      <w:r>
+        <w:t>0x5</w:t>
+      </w:r>
+      <w:r>
+        <w:t>E</w:t>
+      </w:r>
+      <w:r>
+        <w:t xml:space="preserve"> = Write ECON</w:t>
+      </w:r>
+      <w:r>
+        <w:t>2</w:t>
+      </w:r>
+      <w:r>
+        <w:t>.</w:t>
+      </w:r>
+    </w:p>
+    <w:p>
+      <w:pPr>
+        <w:pStyle w:val="Heading1"/>
+      </w:pPr>
+      <w:r>
+        <w:t>0x9</w:t>
+      </w:r>
+      <w:r>
+        <w:t>E</w:t>
+      </w:r>
+      <w:r>
+        <w:t xml:space="preserve"> = BFS of ECON</w:t>
+      </w:r>
+      <w:r>
+        <w:t>2</w:t>
+      </w:r>
+      <w:r>
+        <w:t>.</w:t>
+      </w:r>
+    </w:p>
+    <w:p>
+      <w:pPr>
+        <w:pStyle w:val="Heading1"/>
+      </w:pPr>
+      <w:r>
+        <w:t>0xB</w:t>
+      </w:r>
+      <w:r>
+        <w:t>E</w:t>
+      </w:r>
+      <w:r>
+        <w:t xml:space="preserve"> = BFC of ECON</w:t>
+      </w:r>
+      <w:r>
+        <w:t>2</w:t>
+      </w:r>
+    </w:p>
+    <w:p>
+      <w:pPr>
+        <w:numPr>
+          <w:ilvl w:val="0"/>
+          <w:numId w:val="0"/>
+        </w:numPr>
+        <w:ind w:left="360"/>
+      </w:pPr>
+    </w:p>
+    <w:p>
+      <w:pPr>
+        <w:numPr>
+          <w:ilvl w:val="0"/>
+          <w:numId w:val="0"/>
+        </w:numPr>
+        <w:ind w:left="360"/>
+      </w:pPr>
+    </w:p>
+    <w:p>
+      <w:pPr>
+        <w:numPr>
+          <w:ilvl w:val="0"/>
+          <w:numId w:val="0"/>
+        </w:numPr>
+        <w:ind w:left="360"/>
+      </w:pPr>
+    </w:p>
+    <w:p>
+      <w:pPr>
+        <w:numPr>
+          <w:ilvl w:val="0"/>
+          <w:numId w:val="0"/>
+        </w:numPr>
+        <w:ind w:left="360"/>
+      </w:pPr>
+    </w:p>
+    <w:p>
+      <w:pPr>
+        <w:numPr>
+          <w:ilvl w:val="0"/>
+          <w:numId w:val="0"/>
+        </w:numPr>
+        <w:ind w:left="360"/>
+      </w:pPr>
+    </w:p>
+    <w:p>
+      <w:pPr>
+        <w:numPr>
+          <w:ilvl w:val="0"/>
+          <w:numId w:val="0"/>
+        </w:numPr>
+        <w:ind w:left="360"/>
+      </w:pPr>
+    </w:p>
+    <w:p>
+      <w:pPr>
+        <w:numPr>
+          <w:ilvl w:val="0"/>
+          <w:numId w:val="0"/>
+        </w:numPr>
+        <w:ind w:left="360" w:hanging="360"/>
+      </w:pPr>
+    </w:p>
+    <w:p>
+      <w:pPr>
+        <w:numPr>
+          <w:ilvl w:val="0"/>
+          <w:numId w:val="0"/>
+        </w:numPr>
+        <w:ind w:left="360" w:hanging="360"/>
+      </w:pPr>
+      <w:r>
+        <w:t>//---------------------- Debugging needed --------------------------</w:t>
+      </w:r>
+    </w:p>
+    <w:p>
+      <w:pPr>
+        <w:pStyle w:val="Heading1"/>
+        <w:numPr>
+          <w:ilvl w:val="0"/>
+          <w:numId w:val="7"/>
+        </w:numPr>
+        <w:rPr>
+          <w:strike/>
+        </w:rPr>
+      </w:pPr>
+      <w:r>
+        <w:rPr>
+          <w:strike/>
+        </w:rPr>
+        <w:t>LED configuration and ensure the data incoming and outgoing status.</w:t>
+      </w:r>
+    </w:p>
+    <w:p>
+      <w:pPr>
+        <w:pStyle w:val="Heading1"/>
+      </w:pPr>
+    </w:p>
+    <w:p>
+      <w:pPr>
+        <w:pStyle w:val="Heading1"/>
+        <w:numPr>
+          <w:ilvl w:val="0"/>
+          <w:numId w:val="7"/>
+        </w:numPr>
+        <w:rPr>
+          <w:strike/>
+        </w:rPr>
+      </w:pPr>
+      <w:r>
+        <w:rPr>
+          <w:strike/>
+        </w:rPr>
+        <w:t>Print the Buffer memory registers while packet arrival to know the buffer points mismatch.</w:t>
+      </w:r>
+    </w:p>
+    <w:p>
+      <w:pPr>
+        <w:pStyle w:val="Heading1"/>
+      </w:pPr>
+    </w:p>
+    <w:p>
+      <w:pPr>
+        <w:pStyle w:val="Heading1"/>
+        <w:numPr>
+          <w:ilvl w:val="0"/>
+          <w:numId w:val="7"/>
+        </w:numPr>
+        <w:rPr>
+          <w:strike/>
+        </w:rPr>
+      </w:pPr>
+      <w:r>
+        <w:rPr>
+          <w:strike/>
+        </w:rPr>
+        <w:t>Give separate power supply to MAC modu</w:t>
+      </w:r>
+      <w:r>
+        <w:rPr>
+          <w:strike/>
+        </w:rPr>
+        <w:t>le.</w:t>
+      </w:r>
+    </w:p>
+    <w:p>
+      <w:pPr>
+        <w:numPr>
+          <w:ilvl w:val="0"/>
+          <w:numId w:val="0"/>
+        </w:numPr>
+        <w:ind w:left="360"/>
+      </w:pPr>
+    </w:p>
+    <w:p>
+      <w:pPr>
+        <w:pStyle w:val="Heading1"/>
+        <w:numPr>
+          <w:ilvl w:val="0"/>
+          <w:numId w:val="7"/>
+        </w:numPr>
+      </w:pPr>
+      <w:r>
+        <w:t>Read and set appropriately (</w:t>
+      </w:r>
+      <w:r>
+        <w:t>EBSTCON</w:t>
+      </w:r>
+      <w:r>
+        <w:t>)</w:t>
+      </w:r>
+      <w:r>
+        <w:t>.</w:t>
+      </w:r>
+    </w:p>
+    <w:p>
+      <w:pPr>
+        <w:pStyle w:val="Heading1"/>
+      </w:pPr>
+    </w:p>
+    <w:p>
+      <w:pPr>
+        <w:pStyle w:val="Heading1"/>
+        <w:numPr>
+          <w:ilvl w:val="0"/>
+          <w:numId w:val="7"/>
+        </w:numPr>
+      </w:pPr>
+      <w:r>
+        <w:t>Confirm (</w:t>
+      </w:r>
+      <w:r>
+        <w:t>After setting RXEN, the Duplex mode and the Receive</w:t>
+      </w:r>
+    </w:p>
+    <w:p>
+      <w:pPr>
+        <w:pStyle w:val="Heading1"/>
+      </w:pPr>
+      <w:r>
+        <w:t>Buffer Start and End Pointers should not be modified.</w:t>
+      </w:r>
+      <w:r>
+        <w:t xml:space="preserve"> </w:t>
+      </w:r>
+      <w:r>
+        <w:t>Additionally, to prevent unexpected packets from arriving, it is recommended that RXEN be cleared before</w:t>
+      </w:r>
+      <w:r>
+        <w:t xml:space="preserve"> </w:t>
+      </w:r>
+      <w:r>
+        <w:t>altering the receive filter configuration (ERXFCON) and</w:t>
+      </w:r>
+      <w:r>
+        <w:t xml:space="preserve"> </w:t>
+      </w:r>
+      <w:r>
+        <w:t xml:space="preserve">MAC address </w:t>
+      </w:r>
+      <w:r>
+        <w:t>)</w:t>
+      </w:r>
+      <w:r>
+        <w:t xml:space="preserve"> </w:t>
+      </w:r>
     </w:p>
     <w:sectPr>
       <w:pgSz w:w="11906" w:h="16838"/>
@@ -2807,6 +2627,118 @@
     </w:lvl>
   </w:abstractNum>
   <w:abstractNum w:abstractNumId="2" w15:restartNumberingAfterBreak="0">
+    <w:nsid w:val="1D921AFF"/>
+    <w:multiLevelType w:val="hybridMultilevel"/>
+    <w:tmpl w:val="F7C86BD0"/>
+    <w:lvl w:ilvl="0" w:tplc="53624936">
+      <w:numFmt w:val="bullet"/>
+      <w:lvlText w:val="-"/>
+      <w:lvlJc w:val="left"/>
+      <w:pPr>
+        <w:ind w:left="720" w:hanging="360"/>
+      </w:pPr>
+      <w:rPr>
+        <w:rFonts w:ascii="Calibri" w:eastAsiaTheme="minorHAnsi" w:hAnsi="Calibri" w:cs="Calibri" w:hint="default"/>
+      </w:rPr>
+    </w:lvl>
+    <w:lvl w:ilvl="1" w:tplc="40090003" w:tentative="1">
+      <w:start w:val="1"/>
+      <w:numFmt w:val="bullet"/>
+      <w:lvlText w:val="o"/>
+      <w:lvlJc w:val="left"/>
+      <w:pPr>
+        <w:ind w:left="1440" w:hanging="360"/>
+      </w:pPr>
+      <w:rPr>
+        <w:rFonts w:ascii="Courier New" w:hAnsi="Courier New" w:cs="Courier New" w:hint="default"/>
+      </w:rPr>
+    </w:lvl>
+    <w:lvl w:ilvl="2" w:tplc="40090005" w:tentative="1">
+      <w:start w:val="1"/>
+      <w:numFmt w:val="bullet"/>
+      <w:lvlText w:val=""/>
+      <w:lvlJc w:val="left"/>
+      <w:pPr>
+        <w:ind w:left="2160" w:hanging="360"/>
+      </w:pPr>
+      <w:rPr>
+        <w:rFonts w:ascii="Wingdings" w:hAnsi="Wingdings" w:hint="default"/>
+      </w:rPr>
+    </w:lvl>
+    <w:lvl w:ilvl="3" w:tplc="40090001" w:tentative="1">
+      <w:start w:val="1"/>
+      <w:numFmt w:val="bullet"/>
+      <w:lvlText w:val=""/>
+      <w:lvlJc w:val="left"/>
+      <w:pPr>
+        <w:ind w:left="2880" w:hanging="360"/>
+      </w:pPr>
+      <w:rPr>
+        <w:rFonts w:ascii="Symbol" w:hAnsi="Symbol" w:hint="default"/>
+      </w:rPr>
+    </w:lvl>
+    <w:lvl w:ilvl="4" w:tplc="40090003" w:tentative="1">
+      <w:start w:val="1"/>
+      <w:numFmt w:val="bullet"/>
+      <w:lvlText w:val="o"/>
+      <w:lvlJc w:val="left"/>
+      <w:pPr>
+        <w:ind w:left="3600" w:hanging="360"/>
+      </w:pPr>
+      <w:rPr>
+        <w:rFonts w:ascii="Courier New" w:hAnsi="Courier New" w:cs="Courier New" w:hint="default"/>
+      </w:rPr>
+    </w:lvl>
+    <w:lvl w:ilvl="5" w:tplc="40090005" w:tentative="1">
+      <w:start w:val="1"/>
+      <w:numFmt w:val="bullet"/>
+      <w:lvlText w:val=""/>
+      <w:lvlJc w:val="left"/>
+      <w:pPr>
+        <w:ind w:left="4320" w:hanging="360"/>
+      </w:pPr>
+      <w:rPr>
+        <w:rFonts w:ascii="Wingdings" w:hAnsi="Wingdings" w:hint="default"/>
+      </w:rPr>
+    </w:lvl>
+    <w:lvl w:ilvl="6" w:tplc="40090001" w:tentative="1">
+      <w:start w:val="1"/>
+      <w:numFmt w:val="bullet"/>
+      <w:lvlText w:val=""/>
+      <w:lvlJc w:val="left"/>
+      <w:pPr>
+        <w:ind w:left="5040" w:hanging="360"/>
+      </w:pPr>
+      <w:rPr>
+        <w:rFonts w:ascii="Symbol" w:hAnsi="Symbol" w:hint="default"/>
+      </w:rPr>
+    </w:lvl>
+    <w:lvl w:ilvl="7" w:tplc="40090003" w:tentative="1">
+      <w:start w:val="1"/>
+      <w:numFmt w:val="bullet"/>
+      <w:lvlText w:val="o"/>
+      <w:lvlJc w:val="left"/>
+      <w:pPr>
+        <w:ind w:left="5760" w:hanging="360"/>
+      </w:pPr>
+      <w:rPr>
+        <w:rFonts w:ascii="Courier New" w:hAnsi="Courier New" w:cs="Courier New" w:hint="default"/>
+      </w:rPr>
+    </w:lvl>
+    <w:lvl w:ilvl="8" w:tplc="40090005" w:tentative="1">
+      <w:start w:val="1"/>
+      <w:numFmt w:val="bullet"/>
+      <w:lvlText w:val=""/>
+      <w:lvlJc w:val="left"/>
+      <w:pPr>
+        <w:ind w:left="6480" w:hanging="360"/>
+      </w:pPr>
+      <w:rPr>
+        <w:rFonts w:ascii="Wingdings" w:hAnsi="Wingdings" w:hint="default"/>
+      </w:rPr>
+    </w:lvl>
+  </w:abstractNum>
+  <w:abstractNum w:abstractNumId="3" w15:restartNumberingAfterBreak="0">
     <w:nsid w:val="4E071653"/>
     <w:multiLevelType w:val="hybridMultilevel"/>
     <w:tmpl w:val="A3A43FE2"/>
@@ -2897,7 +2829,7 @@
       </w:pPr>
     </w:lvl>
   </w:abstractNum>
-  <w:abstractNum w:abstractNumId="3" w15:restartNumberingAfterBreak="0">
+  <w:abstractNum w:abstractNumId="4" w15:restartNumberingAfterBreak="0">
     <w:nsid w:val="623013B6"/>
     <w:multiLevelType w:val="hybridMultilevel"/>
     <w:tmpl w:val="CEE4757E"/>
@@ -2986,7 +2918,119 @@
       </w:pPr>
     </w:lvl>
   </w:abstractNum>
-  <w:abstractNum w:abstractNumId="4" w15:restartNumberingAfterBreak="0">
+  <w:abstractNum w:abstractNumId="5" w15:restartNumberingAfterBreak="0">
+    <w:nsid w:val="76043FC9"/>
+    <w:multiLevelType w:val="hybridMultilevel"/>
+    <w:tmpl w:val="47C84FD6"/>
+    <w:lvl w:ilvl="0" w:tplc="FF54E72C">
+      <w:numFmt w:val="bullet"/>
+      <w:lvlText w:val="-"/>
+      <w:lvlJc w:val="left"/>
+      <w:pPr>
+        <w:ind w:left="720" w:hanging="360"/>
+      </w:pPr>
+      <w:rPr>
+        <w:rFonts w:ascii="Calibri" w:eastAsiaTheme="minorHAnsi" w:hAnsi="Calibri" w:cs="Calibri" w:hint="default"/>
+      </w:rPr>
+    </w:lvl>
+    <w:lvl w:ilvl="1" w:tplc="40090003" w:tentative="1">
+      <w:start w:val="1"/>
+      <w:numFmt w:val="bullet"/>
+      <w:lvlText w:val="o"/>
+      <w:lvlJc w:val="left"/>
+      <w:pPr>
+        <w:ind w:left="1440" w:hanging="360"/>
+      </w:pPr>
+      <w:rPr>
+        <w:rFonts w:ascii="Courier New" w:hAnsi="Courier New" w:cs="Courier New" w:hint="default"/>
+      </w:rPr>
+    </w:lvl>
+    <w:lvl w:ilvl="2" w:tplc="40090005" w:tentative="1">
+      <w:start w:val="1"/>
+      <w:numFmt w:val="bullet"/>
+      <w:lvlText w:val=""/>
+      <w:lvlJc w:val="left"/>
+      <w:pPr>
+        <w:ind w:left="2160" w:hanging="360"/>
+      </w:pPr>
+      <w:rPr>
+        <w:rFonts w:ascii="Wingdings" w:hAnsi="Wingdings" w:hint="default"/>
+      </w:rPr>
+    </w:lvl>
+    <w:lvl w:ilvl="3" w:tplc="40090001" w:tentative="1">
+      <w:start w:val="1"/>
+      <w:numFmt w:val="bullet"/>
+      <w:lvlText w:val=""/>
+      <w:lvlJc w:val="left"/>
+      <w:pPr>
+        <w:ind w:left="2880" w:hanging="360"/>
+      </w:pPr>
+      <w:rPr>
+        <w:rFonts w:ascii="Symbol" w:hAnsi="Symbol" w:hint="default"/>
+      </w:rPr>
+    </w:lvl>
+    <w:lvl w:ilvl="4" w:tplc="40090003" w:tentative="1">
+      <w:start w:val="1"/>
+      <w:numFmt w:val="bullet"/>
+      <w:lvlText w:val="o"/>
+      <w:lvlJc w:val="left"/>
+      <w:pPr>
+        <w:ind w:left="3600" w:hanging="360"/>
+      </w:pPr>
+      <w:rPr>
+        <w:rFonts w:ascii="Courier New" w:hAnsi="Courier New" w:cs="Courier New" w:hint="default"/>
+      </w:rPr>
+    </w:lvl>
+    <w:lvl w:ilvl="5" w:tplc="40090005" w:tentative="1">
+      <w:start w:val="1"/>
+      <w:numFmt w:val="bullet"/>
+      <w:lvlText w:val=""/>
+      <w:lvlJc w:val="left"/>
+      <w:pPr>
+        <w:ind w:left="4320" w:hanging="360"/>
+      </w:pPr>
+      <w:rPr>
+        <w:rFonts w:ascii="Wingdings" w:hAnsi="Wingdings" w:hint="default"/>
+      </w:rPr>
+    </w:lvl>
+    <w:lvl w:ilvl="6" w:tplc="40090001" w:tentative="1">
+      <w:start w:val="1"/>
+      <w:numFmt w:val="bullet"/>
+      <w:lvlText w:val=""/>
+      <w:lvlJc w:val="left"/>
+      <w:pPr>
+        <w:ind w:left="5040" w:hanging="360"/>
+      </w:pPr>
+      <w:rPr>
+        <w:rFonts w:ascii="Symbol" w:hAnsi="Symbol" w:hint="default"/>
+      </w:rPr>
+    </w:lvl>
+    <w:lvl w:ilvl="7" w:tplc="40090003" w:tentative="1">
+      <w:start w:val="1"/>
+      <w:numFmt w:val="bullet"/>
+      <w:lvlText w:val="o"/>
+      <w:lvlJc w:val="left"/>
+      <w:pPr>
+        <w:ind w:left="5760" w:hanging="360"/>
+      </w:pPr>
+      <w:rPr>
+        <w:rFonts w:ascii="Courier New" w:hAnsi="Courier New" w:cs="Courier New" w:hint="default"/>
+      </w:rPr>
+    </w:lvl>
+    <w:lvl w:ilvl="8" w:tplc="40090005" w:tentative="1">
+      <w:start w:val="1"/>
+      <w:numFmt w:val="bullet"/>
+      <w:lvlText w:val=""/>
+      <w:lvlJc w:val="left"/>
+      <w:pPr>
+        <w:ind w:left="6480" w:hanging="360"/>
+      </w:pPr>
+      <w:rPr>
+        <w:rFonts w:ascii="Wingdings" w:hAnsi="Wingdings" w:hint="default"/>
+      </w:rPr>
+    </w:lvl>
+  </w:abstractNum>
+  <w:abstractNum w:abstractNumId="6" w15:restartNumberingAfterBreak="0">
     <w:nsid w:val="7EA00F3E"/>
     <w:multiLevelType w:val="multilevel"/>
     <w:tmpl w:val="C39233BA"/>
@@ -3139,16 +3183,22 @@
     <w:abstractNumId w:val="0"/>
   </w:num>
   <w:num w:numId="2" w16cid:durableId="728070831">
-    <w:abstractNumId w:val="3"/>
+    <w:abstractNumId w:val="4"/>
   </w:num>
   <w:num w:numId="3" w16cid:durableId="1802963803">
-    <w:abstractNumId w:val="2"/>
+    <w:abstractNumId w:val="3"/>
   </w:num>
   <w:num w:numId="4" w16cid:durableId="606695220">
     <w:abstractNumId w:val="1"/>
   </w:num>
   <w:num w:numId="5" w16cid:durableId="2054578542">
-    <w:abstractNumId w:val="4"/>
+    <w:abstractNumId w:val="6"/>
+  </w:num>
+  <w:num w:numId="6" w16cid:durableId="2143764000">
+    <w:abstractNumId w:val="5"/>
+  </w:num>
+  <w:num w:numId="7" w16cid:durableId="710812087">
+    <w:abstractNumId w:val="2"/>
   </w:num>
 </w:numbering>
 </file>
@@ -3575,7 +3625,7 @@
     <w:link w:val="Heading1Char"/>
     <w:uiPriority w:val="9"/>
     <w:qFormat/>
-    <w:rsid w:val="002A281C"/>
+    <w:rsid w:val="00624447"/>
     <w:pPr>
       <w:numPr>
         <w:numId w:val="0"/>
@@ -3587,8 +3637,8 @@
       <w:b w:val="0"/>
       <w:bCs w:val="0"/>
       <w:color w:val="auto"/>
-      <w:sz w:val="28"/>
-      <w:szCs w:val="28"/>
+      <w:sz w:val="24"/>
+      <w:szCs w:val="24"/>
     </w:rPr>
   </w:style>
   <w:style w:type="paragraph" w:styleId="Heading2">
@@ -3694,10 +3744,10 @@
     <w:basedOn w:val="DefaultParagraphFont"/>
     <w:link w:val="Heading1"/>
     <w:uiPriority w:val="9"/>
-    <w:rsid w:val="002A281C"/>
+    <w:rsid w:val="00624447"/>
     <w:rPr>
-      <w:sz w:val="28"/>
-      <w:szCs w:val="28"/>
+      <w:sz w:val="24"/>
+      <w:szCs w:val="24"/>
     </w:rPr>
   </w:style>
   <w:style w:type="character" w:styleId="Hyperlink">

</xml_diff>